<commit_message>
On branch main Changes to be committed: 	modified:   README.md 	modified:   docs/Journal.md 	modified:   "docs/Sch\303\251ma SQL.docx" 	new file:   "docs/~$h\303\251ma SQL.docx" 	new file:   sql/schema.sql
</commit_message>
<xml_diff>
--- a/docs/Schéma SQL.docx
+++ b/docs/Schéma SQL.docx
@@ -76,7 +76,6 @@
         </w:rPr>
         <w:t xml:space="preserve">Une entreprise dans le secteur du tourisme souhaite automatiser la collecte de données météo pour ses différentes destinations. Ces données sont collectées via l'API publique </w:t>
       </w:r>
-      <w:proofErr w:type="spellStart"/>
       <w:r>
         <w:rPr>
           <w:b/>
@@ -87,7 +86,6 @@
         </w:rPr>
         <w:t>OpenWeather</w:t>
       </w:r>
-      <w:proofErr w:type="spellEnd"/>
       <w:r>
         <w:rPr>
           <w:lang w:val="fr-FR"/>
@@ -172,58 +170,8 @@
           <w:lang w:eastAsia="fr-GA"/>
           <w14:ligatures w14:val="none"/>
         </w:rPr>
-        <w:t>"</w:t>
-      </w:r>
-      <w:proofErr w:type="spellStart"/>
-      <w:r>
-        <w:rPr>
-          <w:rFonts w:ascii="Segoe UI" w:eastAsia="Times New Roman" w:hAnsi="Segoe UI" w:cs="Segoe UI"/>
-          <w:kern w:val="0"/>
-          <w:sz w:val="21"/>
-          <w:szCs w:val="21"/>
-          <w:lang w:eastAsia="fr-GA"/>
-          <w14:ligatures w14:val="none"/>
-        </w:rPr>
-        <w:t>weather</w:t>
-      </w:r>
-      <w:proofErr w:type="spellEnd"/>
-      <w:r>
-        <w:rPr>
-          <w:rFonts w:ascii="Segoe UI" w:eastAsia="Times New Roman" w:hAnsi="Segoe UI" w:cs="Segoe UI"/>
-          <w:kern w:val="0"/>
-          <w:sz w:val="21"/>
-          <w:szCs w:val="21"/>
-          <w:lang w:eastAsia="fr-GA"/>
-          <w14:ligatures w14:val="none"/>
-        </w:rPr>
-        <w:t xml:space="preserve">" contient une liste de clé-valeur dont les clés sont id, main, description, et </w:t>
-      </w:r>
-      <w:proofErr w:type="spellStart"/>
-      <w:proofErr w:type="gramStart"/>
-      <w:r>
-        <w:rPr>
-          <w:rFonts w:ascii="Segoe UI" w:eastAsia="Times New Roman" w:hAnsi="Segoe UI" w:cs="Segoe UI"/>
-          <w:kern w:val="0"/>
-          <w:sz w:val="21"/>
-          <w:szCs w:val="21"/>
-          <w:lang w:eastAsia="fr-GA"/>
-          <w14:ligatures w14:val="none"/>
-        </w:rPr>
-        <w:t>icon</w:t>
-      </w:r>
-      <w:proofErr w:type="spellEnd"/>
-      <w:r>
-        <w:rPr>
-          <w:rFonts w:ascii="Segoe UI" w:eastAsia="Times New Roman" w:hAnsi="Segoe UI" w:cs="Segoe UI"/>
-          <w:kern w:val="0"/>
-          <w:sz w:val="21"/>
-          <w:szCs w:val="21"/>
-          <w:lang w:eastAsia="fr-GA"/>
-          <w14:ligatures w14:val="none"/>
-        </w:rPr>
-        <w:t>;</w:t>
-      </w:r>
-      <w:proofErr w:type="gramEnd"/>
+        <w:t>"weather" contient une liste de clé-valeur dont les clés sont id, main, description, et icon;</w:t>
+      </w:r>
     </w:p>
     <w:p>
       <w:pPr>
@@ -250,165 +198,8 @@
           <w:lang w:eastAsia="fr-GA"/>
           <w14:ligatures w14:val="none"/>
         </w:rPr>
-        <w:t xml:space="preserve">"main" contient un dictionnaire avec les clés étant temp, </w:t>
-      </w:r>
-      <w:proofErr w:type="spellStart"/>
-      <w:r>
-        <w:rPr>
-          <w:rFonts w:ascii="Segoe UI" w:eastAsia="Times New Roman" w:hAnsi="Segoe UI" w:cs="Segoe UI"/>
-          <w:kern w:val="0"/>
-          <w:sz w:val="21"/>
-          <w:szCs w:val="21"/>
-          <w:lang w:eastAsia="fr-GA"/>
-          <w14:ligatures w14:val="none"/>
-        </w:rPr>
-        <w:t>feels_like</w:t>
-      </w:r>
-      <w:proofErr w:type="spellEnd"/>
-      <w:r>
-        <w:rPr>
-          <w:rFonts w:ascii="Segoe UI" w:eastAsia="Times New Roman" w:hAnsi="Segoe UI" w:cs="Segoe UI"/>
-          <w:kern w:val="0"/>
-          <w:sz w:val="21"/>
-          <w:szCs w:val="21"/>
-          <w:lang w:eastAsia="fr-GA"/>
-          <w14:ligatures w14:val="none"/>
-        </w:rPr>
-        <w:t xml:space="preserve">, </w:t>
-      </w:r>
-      <w:proofErr w:type="spellStart"/>
-      <w:r>
-        <w:rPr>
-          <w:rFonts w:ascii="Segoe UI" w:eastAsia="Times New Roman" w:hAnsi="Segoe UI" w:cs="Segoe UI"/>
-          <w:kern w:val="0"/>
-          <w:sz w:val="21"/>
-          <w:szCs w:val="21"/>
-          <w:lang w:eastAsia="fr-GA"/>
-          <w14:ligatures w14:val="none"/>
-        </w:rPr>
-        <w:t>temp_min</w:t>
-      </w:r>
-      <w:proofErr w:type="spellEnd"/>
-      <w:r>
-        <w:rPr>
-          <w:rFonts w:ascii="Segoe UI" w:eastAsia="Times New Roman" w:hAnsi="Segoe UI" w:cs="Segoe UI"/>
-          <w:kern w:val="0"/>
-          <w:sz w:val="21"/>
-          <w:szCs w:val="21"/>
-          <w:lang w:eastAsia="fr-GA"/>
-          <w14:ligatures w14:val="none"/>
-        </w:rPr>
-        <w:t xml:space="preserve">, </w:t>
-      </w:r>
-      <w:proofErr w:type="spellStart"/>
-      <w:r>
-        <w:rPr>
-          <w:rFonts w:ascii="Segoe UI" w:eastAsia="Times New Roman" w:hAnsi="Segoe UI" w:cs="Segoe UI"/>
-          <w:kern w:val="0"/>
-          <w:sz w:val="21"/>
-          <w:szCs w:val="21"/>
-          <w:lang w:eastAsia="fr-GA"/>
-          <w14:ligatures w14:val="none"/>
-        </w:rPr>
-        <w:t>temp_max</w:t>
-      </w:r>
-      <w:proofErr w:type="spellEnd"/>
-      <w:r>
-        <w:rPr>
-          <w:rFonts w:ascii="Segoe UI" w:eastAsia="Times New Roman" w:hAnsi="Segoe UI" w:cs="Segoe UI"/>
-          <w:kern w:val="0"/>
-          <w:sz w:val="21"/>
-          <w:szCs w:val="21"/>
-          <w:lang w:eastAsia="fr-GA"/>
-          <w14:ligatures w14:val="none"/>
-        </w:rPr>
-        <w:t xml:space="preserve">, pressure, </w:t>
-      </w:r>
-      <w:proofErr w:type="spellStart"/>
-      <w:r>
-        <w:rPr>
-          <w:rFonts w:ascii="Segoe UI" w:eastAsia="Times New Roman" w:hAnsi="Segoe UI" w:cs="Segoe UI"/>
-          <w:kern w:val="0"/>
-          <w:sz w:val="21"/>
-          <w:szCs w:val="21"/>
-          <w:lang w:eastAsia="fr-GA"/>
-          <w14:ligatures w14:val="none"/>
-        </w:rPr>
-        <w:t>humidity</w:t>
-      </w:r>
-      <w:proofErr w:type="spellEnd"/>
-      <w:r>
-        <w:rPr>
-          <w:rFonts w:ascii="Segoe UI" w:eastAsia="Times New Roman" w:hAnsi="Segoe UI" w:cs="Segoe UI"/>
-          <w:kern w:val="0"/>
-          <w:sz w:val="21"/>
-          <w:szCs w:val="21"/>
-          <w:lang w:eastAsia="fr-GA"/>
-          <w14:ligatures w14:val="none"/>
-        </w:rPr>
-        <w:t xml:space="preserve">, </w:t>
-      </w:r>
-      <w:proofErr w:type="spellStart"/>
-      <w:r>
-        <w:rPr>
-          <w:rFonts w:ascii="Segoe UI" w:eastAsia="Times New Roman" w:hAnsi="Segoe UI" w:cs="Segoe UI"/>
-          <w:kern w:val="0"/>
-          <w:sz w:val="21"/>
-          <w:szCs w:val="21"/>
-          <w:lang w:eastAsia="fr-GA"/>
-          <w14:ligatures w14:val="none"/>
-        </w:rPr>
-        <w:t>sea_level</w:t>
-      </w:r>
-      <w:proofErr w:type="spellEnd"/>
-      <w:r>
-        <w:rPr>
-          <w:rFonts w:ascii="Segoe UI" w:eastAsia="Times New Roman" w:hAnsi="Segoe UI" w:cs="Segoe UI"/>
-          <w:kern w:val="0"/>
-          <w:sz w:val="21"/>
-          <w:szCs w:val="21"/>
-          <w:lang w:eastAsia="fr-GA"/>
-          <w14:ligatures w14:val="none"/>
-        </w:rPr>
-        <w:t xml:space="preserve"> et </w:t>
-      </w:r>
-      <w:proofErr w:type="spellStart"/>
-      <w:r>
-        <w:rPr>
-          <w:rFonts w:ascii="Segoe UI" w:eastAsia="Times New Roman" w:hAnsi="Segoe UI" w:cs="Segoe UI"/>
-          <w:kern w:val="0"/>
-          <w:sz w:val="21"/>
-          <w:szCs w:val="21"/>
-          <w:lang w:eastAsia="fr-GA"/>
-          <w14:ligatures w14:val="none"/>
-        </w:rPr>
-        <w:t>grnd_</w:t>
-      </w:r>
-      <w:proofErr w:type="gramStart"/>
-      <w:r>
-        <w:rPr>
-          <w:rFonts w:ascii="Segoe UI" w:eastAsia="Times New Roman" w:hAnsi="Segoe UI" w:cs="Segoe UI"/>
-          <w:kern w:val="0"/>
-          <w:sz w:val="21"/>
-          <w:szCs w:val="21"/>
-          <w:lang w:eastAsia="fr-GA"/>
-          <w14:ligatures w14:val="none"/>
-        </w:rPr>
-        <w:t>level</w:t>
-      </w:r>
-      <w:proofErr w:type="spellEnd"/>
-      <w:r>
-        <w:rPr>
-          <w:rFonts w:ascii="Segoe UI" w:eastAsia="Times New Roman" w:hAnsi="Segoe UI" w:cs="Segoe UI"/>
-          <w:kern w:val="0"/>
-          <w:sz w:val="21"/>
-          <w:szCs w:val="21"/>
-          <w:lang w:eastAsia="fr-GA"/>
-          <w14:ligatures w14:val="none"/>
-        </w:rPr>
-        <w:t>;</w:t>
-      </w:r>
-      <w:proofErr w:type="gramEnd"/>
+        <w:t>"main" contient un dictionnaire avec les clés étant temp, feels_like, temp_min, temp_max, pressure, humidity, sea_level et grnd_level;</w:t>
+      </w:r>
     </w:p>
     <w:p>
       <w:pPr>
@@ -435,69 +226,8 @@
           <w:lang w:eastAsia="fr-GA"/>
           <w14:ligatures w14:val="none"/>
         </w:rPr>
-        <w:t>"</w:t>
-      </w:r>
-      <w:proofErr w:type="spellStart"/>
-      <w:r>
-        <w:rPr>
-          <w:rFonts w:ascii="Segoe UI" w:eastAsia="Times New Roman" w:hAnsi="Segoe UI" w:cs="Segoe UI"/>
-          <w:kern w:val="0"/>
-          <w:sz w:val="21"/>
-          <w:szCs w:val="21"/>
-          <w:lang w:eastAsia="fr-GA"/>
-          <w14:ligatures w14:val="none"/>
-        </w:rPr>
-        <w:t>wind</w:t>
-      </w:r>
-      <w:proofErr w:type="spellEnd"/>
-      <w:r>
-        <w:rPr>
-          <w:rFonts w:ascii="Segoe UI" w:eastAsia="Times New Roman" w:hAnsi="Segoe UI" w:cs="Segoe UI"/>
-          <w:kern w:val="0"/>
-          <w:sz w:val="21"/>
-          <w:szCs w:val="21"/>
-          <w:lang w:eastAsia="fr-GA"/>
-          <w14:ligatures w14:val="none"/>
-        </w:rPr>
-        <w:t xml:space="preserve">" a pour valeur un dictionnaire avec speed et </w:t>
-      </w:r>
-      <w:proofErr w:type="spellStart"/>
-      <w:r>
-        <w:rPr>
-          <w:rFonts w:ascii="Segoe UI" w:eastAsia="Times New Roman" w:hAnsi="Segoe UI" w:cs="Segoe UI"/>
-          <w:kern w:val="0"/>
-          <w:sz w:val="21"/>
-          <w:szCs w:val="21"/>
-          <w:lang w:eastAsia="fr-GA"/>
-          <w14:ligatures w14:val="none"/>
-        </w:rPr>
-        <w:t>deg</w:t>
-      </w:r>
-      <w:proofErr w:type="spellEnd"/>
-      <w:r>
-        <w:rPr>
-          <w:rFonts w:ascii="Segoe UI" w:eastAsia="Times New Roman" w:hAnsi="Segoe UI" w:cs="Segoe UI"/>
-          <w:kern w:val="0"/>
-          <w:sz w:val="21"/>
-          <w:szCs w:val="21"/>
-          <w:lang w:eastAsia="fr-GA"/>
-          <w14:ligatures w14:val="none"/>
-        </w:rPr>
-        <w:t xml:space="preserve"> comme </w:t>
-      </w:r>
-      <w:proofErr w:type="gramStart"/>
-      <w:r>
-        <w:rPr>
-          <w:rFonts w:ascii="Segoe UI" w:eastAsia="Times New Roman" w:hAnsi="Segoe UI" w:cs="Segoe UI"/>
-          <w:kern w:val="0"/>
-          <w:sz w:val="21"/>
-          <w:szCs w:val="21"/>
-          <w:lang w:eastAsia="fr-GA"/>
-          <w14:ligatures w14:val="none"/>
-        </w:rPr>
-        <w:t>clés;</w:t>
-      </w:r>
-      <w:proofErr w:type="gramEnd"/>
+        <w:t>"wind" a pour valeur un dictionnaire avec speed et deg comme clés;</w:t>
+      </w:r>
     </w:p>
     <w:p>
       <w:pPr>
@@ -524,45 +254,8 @@
           <w:lang w:eastAsia="fr-GA"/>
           <w14:ligatures w14:val="none"/>
         </w:rPr>
-        <w:t>"</w:t>
-      </w:r>
-      <w:proofErr w:type="spellStart"/>
-      <w:r>
-        <w:rPr>
-          <w:rFonts w:ascii="Segoe UI" w:eastAsia="Times New Roman" w:hAnsi="Segoe UI" w:cs="Segoe UI"/>
-          <w:kern w:val="0"/>
-          <w:sz w:val="21"/>
-          <w:szCs w:val="21"/>
-          <w:lang w:eastAsia="fr-GA"/>
-          <w14:ligatures w14:val="none"/>
-        </w:rPr>
-        <w:t>clouds</w:t>
-      </w:r>
-      <w:proofErr w:type="spellEnd"/>
-      <w:r>
-        <w:rPr>
-          <w:rFonts w:ascii="Segoe UI" w:eastAsia="Times New Roman" w:hAnsi="Segoe UI" w:cs="Segoe UI"/>
-          <w:kern w:val="0"/>
-          <w:sz w:val="21"/>
-          <w:szCs w:val="21"/>
-          <w:lang w:eastAsia="fr-GA"/>
-          <w14:ligatures w14:val="none"/>
-        </w:rPr>
-        <w:t xml:space="preserve">", sa valeur est aussi un dictionnaire, mais ici, elle a seulement la clé </w:t>
-      </w:r>
-      <w:proofErr w:type="gramStart"/>
-      <w:r>
-        <w:rPr>
-          <w:rFonts w:ascii="Segoe UI" w:eastAsia="Times New Roman" w:hAnsi="Segoe UI" w:cs="Segoe UI"/>
-          <w:kern w:val="0"/>
-          <w:sz w:val="21"/>
-          <w:szCs w:val="21"/>
-          <w:lang w:eastAsia="fr-GA"/>
-          <w14:ligatures w14:val="none"/>
-        </w:rPr>
-        <w:t>all;</w:t>
-      </w:r>
-      <w:proofErr w:type="gramEnd"/>
+        <w:t>"clouds", sa valeur est aussi un dictionnaire, mais ici, elle a seulement la clé all;</w:t>
+      </w:r>
     </w:p>
     <w:p>
       <w:pPr>
@@ -589,79 +282,7 @@
           <w:lang w:eastAsia="fr-GA"/>
           <w14:ligatures w14:val="none"/>
         </w:rPr>
-        <w:t>"</w:t>
-      </w:r>
-      <w:proofErr w:type="spellStart"/>
-      <w:r>
-        <w:rPr>
-          <w:rFonts w:ascii="Segoe UI" w:eastAsia="Times New Roman" w:hAnsi="Segoe UI" w:cs="Segoe UI"/>
-          <w:kern w:val="0"/>
-          <w:sz w:val="21"/>
-          <w:szCs w:val="21"/>
-          <w:lang w:eastAsia="fr-GA"/>
-          <w14:ligatures w14:val="none"/>
-        </w:rPr>
-        <w:t>sys</w:t>
-      </w:r>
-      <w:proofErr w:type="spellEnd"/>
-      <w:r>
-        <w:rPr>
-          <w:rFonts w:ascii="Segoe UI" w:eastAsia="Times New Roman" w:hAnsi="Segoe UI" w:cs="Segoe UI"/>
-          <w:kern w:val="0"/>
-          <w:sz w:val="21"/>
-          <w:szCs w:val="21"/>
-          <w:lang w:eastAsia="fr-GA"/>
-          <w14:ligatures w14:val="none"/>
-        </w:rPr>
-        <w:t xml:space="preserve">" contient un dictionnaire avec les clés type, id, country, </w:t>
-      </w:r>
-      <w:proofErr w:type="spellStart"/>
-      <w:r>
-        <w:rPr>
-          <w:rFonts w:ascii="Segoe UI" w:eastAsia="Times New Roman" w:hAnsi="Segoe UI" w:cs="Segoe UI"/>
-          <w:kern w:val="0"/>
-          <w:sz w:val="21"/>
-          <w:szCs w:val="21"/>
-          <w:lang w:eastAsia="fr-GA"/>
-          <w14:ligatures w14:val="none"/>
-        </w:rPr>
-        <w:t>sunrise</w:t>
-      </w:r>
-      <w:proofErr w:type="spellEnd"/>
-      <w:r>
-        <w:rPr>
-          <w:rFonts w:ascii="Segoe UI" w:eastAsia="Times New Roman" w:hAnsi="Segoe UI" w:cs="Segoe UI"/>
-          <w:kern w:val="0"/>
-          <w:sz w:val="21"/>
-          <w:szCs w:val="21"/>
-          <w:lang w:eastAsia="fr-GA"/>
-          <w14:ligatures w14:val="none"/>
-        </w:rPr>
-        <w:t xml:space="preserve">, et </w:t>
-      </w:r>
-      <w:proofErr w:type="spellStart"/>
-      <w:r>
-        <w:rPr>
-          <w:rFonts w:ascii="Segoe UI" w:eastAsia="Times New Roman" w:hAnsi="Segoe UI" w:cs="Segoe UI"/>
-          <w:kern w:val="0"/>
-          <w:sz w:val="21"/>
-          <w:szCs w:val="21"/>
-          <w:lang w:eastAsia="fr-GA"/>
-          <w14:ligatures w14:val="none"/>
-        </w:rPr>
-        <w:t>sunset</w:t>
-      </w:r>
-      <w:proofErr w:type="spellEnd"/>
-      <w:r>
-        <w:rPr>
-          <w:rFonts w:ascii="Segoe UI" w:eastAsia="Times New Roman" w:hAnsi="Segoe UI" w:cs="Segoe UI"/>
-          <w:kern w:val="0"/>
-          <w:sz w:val="21"/>
-          <w:szCs w:val="21"/>
-          <w:lang w:eastAsia="fr-GA"/>
-          <w14:ligatures w14:val="none"/>
-        </w:rPr>
-        <w:t>.</w:t>
+        <w:t>"sys" contient un dictionnaire avec les clés type, id, country, sunrise, et sunset.</w:t>
       </w:r>
     </w:p>
     <w:p>
@@ -707,535 +328,7 @@
           <w:lang w:eastAsia="fr-GA"/>
           <w14:ligatures w14:val="none"/>
         </w:rPr>
-        <w:t xml:space="preserve"> de tourisme ? Voici les clés qui seront gardées : </w:t>
-      </w:r>
-      <w:proofErr w:type="spellStart"/>
-      <w:r>
-        <w:rPr>
-          <w:rFonts w:ascii="Segoe UI" w:eastAsia="Times New Roman" w:hAnsi="Segoe UI" w:cs="Segoe UI"/>
-          <w:kern w:val="0"/>
-          <w:sz w:val="21"/>
-          <w:szCs w:val="21"/>
-          <w:lang w:eastAsia="fr-GA"/>
-          <w14:ligatures w14:val="none"/>
-        </w:rPr>
-        <w:t>weather</w:t>
-      </w:r>
-      <w:proofErr w:type="spellEnd"/>
-      <w:r>
-        <w:rPr>
-          <w:rFonts w:ascii="Segoe UI" w:eastAsia="Times New Roman" w:hAnsi="Segoe UI" w:cs="Segoe UI"/>
-          <w:kern w:val="0"/>
-          <w:sz w:val="21"/>
-          <w:szCs w:val="21"/>
-          <w:lang w:eastAsia="fr-GA"/>
-          <w14:ligatures w14:val="none"/>
-        </w:rPr>
-        <w:t xml:space="preserve"> (main, description), main (temp, </w:t>
-      </w:r>
-      <w:proofErr w:type="spellStart"/>
-      <w:r>
-        <w:rPr>
-          <w:rFonts w:ascii="Segoe UI" w:eastAsia="Times New Roman" w:hAnsi="Segoe UI" w:cs="Segoe UI"/>
-          <w:kern w:val="0"/>
-          <w:sz w:val="21"/>
-          <w:szCs w:val="21"/>
-          <w:lang w:eastAsia="fr-GA"/>
-          <w14:ligatures w14:val="none"/>
-        </w:rPr>
-        <w:t>temp_min</w:t>
-      </w:r>
-      <w:proofErr w:type="spellEnd"/>
-      <w:r>
-        <w:rPr>
-          <w:rFonts w:ascii="Segoe UI" w:eastAsia="Times New Roman" w:hAnsi="Segoe UI" w:cs="Segoe UI"/>
-          <w:kern w:val="0"/>
-          <w:sz w:val="21"/>
-          <w:szCs w:val="21"/>
-          <w:lang w:eastAsia="fr-GA"/>
-          <w14:ligatures w14:val="none"/>
-        </w:rPr>
-        <w:t xml:space="preserve">, </w:t>
-      </w:r>
-      <w:proofErr w:type="spellStart"/>
-      <w:r>
-        <w:rPr>
-          <w:rFonts w:ascii="Segoe UI" w:eastAsia="Times New Roman" w:hAnsi="Segoe UI" w:cs="Segoe UI"/>
-          <w:kern w:val="0"/>
-          <w:sz w:val="21"/>
-          <w:szCs w:val="21"/>
-          <w:lang w:eastAsia="fr-GA"/>
-          <w14:ligatures w14:val="none"/>
-        </w:rPr>
-        <w:t>temp_max</w:t>
-      </w:r>
-      <w:proofErr w:type="spellEnd"/>
-      <w:r>
-        <w:rPr>
-          <w:rFonts w:ascii="Segoe UI" w:eastAsia="Times New Roman" w:hAnsi="Segoe UI" w:cs="Segoe UI"/>
-          <w:kern w:val="0"/>
-          <w:sz w:val="21"/>
-          <w:szCs w:val="21"/>
-          <w:lang w:eastAsia="fr-GA"/>
-          <w14:ligatures w14:val="none"/>
-        </w:rPr>
-        <w:t xml:space="preserve">, pressure, </w:t>
-      </w:r>
-      <w:proofErr w:type="spellStart"/>
-      <w:r>
-        <w:rPr>
-          <w:rFonts w:ascii="Segoe UI" w:eastAsia="Times New Roman" w:hAnsi="Segoe UI" w:cs="Segoe UI"/>
-          <w:kern w:val="0"/>
-          <w:sz w:val="21"/>
-          <w:szCs w:val="21"/>
-          <w:lang w:eastAsia="fr-GA"/>
-          <w14:ligatures w14:val="none"/>
-        </w:rPr>
-        <w:t>humidity</w:t>
-      </w:r>
-      <w:proofErr w:type="spellEnd"/>
-      <w:r>
-        <w:rPr>
-          <w:rFonts w:ascii="Segoe UI" w:eastAsia="Times New Roman" w:hAnsi="Segoe UI" w:cs="Segoe UI"/>
-          <w:kern w:val="0"/>
-          <w:sz w:val="21"/>
-          <w:szCs w:val="21"/>
-          <w:lang w:eastAsia="fr-GA"/>
-          <w14:ligatures w14:val="none"/>
-        </w:rPr>
-        <w:t xml:space="preserve">), </w:t>
-      </w:r>
-      <w:proofErr w:type="spellStart"/>
-      <w:r>
-        <w:rPr>
-          <w:rFonts w:ascii="Segoe UI" w:eastAsia="Times New Roman" w:hAnsi="Segoe UI" w:cs="Segoe UI"/>
-          <w:kern w:val="0"/>
-          <w:sz w:val="21"/>
-          <w:szCs w:val="21"/>
-          <w:lang w:eastAsia="fr-GA"/>
-          <w14:ligatures w14:val="none"/>
-        </w:rPr>
-        <w:t>visibility</w:t>
-      </w:r>
-      <w:proofErr w:type="spellEnd"/>
-      <w:r>
-        <w:rPr>
-          <w:rFonts w:ascii="Segoe UI" w:eastAsia="Times New Roman" w:hAnsi="Segoe UI" w:cs="Segoe UI"/>
-          <w:kern w:val="0"/>
-          <w:sz w:val="21"/>
-          <w:szCs w:val="21"/>
-          <w:lang w:eastAsia="fr-GA"/>
-          <w14:ligatures w14:val="none"/>
-        </w:rPr>
-        <w:t xml:space="preserve">, </w:t>
-      </w:r>
-      <w:proofErr w:type="spellStart"/>
-      <w:r>
-        <w:rPr>
-          <w:rFonts w:ascii="Segoe UI" w:eastAsia="Times New Roman" w:hAnsi="Segoe UI" w:cs="Segoe UI"/>
-          <w:kern w:val="0"/>
-          <w:sz w:val="21"/>
-          <w:szCs w:val="21"/>
-          <w:lang w:eastAsia="fr-GA"/>
-          <w14:ligatures w14:val="none"/>
-        </w:rPr>
-        <w:t>wind</w:t>
-      </w:r>
-      <w:proofErr w:type="spellEnd"/>
-      <w:r>
-        <w:rPr>
-          <w:rFonts w:ascii="Segoe UI" w:eastAsia="Times New Roman" w:hAnsi="Segoe UI" w:cs="Segoe UI"/>
-          <w:kern w:val="0"/>
-          <w:sz w:val="21"/>
-          <w:szCs w:val="21"/>
-          <w:lang w:eastAsia="fr-GA"/>
-          <w14:ligatures w14:val="none"/>
-        </w:rPr>
-        <w:t xml:space="preserve"> (speed), </w:t>
-      </w:r>
-      <w:proofErr w:type="spellStart"/>
-      <w:r>
-        <w:rPr>
-          <w:rFonts w:ascii="Segoe UI" w:eastAsia="Times New Roman" w:hAnsi="Segoe UI" w:cs="Segoe UI"/>
-          <w:kern w:val="0"/>
-          <w:sz w:val="21"/>
-          <w:szCs w:val="21"/>
-          <w:lang w:eastAsia="fr-GA"/>
-          <w14:ligatures w14:val="none"/>
-        </w:rPr>
-        <w:t>clouds</w:t>
-      </w:r>
-      <w:proofErr w:type="spellEnd"/>
-      <w:r>
-        <w:rPr>
-          <w:rFonts w:ascii="Segoe UI" w:eastAsia="Times New Roman" w:hAnsi="Segoe UI" w:cs="Segoe UI"/>
-          <w:kern w:val="0"/>
-          <w:sz w:val="21"/>
-          <w:szCs w:val="21"/>
-          <w:lang w:eastAsia="fr-GA"/>
-          <w14:ligatures w14:val="none"/>
-        </w:rPr>
-        <w:t xml:space="preserve">, </w:t>
-      </w:r>
-      <w:proofErr w:type="spellStart"/>
-      <w:r>
-        <w:rPr>
-          <w:rFonts w:ascii="Segoe UI" w:eastAsia="Times New Roman" w:hAnsi="Segoe UI" w:cs="Segoe UI"/>
-          <w:kern w:val="0"/>
-          <w:sz w:val="21"/>
-          <w:szCs w:val="21"/>
-          <w:lang w:eastAsia="fr-GA"/>
-          <w14:ligatures w14:val="none"/>
-        </w:rPr>
-        <w:t>dt</w:t>
-      </w:r>
-      <w:proofErr w:type="spellEnd"/>
-      <w:r>
-        <w:rPr>
-          <w:rFonts w:ascii="Segoe UI" w:eastAsia="Times New Roman" w:hAnsi="Segoe UI" w:cs="Segoe UI"/>
-          <w:kern w:val="0"/>
-          <w:sz w:val="21"/>
-          <w:szCs w:val="21"/>
-          <w:lang w:eastAsia="fr-GA"/>
-          <w14:ligatures w14:val="none"/>
-        </w:rPr>
-        <w:t xml:space="preserve">, </w:t>
-      </w:r>
-      <w:proofErr w:type="spellStart"/>
-      <w:r>
-        <w:rPr>
-          <w:rFonts w:ascii="Segoe UI" w:eastAsia="Times New Roman" w:hAnsi="Segoe UI" w:cs="Segoe UI"/>
-          <w:kern w:val="0"/>
-          <w:sz w:val="21"/>
-          <w:szCs w:val="21"/>
-          <w:lang w:eastAsia="fr-GA"/>
-          <w14:ligatures w14:val="none"/>
-        </w:rPr>
-        <w:t>sys</w:t>
-      </w:r>
-      <w:proofErr w:type="spellEnd"/>
-      <w:r>
-        <w:rPr>
-          <w:rFonts w:ascii="Segoe UI" w:eastAsia="Times New Roman" w:hAnsi="Segoe UI" w:cs="Segoe UI"/>
-          <w:kern w:val="0"/>
-          <w:sz w:val="21"/>
-          <w:szCs w:val="21"/>
-          <w:lang w:eastAsia="fr-GA"/>
-          <w14:ligatures w14:val="none"/>
-        </w:rPr>
-        <w:t xml:space="preserve"> (country, </w:t>
-      </w:r>
-      <w:proofErr w:type="spellStart"/>
-      <w:r>
-        <w:rPr>
-          <w:rFonts w:ascii="Segoe UI" w:eastAsia="Times New Roman" w:hAnsi="Segoe UI" w:cs="Segoe UI"/>
-          <w:kern w:val="0"/>
-          <w:sz w:val="21"/>
-          <w:szCs w:val="21"/>
-          <w:lang w:eastAsia="fr-GA"/>
-          <w14:ligatures w14:val="none"/>
-        </w:rPr>
-        <w:t>sunrise</w:t>
-      </w:r>
-      <w:proofErr w:type="spellEnd"/>
-      <w:r>
-        <w:rPr>
-          <w:rFonts w:ascii="Segoe UI" w:eastAsia="Times New Roman" w:hAnsi="Segoe UI" w:cs="Segoe UI"/>
-          <w:kern w:val="0"/>
-          <w:sz w:val="21"/>
-          <w:szCs w:val="21"/>
-          <w:lang w:eastAsia="fr-GA"/>
-          <w14:ligatures w14:val="none"/>
-        </w:rPr>
-        <w:t xml:space="preserve">, </w:t>
-      </w:r>
-      <w:proofErr w:type="spellStart"/>
-      <w:r>
-        <w:rPr>
-          <w:rFonts w:ascii="Segoe UI" w:eastAsia="Times New Roman" w:hAnsi="Segoe UI" w:cs="Segoe UI"/>
-          <w:kern w:val="0"/>
-          <w:sz w:val="21"/>
-          <w:szCs w:val="21"/>
-          <w:lang w:eastAsia="fr-GA"/>
-          <w14:ligatures w14:val="none"/>
-        </w:rPr>
-        <w:t>sunset</w:t>
-      </w:r>
-      <w:proofErr w:type="spellEnd"/>
-      <w:r>
-        <w:rPr>
-          <w:rFonts w:ascii="Segoe UI" w:eastAsia="Times New Roman" w:hAnsi="Segoe UI" w:cs="Segoe UI"/>
-          <w:kern w:val="0"/>
-          <w:sz w:val="21"/>
-          <w:szCs w:val="21"/>
-          <w:lang w:eastAsia="fr-GA"/>
-          <w14:ligatures w14:val="none"/>
-        </w:rPr>
-        <w:t xml:space="preserve">), </w:t>
-      </w:r>
-      <w:proofErr w:type="spellStart"/>
-      <w:r>
-        <w:rPr>
-          <w:rFonts w:ascii="Segoe UI" w:eastAsia="Times New Roman" w:hAnsi="Segoe UI" w:cs="Segoe UI"/>
-          <w:kern w:val="0"/>
-          <w:sz w:val="21"/>
-          <w:szCs w:val="21"/>
-          <w:lang w:eastAsia="fr-GA"/>
-          <w14:ligatures w14:val="none"/>
-        </w:rPr>
-        <w:t>timezone</w:t>
-      </w:r>
-      <w:proofErr w:type="spellEnd"/>
-      <w:r>
-        <w:rPr>
-          <w:rFonts w:ascii="Segoe UI" w:eastAsia="Times New Roman" w:hAnsi="Segoe UI" w:cs="Segoe UI"/>
-          <w:kern w:val="0"/>
-          <w:sz w:val="21"/>
-          <w:szCs w:val="21"/>
-          <w:lang w:eastAsia="fr-GA"/>
-          <w14:ligatures w14:val="none"/>
-        </w:rPr>
-        <w:t xml:space="preserve">, </w:t>
-      </w:r>
-      <w:proofErr w:type="spellStart"/>
-      <w:r>
-        <w:rPr>
-          <w:rFonts w:ascii="Segoe UI" w:eastAsia="Times New Roman" w:hAnsi="Segoe UI" w:cs="Segoe UI"/>
-          <w:kern w:val="0"/>
-          <w:sz w:val="21"/>
-          <w:szCs w:val="21"/>
-          <w:lang w:eastAsia="fr-GA"/>
-          <w14:ligatures w14:val="none"/>
-        </w:rPr>
-        <w:t>name</w:t>
-      </w:r>
-      <w:proofErr w:type="spellEnd"/>
-      <w:r>
-        <w:rPr>
-          <w:rFonts w:ascii="Segoe UI" w:eastAsia="Times New Roman" w:hAnsi="Segoe UI" w:cs="Segoe UI"/>
-          <w:kern w:val="0"/>
-          <w:sz w:val="21"/>
-          <w:szCs w:val="21"/>
-          <w:lang w:eastAsia="fr-GA"/>
-          <w14:ligatures w14:val="none"/>
-        </w:rPr>
-        <w:t xml:space="preserve"> (à ne pas utiliser tel quel selon les villes). Voici les clés qui seront jetées : </w:t>
-      </w:r>
-      <w:proofErr w:type="spellStart"/>
-      <w:r>
-        <w:rPr>
-          <w:rFonts w:ascii="Segoe UI" w:eastAsia="Times New Roman" w:hAnsi="Segoe UI" w:cs="Segoe UI"/>
-          <w:kern w:val="0"/>
-          <w:sz w:val="21"/>
-          <w:szCs w:val="21"/>
-          <w:lang w:eastAsia="fr-GA"/>
-          <w14:ligatures w14:val="none"/>
-        </w:rPr>
-        <w:t>coord</w:t>
-      </w:r>
-      <w:proofErr w:type="spellEnd"/>
-      <w:r>
-        <w:rPr>
-          <w:rFonts w:ascii="Segoe UI" w:eastAsia="Times New Roman" w:hAnsi="Segoe UI" w:cs="Segoe UI"/>
-          <w:kern w:val="0"/>
-          <w:sz w:val="21"/>
-          <w:szCs w:val="21"/>
-          <w:lang w:eastAsia="fr-GA"/>
-          <w14:ligatures w14:val="none"/>
-        </w:rPr>
-        <w:t xml:space="preserve">, </w:t>
-      </w:r>
-      <w:proofErr w:type="spellStart"/>
-      <w:r>
-        <w:rPr>
-          <w:rFonts w:ascii="Segoe UI" w:eastAsia="Times New Roman" w:hAnsi="Segoe UI" w:cs="Segoe UI"/>
-          <w:kern w:val="0"/>
-          <w:sz w:val="21"/>
-          <w:szCs w:val="21"/>
-          <w:lang w:eastAsia="fr-GA"/>
-          <w14:ligatures w14:val="none"/>
-        </w:rPr>
-        <w:t>weather</w:t>
-      </w:r>
-      <w:proofErr w:type="spellEnd"/>
-      <w:r>
-        <w:rPr>
-          <w:rFonts w:ascii="Segoe UI" w:eastAsia="Times New Roman" w:hAnsi="Segoe UI" w:cs="Segoe UI"/>
-          <w:kern w:val="0"/>
-          <w:sz w:val="21"/>
-          <w:szCs w:val="21"/>
-          <w:lang w:eastAsia="fr-GA"/>
-          <w14:ligatures w14:val="none"/>
-        </w:rPr>
-        <w:t xml:space="preserve"> (id, </w:t>
-      </w:r>
-      <w:proofErr w:type="spellStart"/>
-      <w:r>
-        <w:rPr>
-          <w:rFonts w:ascii="Segoe UI" w:eastAsia="Times New Roman" w:hAnsi="Segoe UI" w:cs="Segoe UI"/>
-          <w:kern w:val="0"/>
-          <w:sz w:val="21"/>
-          <w:szCs w:val="21"/>
-          <w:lang w:eastAsia="fr-GA"/>
-          <w14:ligatures w14:val="none"/>
-        </w:rPr>
-        <w:t>icon</w:t>
-      </w:r>
-      <w:proofErr w:type="spellEnd"/>
-      <w:r>
-        <w:rPr>
-          <w:rFonts w:ascii="Segoe UI" w:eastAsia="Times New Roman" w:hAnsi="Segoe UI" w:cs="Segoe UI"/>
-          <w:kern w:val="0"/>
-          <w:sz w:val="21"/>
-          <w:szCs w:val="21"/>
-          <w:lang w:eastAsia="fr-GA"/>
-          <w14:ligatures w14:val="none"/>
-        </w:rPr>
-        <w:t>), base, main (</w:t>
-      </w:r>
-      <w:proofErr w:type="spellStart"/>
-      <w:r>
-        <w:rPr>
-          <w:rFonts w:ascii="Segoe UI" w:eastAsia="Times New Roman" w:hAnsi="Segoe UI" w:cs="Segoe UI"/>
-          <w:kern w:val="0"/>
-          <w:sz w:val="21"/>
-          <w:szCs w:val="21"/>
-          <w:lang w:eastAsia="fr-GA"/>
-          <w14:ligatures w14:val="none"/>
-        </w:rPr>
-        <w:t>sea_level</w:t>
-      </w:r>
-      <w:proofErr w:type="spellEnd"/>
-      <w:r>
-        <w:rPr>
-          <w:rFonts w:ascii="Segoe UI" w:eastAsia="Times New Roman" w:hAnsi="Segoe UI" w:cs="Segoe UI"/>
-          <w:kern w:val="0"/>
-          <w:sz w:val="21"/>
-          <w:szCs w:val="21"/>
-          <w:lang w:eastAsia="fr-GA"/>
-          <w14:ligatures w14:val="none"/>
-        </w:rPr>
-        <w:t xml:space="preserve">, </w:t>
-      </w:r>
-      <w:proofErr w:type="spellStart"/>
-      <w:r>
-        <w:rPr>
-          <w:rFonts w:ascii="Segoe UI" w:eastAsia="Times New Roman" w:hAnsi="Segoe UI" w:cs="Segoe UI"/>
-          <w:kern w:val="0"/>
-          <w:sz w:val="21"/>
-          <w:szCs w:val="21"/>
-          <w:lang w:eastAsia="fr-GA"/>
-          <w14:ligatures w14:val="none"/>
-        </w:rPr>
-        <w:t>grnd_level</w:t>
-      </w:r>
-      <w:proofErr w:type="spellEnd"/>
-      <w:r>
-        <w:rPr>
-          <w:rFonts w:ascii="Segoe UI" w:eastAsia="Times New Roman" w:hAnsi="Segoe UI" w:cs="Segoe UI"/>
-          <w:kern w:val="0"/>
-          <w:sz w:val="21"/>
-          <w:szCs w:val="21"/>
-          <w:lang w:eastAsia="fr-GA"/>
-          <w14:ligatures w14:val="none"/>
-        </w:rPr>
-        <w:t xml:space="preserve">), </w:t>
-      </w:r>
-      <w:proofErr w:type="spellStart"/>
-      <w:r>
-        <w:rPr>
-          <w:rFonts w:ascii="Segoe UI" w:eastAsia="Times New Roman" w:hAnsi="Segoe UI" w:cs="Segoe UI"/>
-          <w:kern w:val="0"/>
-          <w:sz w:val="21"/>
-          <w:szCs w:val="21"/>
-          <w:lang w:eastAsia="fr-GA"/>
-          <w14:ligatures w14:val="none"/>
-        </w:rPr>
-        <w:t>wind</w:t>
-      </w:r>
-      <w:proofErr w:type="spellEnd"/>
-      <w:r>
-        <w:rPr>
-          <w:rFonts w:ascii="Segoe UI" w:eastAsia="Times New Roman" w:hAnsi="Segoe UI" w:cs="Segoe UI"/>
-          <w:kern w:val="0"/>
-          <w:sz w:val="21"/>
-          <w:szCs w:val="21"/>
-          <w:lang w:eastAsia="fr-GA"/>
-          <w14:ligatures w14:val="none"/>
-        </w:rPr>
-        <w:t xml:space="preserve"> (</w:t>
-      </w:r>
-      <w:proofErr w:type="spellStart"/>
-      <w:r>
-        <w:rPr>
-          <w:rFonts w:ascii="Segoe UI" w:eastAsia="Times New Roman" w:hAnsi="Segoe UI" w:cs="Segoe UI"/>
-          <w:kern w:val="0"/>
-          <w:sz w:val="21"/>
-          <w:szCs w:val="21"/>
-          <w:lang w:eastAsia="fr-GA"/>
-          <w14:ligatures w14:val="none"/>
-        </w:rPr>
-        <w:t>deg</w:t>
-      </w:r>
-      <w:proofErr w:type="spellEnd"/>
-      <w:r>
-        <w:rPr>
-          <w:rFonts w:ascii="Segoe UI" w:eastAsia="Times New Roman" w:hAnsi="Segoe UI" w:cs="Segoe UI"/>
-          <w:kern w:val="0"/>
-          <w:sz w:val="21"/>
-          <w:szCs w:val="21"/>
-          <w:lang w:eastAsia="fr-GA"/>
-          <w14:ligatures w14:val="none"/>
-        </w:rPr>
-        <w:t xml:space="preserve">), </w:t>
-      </w:r>
-      <w:proofErr w:type="spellStart"/>
-      <w:r>
-        <w:rPr>
-          <w:rFonts w:ascii="Segoe UI" w:eastAsia="Times New Roman" w:hAnsi="Segoe UI" w:cs="Segoe UI"/>
-          <w:kern w:val="0"/>
-          <w:sz w:val="21"/>
-          <w:szCs w:val="21"/>
-          <w:lang w:eastAsia="fr-GA"/>
-          <w14:ligatures w14:val="none"/>
-        </w:rPr>
-        <w:t>sys</w:t>
-      </w:r>
-      <w:proofErr w:type="spellEnd"/>
-      <w:r>
-        <w:rPr>
-          <w:rFonts w:ascii="Segoe UI" w:eastAsia="Times New Roman" w:hAnsi="Segoe UI" w:cs="Segoe UI"/>
-          <w:kern w:val="0"/>
-          <w:sz w:val="21"/>
-          <w:szCs w:val="21"/>
-          <w:lang w:eastAsia="fr-GA"/>
-          <w14:ligatures w14:val="none"/>
-        </w:rPr>
-        <w:t xml:space="preserve"> (type, id), id, </w:t>
-      </w:r>
-      <w:proofErr w:type="spellStart"/>
-      <w:r>
-        <w:rPr>
-          <w:rFonts w:ascii="Segoe UI" w:eastAsia="Times New Roman" w:hAnsi="Segoe UI" w:cs="Segoe UI"/>
-          <w:kern w:val="0"/>
-          <w:sz w:val="21"/>
-          <w:szCs w:val="21"/>
-          <w:lang w:eastAsia="fr-GA"/>
-          <w14:ligatures w14:val="none"/>
-        </w:rPr>
-        <w:t>cod</w:t>
-      </w:r>
-      <w:proofErr w:type="spellEnd"/>
-      <w:r>
-        <w:rPr>
-          <w:rFonts w:ascii="Segoe UI" w:eastAsia="Times New Roman" w:hAnsi="Segoe UI" w:cs="Segoe UI"/>
-          <w:kern w:val="0"/>
-          <w:sz w:val="21"/>
-          <w:szCs w:val="21"/>
-          <w:lang w:eastAsia="fr-GA"/>
-          <w14:ligatures w14:val="none"/>
-        </w:rPr>
-        <w:t xml:space="preserve"> (on vérifiera le code renvoyé, mais on ne garde pas en mémoire).</w:t>
+        <w:t xml:space="preserve"> de tourisme ? Voici les clés qui seront gardées : weather (main, description), main (temp, temp_min, temp_max, pressure, humidity), visibility, wind (speed), clouds, dt, sys (country, sunrise, sunset), timezone, name (à ne pas utiliser tel quel selon les villes). Voici les clés qui seront jetées : coord, weather (id, icon), base, main (sea_level, grnd_level), wind (deg), sys (type, id), id, cod (on vérifiera le code renvoyé, mais on ne garde pas en mémoire).</w:t>
       </w:r>
     </w:p>
     <w:p>
@@ -1259,31 +352,7 @@
           <w:lang w:eastAsia="fr-GA"/>
           <w14:ligatures w14:val="none"/>
         </w:rPr>
-        <w:t xml:space="preserve">En conclusion, le </w:t>
-      </w:r>
-      <w:proofErr w:type="spellStart"/>
-      <w:r>
-        <w:rPr>
-          <w:rFonts w:ascii="Segoe UI" w:eastAsia="Times New Roman" w:hAnsi="Segoe UI" w:cs="Segoe UI"/>
-          <w:kern w:val="0"/>
-          <w:sz w:val="21"/>
-          <w:szCs w:val="21"/>
-          <w:lang w:eastAsia="fr-GA"/>
-          <w14:ligatures w14:val="none"/>
-        </w:rPr>
-        <w:t>schema</w:t>
-      </w:r>
-      <w:proofErr w:type="spellEnd"/>
-      <w:r>
-        <w:rPr>
-          <w:rFonts w:ascii="Segoe UI" w:eastAsia="Times New Roman" w:hAnsi="Segoe UI" w:cs="Segoe UI"/>
-          <w:kern w:val="0"/>
-          <w:sz w:val="21"/>
-          <w:szCs w:val="21"/>
-          <w:lang w:eastAsia="fr-GA"/>
-          <w14:ligatures w14:val="none"/>
-        </w:rPr>
-        <w:t xml:space="preserve"> SQL sera le suivant :</w:t>
+        <w:t>En conclusion, le schema SQL sera le suivant :</w:t>
       </w:r>
     </w:p>
     <w:p>
@@ -1314,19 +383,6 @@
         </w:rPr>
         <w:t>L’entité « </w:t>
       </w:r>
-      <w:proofErr w:type="spellStart"/>
-      <w:r>
-        <w:rPr>
-          <w:rFonts w:ascii="Segoe UI" w:eastAsia="Times New Roman" w:hAnsi="Segoe UI" w:cs="Segoe UI"/>
-          <w:kern w:val="0"/>
-          <w:sz w:val="21"/>
-          <w:szCs w:val="21"/>
-          <w:lang w:eastAsia="fr-GA"/>
-          <w14:ligatures w14:val="none"/>
-        </w:rPr>
-        <w:t>Meteo</w:t>
-      </w:r>
-      <w:proofErr w:type="spellEnd"/>
       <w:r>
         <w:rPr>
           <w:rFonts w:ascii="Segoe UI" w:eastAsia="Times New Roman" w:hAnsi="Segoe UI" w:cs="Segoe UI"/>
@@ -1336,7 +392,29 @@
           <w:lang w:val="fr-FR" w:eastAsia="fr-GA"/>
           <w14:ligatures w14:val="none"/>
         </w:rPr>
-        <w:t> » qui contiendra les champs :</w:t>
+        <w:t>W</w:t>
+      </w:r>
+      <w:r>
+        <w:rPr>
+          <w:rFonts w:ascii="Segoe UI" w:eastAsia="Times New Roman" w:hAnsi="Segoe UI" w:cs="Segoe UI"/>
+          <w:kern w:val="0"/>
+          <w:sz w:val="21"/>
+          <w:szCs w:val="21"/>
+          <w:lang w:eastAsia="fr-GA"/>
+          <w14:ligatures w14:val="none"/>
+        </w:rPr>
+        <w:t>eather</w:t>
+      </w:r>
+      <w:r>
+        <w:rPr>
+          <w:rFonts w:ascii="Segoe UI" w:eastAsia="Times New Roman" w:hAnsi="Segoe UI" w:cs="Segoe UI"/>
+          <w:kern w:val="0"/>
+          <w:sz w:val="21"/>
+          <w:szCs w:val="21"/>
+          <w:lang w:val="fr-FR" w:eastAsia="fr-GA"/>
+          <w14:ligatures w14:val="none"/>
+        </w:rPr>
+        <w:t>» qui contiendra les champs :</w:t>
       </w:r>
     </w:p>
     <w:p>
@@ -1356,29 +434,16 @@
           <w14:ligatures w14:val="none"/>
         </w:rPr>
       </w:pPr>
-      <w:proofErr w:type="gramStart"/>
-      <w:r>
-        <w:rPr>
-          <w:rFonts w:ascii="Segoe UI" w:eastAsia="Times New Roman" w:hAnsi="Segoe UI" w:cs="Segoe UI"/>
-          <w:kern w:val="0"/>
-          <w:sz w:val="21"/>
-          <w:szCs w:val="21"/>
-          <w:lang w:eastAsia="fr-GA"/>
-          <w14:ligatures w14:val="none"/>
-        </w:rPr>
-        <w:t>main</w:t>
-      </w:r>
-      <w:proofErr w:type="gramEnd"/>
-      <w:r>
-        <w:rPr>
-          <w:rFonts w:ascii="Segoe UI" w:eastAsia="Times New Roman" w:hAnsi="Segoe UI" w:cs="Segoe UI"/>
-          <w:kern w:val="0"/>
-          <w:sz w:val="21"/>
-          <w:szCs w:val="21"/>
-          <w:lang w:eastAsia="fr-GA"/>
-          <w14:ligatures w14:val="none"/>
-        </w:rPr>
-        <w:t>,</w:t>
+      <w:r>
+        <w:rPr>
+          <w:rFonts w:ascii="Segoe UI" w:eastAsia="Times New Roman" w:hAnsi="Segoe UI" w:cs="Segoe UI"/>
+          <w:kern w:val="0"/>
+          <w:sz w:val="21"/>
+          <w:szCs w:val="21"/>
+          <w:lang w:eastAsia="fr-GA"/>
+          <w14:ligatures w14:val="none"/>
+        </w:rPr>
+        <w:t>main,</w:t>
       </w:r>
     </w:p>
     <w:p>
@@ -1398,29 +463,16 @@
           <w14:ligatures w14:val="none"/>
         </w:rPr>
       </w:pPr>
-      <w:proofErr w:type="gramStart"/>
-      <w:r>
-        <w:rPr>
-          <w:rFonts w:ascii="Segoe UI" w:eastAsia="Times New Roman" w:hAnsi="Segoe UI" w:cs="Segoe UI"/>
-          <w:kern w:val="0"/>
-          <w:sz w:val="21"/>
-          <w:szCs w:val="21"/>
-          <w:lang w:eastAsia="fr-GA"/>
-          <w14:ligatures w14:val="none"/>
-        </w:rPr>
-        <w:t>description</w:t>
-      </w:r>
-      <w:proofErr w:type="gramEnd"/>
-      <w:r>
-        <w:rPr>
-          <w:rFonts w:ascii="Segoe UI" w:eastAsia="Times New Roman" w:hAnsi="Segoe UI" w:cs="Segoe UI"/>
-          <w:kern w:val="0"/>
-          <w:sz w:val="21"/>
-          <w:szCs w:val="21"/>
-          <w:lang w:eastAsia="fr-GA"/>
-          <w14:ligatures w14:val="none"/>
-        </w:rPr>
-        <w:t>,</w:t>
+      <w:r>
+        <w:rPr>
+          <w:rFonts w:ascii="Segoe UI" w:eastAsia="Times New Roman" w:hAnsi="Segoe UI" w:cs="Segoe UI"/>
+          <w:kern w:val="0"/>
+          <w:sz w:val="21"/>
+          <w:szCs w:val="21"/>
+          <w:lang w:eastAsia="fr-GA"/>
+          <w14:ligatures w14:val="none"/>
+        </w:rPr>
+        <w:t>description,</w:t>
       </w:r>
     </w:p>
     <w:p>
@@ -1440,29 +492,16 @@
           <w14:ligatures w14:val="none"/>
         </w:rPr>
       </w:pPr>
-      <w:proofErr w:type="gramStart"/>
-      <w:r>
-        <w:rPr>
-          <w:rFonts w:ascii="Segoe UI" w:eastAsia="Times New Roman" w:hAnsi="Segoe UI" w:cs="Segoe UI"/>
-          <w:kern w:val="0"/>
-          <w:sz w:val="21"/>
-          <w:szCs w:val="21"/>
-          <w:lang w:eastAsia="fr-GA"/>
-          <w14:ligatures w14:val="none"/>
-        </w:rPr>
-        <w:t>temp</w:t>
-      </w:r>
-      <w:proofErr w:type="gramEnd"/>
-      <w:r>
-        <w:rPr>
-          <w:rFonts w:ascii="Segoe UI" w:eastAsia="Times New Roman" w:hAnsi="Segoe UI" w:cs="Segoe UI"/>
-          <w:kern w:val="0"/>
-          <w:sz w:val="21"/>
-          <w:szCs w:val="21"/>
-          <w:lang w:eastAsia="fr-GA"/>
-          <w14:ligatures w14:val="none"/>
-        </w:rPr>
-        <w:t xml:space="preserve">, </w:t>
+      <w:r>
+        <w:rPr>
+          <w:rFonts w:ascii="Segoe UI" w:eastAsia="Times New Roman" w:hAnsi="Segoe UI" w:cs="Segoe UI"/>
+          <w:kern w:val="0"/>
+          <w:sz w:val="21"/>
+          <w:szCs w:val="21"/>
+          <w:lang w:eastAsia="fr-GA"/>
+          <w14:ligatures w14:val="none"/>
+        </w:rPr>
+        <w:t xml:space="preserve">temp, </w:t>
       </w:r>
     </w:p>
     <w:p>
@@ -1482,32 +521,17 @@
           <w14:ligatures w14:val="none"/>
         </w:rPr>
       </w:pPr>
-      <w:proofErr w:type="spellStart"/>
-      <w:proofErr w:type="gramStart"/>
-      <w:r>
-        <w:rPr>
-          <w:rFonts w:ascii="Segoe UI" w:eastAsia="Times New Roman" w:hAnsi="Segoe UI" w:cs="Segoe UI"/>
-          <w:kern w:val="0"/>
-          <w:sz w:val="21"/>
-          <w:szCs w:val="21"/>
-          <w:lang w:eastAsia="fr-GA"/>
-          <w14:ligatures w14:val="none"/>
-        </w:rPr>
-        <w:t>feels</w:t>
-      </w:r>
-      <w:proofErr w:type="gramEnd"/>
-      <w:r>
-        <w:rPr>
-          <w:rFonts w:ascii="Segoe UI" w:eastAsia="Times New Roman" w:hAnsi="Segoe UI" w:cs="Segoe UI"/>
-          <w:kern w:val="0"/>
-          <w:sz w:val="21"/>
-          <w:szCs w:val="21"/>
-          <w:lang w:eastAsia="fr-GA"/>
-          <w14:ligatures w14:val="none"/>
-        </w:rPr>
-        <w:t>_like</w:t>
-      </w:r>
-      <w:proofErr w:type="spellEnd"/>
+      <w:r>
+        <w:rPr>
+          <w:rFonts w:ascii="Segoe UI" w:eastAsia="Times New Roman" w:hAnsi="Segoe UI" w:cs="Segoe UI"/>
+          <w:kern w:val="0"/>
+          <w:sz w:val="21"/>
+          <w:szCs w:val="21"/>
+          <w:lang w:eastAsia="fr-GA"/>
+          <w14:ligatures w14:val="none"/>
+        </w:rPr>
+        <w:t>feels_like</w:t>
+      </w:r>
     </w:p>
     <w:p>
       <w:pPr>
@@ -1526,42 +550,16 @@
           <w14:ligatures w14:val="none"/>
         </w:rPr>
       </w:pPr>
-      <w:proofErr w:type="spellStart"/>
-      <w:proofErr w:type="gramStart"/>
-      <w:r>
-        <w:rPr>
-          <w:rFonts w:ascii="Segoe UI" w:eastAsia="Times New Roman" w:hAnsi="Segoe UI" w:cs="Segoe UI"/>
-          <w:kern w:val="0"/>
-          <w:sz w:val="21"/>
-          <w:szCs w:val="21"/>
-          <w:lang w:eastAsia="fr-GA"/>
-          <w14:ligatures w14:val="none"/>
-        </w:rPr>
-        <w:t>temp</w:t>
-      </w:r>
-      <w:proofErr w:type="gramEnd"/>
-      <w:r>
-        <w:rPr>
-          <w:rFonts w:ascii="Segoe UI" w:eastAsia="Times New Roman" w:hAnsi="Segoe UI" w:cs="Segoe UI"/>
-          <w:kern w:val="0"/>
-          <w:sz w:val="21"/>
-          <w:szCs w:val="21"/>
-          <w:lang w:eastAsia="fr-GA"/>
-          <w14:ligatures w14:val="none"/>
-        </w:rPr>
-        <w:t>_min</w:t>
-      </w:r>
-      <w:proofErr w:type="spellEnd"/>
-      <w:r>
-        <w:rPr>
-          <w:rFonts w:ascii="Segoe UI" w:eastAsia="Times New Roman" w:hAnsi="Segoe UI" w:cs="Segoe UI"/>
-          <w:kern w:val="0"/>
-          <w:sz w:val="21"/>
-          <w:szCs w:val="21"/>
-          <w:lang w:eastAsia="fr-GA"/>
-          <w14:ligatures w14:val="none"/>
-        </w:rPr>
-        <w:t>,</w:t>
+      <w:r>
+        <w:rPr>
+          <w:rFonts w:ascii="Segoe UI" w:eastAsia="Times New Roman" w:hAnsi="Segoe UI" w:cs="Segoe UI"/>
+          <w:kern w:val="0"/>
+          <w:sz w:val="21"/>
+          <w:szCs w:val="21"/>
+          <w:lang w:eastAsia="fr-GA"/>
+          <w14:ligatures w14:val="none"/>
+        </w:rPr>
+        <w:t>temp_min,</w:t>
       </w:r>
     </w:p>
     <w:p>
@@ -1581,42 +579,16 @@
           <w14:ligatures w14:val="none"/>
         </w:rPr>
       </w:pPr>
-      <w:proofErr w:type="spellStart"/>
-      <w:proofErr w:type="gramStart"/>
-      <w:r>
-        <w:rPr>
-          <w:rFonts w:ascii="Segoe UI" w:eastAsia="Times New Roman" w:hAnsi="Segoe UI" w:cs="Segoe UI"/>
-          <w:kern w:val="0"/>
-          <w:sz w:val="21"/>
-          <w:szCs w:val="21"/>
-          <w:lang w:eastAsia="fr-GA"/>
-          <w14:ligatures w14:val="none"/>
-        </w:rPr>
-        <w:t>temp</w:t>
-      </w:r>
-      <w:proofErr w:type="gramEnd"/>
-      <w:r>
-        <w:rPr>
-          <w:rFonts w:ascii="Segoe UI" w:eastAsia="Times New Roman" w:hAnsi="Segoe UI" w:cs="Segoe UI"/>
-          <w:kern w:val="0"/>
-          <w:sz w:val="21"/>
-          <w:szCs w:val="21"/>
-          <w:lang w:eastAsia="fr-GA"/>
-          <w14:ligatures w14:val="none"/>
-        </w:rPr>
-        <w:t>_max</w:t>
-      </w:r>
-      <w:proofErr w:type="spellEnd"/>
-      <w:r>
-        <w:rPr>
-          <w:rFonts w:ascii="Segoe UI" w:eastAsia="Times New Roman" w:hAnsi="Segoe UI" w:cs="Segoe UI"/>
-          <w:kern w:val="0"/>
-          <w:sz w:val="21"/>
-          <w:szCs w:val="21"/>
-          <w:lang w:eastAsia="fr-GA"/>
-          <w14:ligatures w14:val="none"/>
-        </w:rPr>
-        <w:t>,</w:t>
+      <w:r>
+        <w:rPr>
+          <w:rFonts w:ascii="Segoe UI" w:eastAsia="Times New Roman" w:hAnsi="Segoe UI" w:cs="Segoe UI"/>
+          <w:kern w:val="0"/>
+          <w:sz w:val="21"/>
+          <w:szCs w:val="21"/>
+          <w:lang w:eastAsia="fr-GA"/>
+          <w14:ligatures w14:val="none"/>
+        </w:rPr>
+        <w:t>temp_max,</w:t>
       </w:r>
     </w:p>
     <w:p>
@@ -1636,29 +608,16 @@
           <w14:ligatures w14:val="none"/>
         </w:rPr>
       </w:pPr>
-      <w:proofErr w:type="gramStart"/>
-      <w:r>
-        <w:rPr>
-          <w:rFonts w:ascii="Segoe UI" w:eastAsia="Times New Roman" w:hAnsi="Segoe UI" w:cs="Segoe UI"/>
-          <w:kern w:val="0"/>
-          <w:sz w:val="21"/>
-          <w:szCs w:val="21"/>
-          <w:lang w:eastAsia="fr-GA"/>
-          <w14:ligatures w14:val="none"/>
-        </w:rPr>
-        <w:t>pressure</w:t>
-      </w:r>
-      <w:proofErr w:type="gramEnd"/>
-      <w:r>
-        <w:rPr>
-          <w:rFonts w:ascii="Segoe UI" w:eastAsia="Times New Roman" w:hAnsi="Segoe UI" w:cs="Segoe UI"/>
-          <w:kern w:val="0"/>
-          <w:sz w:val="21"/>
-          <w:szCs w:val="21"/>
-          <w:lang w:eastAsia="fr-GA"/>
-          <w14:ligatures w14:val="none"/>
-        </w:rPr>
-        <w:t>,</w:t>
+      <w:r>
+        <w:rPr>
+          <w:rFonts w:ascii="Segoe UI" w:eastAsia="Times New Roman" w:hAnsi="Segoe UI" w:cs="Segoe UI"/>
+          <w:kern w:val="0"/>
+          <w:sz w:val="21"/>
+          <w:szCs w:val="21"/>
+          <w:lang w:eastAsia="fr-GA"/>
+          <w14:ligatures w14:val="none"/>
+        </w:rPr>
+        <w:t>pressure,</w:t>
       </w:r>
     </w:p>
     <w:p>
@@ -1678,31 +637,16 @@
           <w14:ligatures w14:val="none"/>
         </w:rPr>
       </w:pPr>
-      <w:proofErr w:type="spellStart"/>
-      <w:proofErr w:type="gramStart"/>
-      <w:r>
-        <w:rPr>
-          <w:rFonts w:ascii="Segoe UI" w:eastAsia="Times New Roman" w:hAnsi="Segoe UI" w:cs="Segoe UI"/>
-          <w:kern w:val="0"/>
-          <w:sz w:val="21"/>
-          <w:szCs w:val="21"/>
-          <w:lang w:eastAsia="fr-GA"/>
-          <w14:ligatures w14:val="none"/>
-        </w:rPr>
-        <w:t>humidity</w:t>
-      </w:r>
-      <w:proofErr w:type="spellEnd"/>
-      <w:proofErr w:type="gramEnd"/>
-      <w:r>
-        <w:rPr>
-          <w:rFonts w:ascii="Segoe UI" w:eastAsia="Times New Roman" w:hAnsi="Segoe UI" w:cs="Segoe UI"/>
-          <w:kern w:val="0"/>
-          <w:sz w:val="21"/>
-          <w:szCs w:val="21"/>
-          <w:lang w:eastAsia="fr-GA"/>
-          <w14:ligatures w14:val="none"/>
-        </w:rPr>
-        <w:t>,</w:t>
+      <w:r>
+        <w:rPr>
+          <w:rFonts w:ascii="Segoe UI" w:eastAsia="Times New Roman" w:hAnsi="Segoe UI" w:cs="Segoe UI"/>
+          <w:kern w:val="0"/>
+          <w:sz w:val="21"/>
+          <w:szCs w:val="21"/>
+          <w:lang w:eastAsia="fr-GA"/>
+          <w14:ligatures w14:val="none"/>
+        </w:rPr>
+        <w:t>humidity,</w:t>
       </w:r>
     </w:p>
     <w:p>
@@ -1722,8 +666,6 @@
           <w14:ligatures w14:val="none"/>
         </w:rPr>
       </w:pPr>
-      <w:proofErr w:type="spellStart"/>
-      <w:proofErr w:type="gramStart"/>
       <w:r>
         <w:rPr>
           <w:rFonts w:ascii="Segoe UI" w:eastAsia="Times New Roman" w:hAnsi="Segoe UI" w:cs="Segoe UI"/>
@@ -1735,8 +677,6 @@
         </w:rPr>
         <w:t>visibility</w:t>
       </w:r>
-      <w:proofErr w:type="spellEnd"/>
-      <w:proofErr w:type="gramEnd"/>
     </w:p>
     <w:p>
       <w:pPr>
@@ -1755,42 +695,16 @@
           <w14:ligatures w14:val="none"/>
         </w:rPr>
       </w:pPr>
-      <w:proofErr w:type="spellStart"/>
-      <w:proofErr w:type="gramStart"/>
-      <w:r>
-        <w:rPr>
-          <w:rFonts w:ascii="Segoe UI" w:eastAsia="Times New Roman" w:hAnsi="Segoe UI" w:cs="Segoe UI"/>
-          <w:kern w:val="0"/>
-          <w:sz w:val="21"/>
-          <w:szCs w:val="21"/>
-          <w:lang w:eastAsia="fr-GA"/>
-          <w14:ligatures w14:val="none"/>
-        </w:rPr>
-        <w:t>wind</w:t>
-      </w:r>
-      <w:proofErr w:type="gramEnd"/>
-      <w:r>
-        <w:rPr>
-          <w:rFonts w:ascii="Segoe UI" w:eastAsia="Times New Roman" w:hAnsi="Segoe UI" w:cs="Segoe UI"/>
-          <w:kern w:val="0"/>
-          <w:sz w:val="21"/>
-          <w:szCs w:val="21"/>
-          <w:lang w:eastAsia="fr-GA"/>
-          <w14:ligatures w14:val="none"/>
-        </w:rPr>
-        <w:t>_speed</w:t>
-      </w:r>
-      <w:proofErr w:type="spellEnd"/>
-      <w:r>
-        <w:rPr>
-          <w:rFonts w:ascii="Segoe UI" w:eastAsia="Times New Roman" w:hAnsi="Segoe UI" w:cs="Segoe UI"/>
-          <w:kern w:val="0"/>
-          <w:sz w:val="21"/>
-          <w:szCs w:val="21"/>
-          <w:lang w:eastAsia="fr-GA"/>
-          <w14:ligatures w14:val="none"/>
-        </w:rPr>
-        <w:t>,</w:t>
+      <w:r>
+        <w:rPr>
+          <w:rFonts w:ascii="Segoe UI" w:eastAsia="Times New Roman" w:hAnsi="Segoe UI" w:cs="Segoe UI"/>
+          <w:kern w:val="0"/>
+          <w:sz w:val="21"/>
+          <w:szCs w:val="21"/>
+          <w:lang w:eastAsia="fr-GA"/>
+          <w14:ligatures w14:val="none"/>
+        </w:rPr>
+        <w:t>wind_speed,</w:t>
       </w:r>
     </w:p>
     <w:p>
@@ -1810,8 +724,6 @@
           <w14:ligatures w14:val="none"/>
         </w:rPr>
       </w:pPr>
-      <w:proofErr w:type="spellStart"/>
-      <w:proofErr w:type="gramStart"/>
       <w:r>
         <w:rPr>
           <w:rFonts w:ascii="Segoe UI" w:eastAsia="Times New Roman" w:hAnsi="Segoe UI" w:cs="Segoe UI"/>
@@ -1823,8 +735,6 @@
         </w:rPr>
         <w:t>clouds</w:t>
       </w:r>
-      <w:proofErr w:type="spellEnd"/>
-      <w:proofErr w:type="gramEnd"/>
     </w:p>
     <w:p>
       <w:pPr>
@@ -1843,20 +753,24 @@
           <w14:ligatures w14:val="none"/>
         </w:rPr>
       </w:pPr>
-      <w:proofErr w:type="gramStart"/>
-      <w:r>
-        <w:rPr>
-          <w:rFonts w:ascii="Segoe UI" w:eastAsia="Times New Roman" w:hAnsi="Segoe UI" w:cs="Segoe UI"/>
-          <w:kern w:val="0"/>
-          <w:sz w:val="21"/>
-          <w:szCs w:val="21"/>
-          <w:lang w:eastAsia="fr-GA"/>
-          <w14:ligatures w14:val="none"/>
+      <w:r>
+        <w:rPr>
+          <w:lang w:val="fr-FR" w:eastAsia="fr-GA"/>
         </w:rPr>
         <w:lastRenderedPageBreak/>
-        <w:t>date</w:t>
-      </w:r>
-      <w:proofErr w:type="gramEnd"/>
+        <w:t>observation_time</w:t>
+      </w:r>
+      <w:r>
+        <w:rPr>
+          <w:rFonts w:ascii="Segoe UI" w:eastAsia="Times New Roman" w:hAnsi="Segoe UI" w:cs="Segoe UI"/>
+          <w:kern w:val="0"/>
+          <w:sz w:val="21"/>
+          <w:szCs w:val="21"/>
+          <w:lang w:eastAsia="fr-GA"/>
+          <w14:ligatures w14:val="none"/>
+        </w:rPr>
+        <w:t xml:space="preserve"> </w:t>
+      </w:r>
     </w:p>
     <w:p>
       <w:pPr>
@@ -1875,8 +789,6 @@
           <w14:ligatures w14:val="none"/>
         </w:rPr>
       </w:pPr>
-      <w:proofErr w:type="spellStart"/>
-      <w:proofErr w:type="gramStart"/>
       <w:r>
         <w:rPr>
           <w:rFonts w:ascii="Segoe UI" w:eastAsia="Times New Roman" w:hAnsi="Segoe UI" w:cs="Segoe UI"/>
@@ -1888,8 +800,6 @@
         </w:rPr>
         <w:t>sunrise</w:t>
       </w:r>
-      <w:proofErr w:type="spellEnd"/>
-      <w:proofErr w:type="gramEnd"/>
     </w:p>
     <w:p>
       <w:pPr>
@@ -1908,8 +818,6 @@
           <w14:ligatures w14:val="none"/>
         </w:rPr>
       </w:pPr>
-      <w:proofErr w:type="spellStart"/>
-      <w:proofErr w:type="gramStart"/>
       <w:r>
         <w:rPr>
           <w:rFonts w:ascii="Segoe UI" w:eastAsia="Times New Roman" w:hAnsi="Segoe UI" w:cs="Segoe UI"/>
@@ -1921,8 +829,6 @@
         </w:rPr>
         <w:t>sunset</w:t>
       </w:r>
-      <w:proofErr w:type="spellEnd"/>
-      <w:proofErr w:type="gramEnd"/>
     </w:p>
     <w:p>
       <w:pPr>
@@ -1992,7 +898,6 @@
           <w14:ligatures w14:val="none"/>
         </w:rPr>
       </w:pPr>
-      <w:proofErr w:type="gramStart"/>
       <w:r>
         <w:rPr>
           <w:rFonts w:ascii="Segoe UI" w:eastAsia="Times New Roman" w:hAnsi="Segoe UI" w:cs="Segoe UI"/>
@@ -2004,7 +909,6 @@
         </w:rPr>
         <w:t>c</w:t>
       </w:r>
-      <w:proofErr w:type="spellStart"/>
       <w:r>
         <w:rPr>
           <w:rFonts w:ascii="Segoe UI" w:eastAsia="Times New Roman" w:hAnsi="Segoe UI" w:cs="Segoe UI"/>
@@ -2016,8 +920,6 @@
         </w:rPr>
         <w:t>ountry</w:t>
       </w:r>
-      <w:proofErr w:type="spellEnd"/>
-      <w:proofErr w:type="gramEnd"/>
       <w:r>
         <w:rPr>
           <w:rFonts w:ascii="Segoe UI" w:eastAsia="Times New Roman" w:hAnsi="Segoe UI" w:cs="Segoe UI"/>
@@ -2027,21 +929,8 @@
           <w:lang w:val="fr-FR" w:eastAsia="fr-GA"/>
           <w14:ligatures w14:val="none"/>
         </w:rPr>
-        <w:t>_</w:t>
-      </w:r>
-      <w:proofErr w:type="spellStart"/>
-      <w:r>
-        <w:rPr>
-          <w:rFonts w:ascii="Segoe UI" w:eastAsia="Times New Roman" w:hAnsi="Segoe UI" w:cs="Segoe UI"/>
-          <w:kern w:val="0"/>
-          <w:sz w:val="21"/>
-          <w:szCs w:val="21"/>
-          <w:lang w:val="fr-FR" w:eastAsia="fr-GA"/>
-          <w14:ligatures w14:val="none"/>
-        </w:rPr>
-        <w:t>name</w:t>
-      </w:r>
-      <w:proofErr w:type="spellEnd"/>
+        <w:t>_name</w:t>
+      </w:r>
     </w:p>
     <w:p>
       <w:pPr>
@@ -2060,8 +949,6 @@
           <w14:ligatures w14:val="none"/>
         </w:rPr>
       </w:pPr>
-      <w:proofErr w:type="spellStart"/>
-      <w:proofErr w:type="gramStart"/>
       <w:r>
         <w:rPr>
           <w:rFonts w:ascii="Segoe UI" w:eastAsia="Times New Roman" w:hAnsi="Segoe UI" w:cs="Segoe UI"/>
@@ -2071,21 +958,8 @@
           <w:lang w:val="fr-FR" w:eastAsia="fr-GA"/>
           <w14:ligatures w14:val="none"/>
         </w:rPr>
-        <w:t>country</w:t>
-      </w:r>
-      <w:proofErr w:type="gramEnd"/>
-      <w:r>
-        <w:rPr>
-          <w:rFonts w:ascii="Segoe UI" w:eastAsia="Times New Roman" w:hAnsi="Segoe UI" w:cs="Segoe UI"/>
-          <w:kern w:val="0"/>
-          <w:sz w:val="21"/>
-          <w:szCs w:val="21"/>
-          <w:lang w:val="fr-FR" w:eastAsia="fr-GA"/>
-          <w14:ligatures w14:val="none"/>
-        </w:rPr>
-        <w:t>_code</w:t>
-      </w:r>
-      <w:proofErr w:type="spellEnd"/>
+        <w:t>country_code</w:t>
+      </w:r>
     </w:p>
     <w:p>
       <w:pPr>
@@ -2104,7 +978,6 @@
           <w14:ligatures w14:val="none"/>
         </w:rPr>
       </w:pPr>
-      <w:proofErr w:type="gramStart"/>
       <w:r>
         <w:rPr>
           <w:rFonts w:ascii="Segoe UI" w:eastAsia="Times New Roman" w:hAnsi="Segoe UI" w:cs="Segoe UI"/>
@@ -2116,7 +989,6 @@
         </w:rPr>
         <w:t>city</w:t>
       </w:r>
-      <w:proofErr w:type="gramEnd"/>
     </w:p>
     <w:p>
       <w:pPr>
@@ -2135,8 +1007,6 @@
           <w14:ligatures w14:val="none"/>
         </w:rPr>
       </w:pPr>
-      <w:proofErr w:type="spellStart"/>
-      <w:proofErr w:type="gramStart"/>
       <w:r>
         <w:rPr>
           <w:rFonts w:ascii="Segoe UI" w:eastAsia="Times New Roman" w:hAnsi="Segoe UI" w:cs="Segoe UI"/>
@@ -2148,8 +1018,6 @@
         </w:rPr>
         <w:t>timezone</w:t>
       </w:r>
-      <w:proofErr w:type="spellEnd"/>
-      <w:proofErr w:type="gramEnd"/>
     </w:p>
     <w:p>
       <w:pPr>
@@ -2168,8 +1036,6 @@
           <w14:ligatures w14:val="none"/>
         </w:rPr>
       </w:pPr>
-      <w:proofErr w:type="spellStart"/>
-      <w:proofErr w:type="gramStart"/>
       <w:r>
         <w:rPr>
           <w:rFonts w:ascii="Segoe UI" w:eastAsia="Times New Roman" w:hAnsi="Segoe UI" w:cs="Segoe UI"/>
@@ -2181,8 +1047,6 @@
         </w:rPr>
         <w:t>lat</w:t>
       </w:r>
-      <w:proofErr w:type="spellEnd"/>
-      <w:proofErr w:type="gramEnd"/>
     </w:p>
     <w:p>
       <w:pPr>
@@ -2201,8 +1065,6 @@
           <w14:ligatures w14:val="none"/>
         </w:rPr>
       </w:pPr>
-      <w:proofErr w:type="spellStart"/>
-      <w:proofErr w:type="gramStart"/>
       <w:r>
         <w:rPr>
           <w:rFonts w:ascii="Segoe UI" w:eastAsia="Times New Roman" w:hAnsi="Segoe UI" w:cs="Segoe UI"/>
@@ -2214,8 +1076,6 @@
         </w:rPr>
         <w:t>lon</w:t>
       </w:r>
-      <w:proofErr w:type="spellEnd"/>
-      <w:proofErr w:type="gramEnd"/>
     </w:p>
     <w:p>
       <w:pPr>
@@ -2399,22 +1259,12 @@
                 <w:lang w:val="fr-FR" w:eastAsia="fr-GA"/>
               </w:rPr>
             </w:pPr>
-            <w:proofErr w:type="spellStart"/>
-            <w:proofErr w:type="gramStart"/>
-            <w:r>
-              <w:rPr>
-                <w:lang w:val="fr-FR" w:eastAsia="fr-GA"/>
-              </w:rPr>
-              <w:t>weather</w:t>
-            </w:r>
-            <w:proofErr w:type="gramEnd"/>
-            <w:r>
-              <w:rPr>
-                <w:lang w:val="fr-FR" w:eastAsia="fr-GA"/>
-              </w:rPr>
-              <w:t>_id</w:t>
-            </w:r>
-            <w:proofErr w:type="spellEnd"/>
+            <w:r>
+              <w:rPr>
+                <w:lang w:val="fr-FR" w:eastAsia="fr-GA"/>
+              </w:rPr>
+              <w:t>weather_id</w:t>
+            </w:r>
           </w:p>
         </w:tc>
         <w:tc>
@@ -2448,10 +1298,7 @@
               </w:rPr>
             </w:pPr>
             <w:r>
-              <w:rPr>
-                <w:lang w:val="fr-FR" w:eastAsia="fr-GA"/>
-              </w:rPr>
-              <w:t>INTEGER</w:t>
+              <w:t>SERIAL</w:t>
             </w:r>
           </w:p>
         </w:tc>
@@ -2479,19 +1326,11 @@
                 <w:lang w:val="fr-FR" w:eastAsia="fr-GA"/>
               </w:rPr>
             </w:pPr>
-            <w:proofErr w:type="spellStart"/>
-            <w:r>
-              <w:rPr>
-                <w:lang w:val="fr-FR" w:eastAsia="fr-GA"/>
-              </w:rPr>
-              <w:t>Obl</w:t>
-            </w:r>
-            <w:proofErr w:type="spellEnd"/>
-            <w:r>
-              <w:rPr>
-                <w:lang w:val="fr-FR" w:eastAsia="fr-GA"/>
-              </w:rPr>
-              <w:t>., unique</w:t>
+            <w:r>
+              <w:rPr>
+                <w:lang w:val="fr-FR" w:eastAsia="fr-GA"/>
+              </w:rPr>
+              <w:t>Obl., unique</w:t>
             </w:r>
           </w:p>
         </w:tc>
@@ -2508,14 +1347,12 @@
                 <w:lang w:val="fr-FR" w:eastAsia="fr-GA"/>
               </w:rPr>
             </w:pPr>
-            <w:proofErr w:type="gramStart"/>
             <w:r>
               <w:rPr>
                 <w:lang w:val="fr-FR" w:eastAsia="fr-GA"/>
               </w:rPr>
               <w:t>main</w:t>
             </w:r>
-            <w:proofErr w:type="gramEnd"/>
           </w:p>
         </w:tc>
         <w:tc>
@@ -2586,39 +1423,11 @@
                 <w:lang w:val="fr-FR" w:eastAsia="fr-GA"/>
               </w:rPr>
             </w:pPr>
-            <w:proofErr w:type="spellStart"/>
-            <w:r>
-              <w:rPr>
-                <w:lang w:val="fr-FR" w:eastAsia="fr-GA"/>
-              </w:rPr>
-              <w:t>Obl</w:t>
-            </w:r>
-            <w:proofErr w:type="spellEnd"/>
-            <w:r>
-              <w:rPr>
-                <w:lang w:val="fr-FR" w:eastAsia="fr-GA"/>
-              </w:rPr>
-              <w:t>.</w:t>
-            </w:r>
-            <w:r>
-              <w:rPr>
-                <w:lang w:val="fr-FR" w:eastAsia="fr-GA"/>
-              </w:rPr>
-              <w:t xml:space="preserve">, Rain, Snow, </w:t>
-            </w:r>
-            <w:proofErr w:type="spellStart"/>
-            <w:r>
-              <w:rPr>
-                <w:lang w:val="fr-FR" w:eastAsia="fr-GA"/>
-              </w:rPr>
-              <w:t>Clouds</w:t>
-            </w:r>
-            <w:proofErr w:type="spellEnd"/>
-            <w:r>
-              <w:rPr>
-                <w:lang w:val="fr-FR" w:eastAsia="fr-GA"/>
-              </w:rPr>
-              <w:t>, etc.</w:t>
+            <w:r>
+              <w:rPr>
+                <w:lang w:val="fr-FR" w:eastAsia="fr-GA"/>
+              </w:rPr>
+              <w:t>Obl., Rain, Snow, Clouds, etc.</w:t>
             </w:r>
           </w:p>
         </w:tc>
@@ -2638,14 +1447,12 @@
                 <w:lang w:val="fr-FR" w:eastAsia="fr-GA"/>
               </w:rPr>
             </w:pPr>
-            <w:proofErr w:type="gramStart"/>
             <w:r>
               <w:rPr>
                 <w:lang w:val="fr-FR" w:eastAsia="fr-GA"/>
               </w:rPr>
               <w:t>description</w:t>
             </w:r>
-            <w:proofErr w:type="gramEnd"/>
           </w:p>
         </w:tc>
         <w:tc>
@@ -2710,19 +1517,11 @@
                 <w:lang w:val="fr-FR" w:eastAsia="fr-GA"/>
               </w:rPr>
             </w:pPr>
-            <w:proofErr w:type="spellStart"/>
-            <w:r>
-              <w:rPr>
-                <w:lang w:val="fr-FR" w:eastAsia="fr-GA"/>
-              </w:rPr>
-              <w:t>Obl</w:t>
-            </w:r>
-            <w:proofErr w:type="spellEnd"/>
-            <w:r>
-              <w:rPr>
-                <w:lang w:val="fr-FR" w:eastAsia="fr-GA"/>
-              </w:rPr>
-              <w:t>.</w:t>
+            <w:r>
+              <w:rPr>
+                <w:lang w:val="fr-FR" w:eastAsia="fr-GA"/>
+              </w:rPr>
+              <w:t>Obl.</w:t>
             </w:r>
           </w:p>
         </w:tc>
@@ -2739,14 +1538,12 @@
                 <w:lang w:val="fr-FR" w:eastAsia="fr-GA"/>
               </w:rPr>
             </w:pPr>
-            <w:proofErr w:type="gramStart"/>
             <w:r>
               <w:rPr>
                 <w:lang w:val="fr-FR" w:eastAsia="fr-GA"/>
               </w:rPr>
               <w:t>temp</w:t>
             </w:r>
-            <w:proofErr w:type="gramEnd"/>
           </w:p>
         </w:tc>
         <w:tc>
@@ -2811,25 +1608,11 @@
                 <w:lang w:val="fr-FR" w:eastAsia="fr-GA"/>
               </w:rPr>
             </w:pPr>
-            <w:proofErr w:type="spellStart"/>
-            <w:r>
-              <w:rPr>
-                <w:lang w:val="fr-FR" w:eastAsia="fr-GA"/>
-              </w:rPr>
-              <w:t>Obl</w:t>
-            </w:r>
-            <w:proofErr w:type="spellEnd"/>
-            <w:r>
-              <w:rPr>
-                <w:lang w:val="fr-FR" w:eastAsia="fr-GA"/>
-              </w:rPr>
-              <w:t>.</w:t>
-            </w:r>
-            <w:r>
-              <w:rPr>
-                <w:lang w:val="fr-FR" w:eastAsia="fr-GA"/>
-              </w:rPr>
-              <w:t xml:space="preserve">, </w:t>
+            <w:r>
+              <w:rPr>
+                <w:lang w:val="fr-FR" w:eastAsia="fr-GA"/>
+              </w:rPr>
+              <w:t xml:space="preserve">Obl., </w:t>
             </w:r>
             <w:r>
               <w:rPr>
@@ -2861,22 +1644,12 @@
                 <w:lang w:val="fr-FR" w:eastAsia="fr-GA"/>
               </w:rPr>
             </w:pPr>
-            <w:proofErr w:type="spellStart"/>
-            <w:proofErr w:type="gramStart"/>
-            <w:r>
-              <w:rPr>
-                <w:lang w:val="fr-FR" w:eastAsia="fr-GA"/>
-              </w:rPr>
-              <w:t>feels</w:t>
-            </w:r>
-            <w:proofErr w:type="gramEnd"/>
-            <w:r>
-              <w:rPr>
-                <w:lang w:val="fr-FR" w:eastAsia="fr-GA"/>
-              </w:rPr>
-              <w:t>_like</w:t>
-            </w:r>
-            <w:proofErr w:type="spellEnd"/>
+            <w:r>
+              <w:rPr>
+                <w:lang w:val="fr-FR" w:eastAsia="fr-GA"/>
+              </w:rPr>
+              <w:t>feels_like</w:t>
+            </w:r>
           </w:p>
         </w:tc>
         <w:tc>
@@ -2941,19 +1714,11 @@
                 <w:lang w:val="fr-FR" w:eastAsia="fr-GA"/>
               </w:rPr>
             </w:pPr>
-            <w:proofErr w:type="spellStart"/>
-            <w:r>
-              <w:rPr>
-                <w:lang w:val="fr-FR" w:eastAsia="fr-GA"/>
-              </w:rPr>
-              <w:t>Obl</w:t>
-            </w:r>
-            <w:proofErr w:type="spellEnd"/>
-            <w:r>
-              <w:rPr>
-                <w:lang w:val="fr-FR" w:eastAsia="fr-GA"/>
-              </w:rPr>
-              <w:t>.</w:t>
+            <w:r>
+              <w:rPr>
+                <w:lang w:val="fr-FR" w:eastAsia="fr-GA"/>
+              </w:rPr>
+              <w:t>Obl.</w:t>
             </w:r>
           </w:p>
         </w:tc>
@@ -2970,22 +1735,12 @@
                 <w:lang w:val="fr-FR" w:eastAsia="fr-GA"/>
               </w:rPr>
             </w:pPr>
-            <w:proofErr w:type="spellStart"/>
-            <w:proofErr w:type="gramStart"/>
-            <w:r>
-              <w:rPr>
-                <w:lang w:val="fr-FR" w:eastAsia="fr-GA"/>
-              </w:rPr>
-              <w:t>temp</w:t>
-            </w:r>
-            <w:proofErr w:type="gramEnd"/>
-            <w:r>
-              <w:rPr>
-                <w:lang w:val="fr-FR" w:eastAsia="fr-GA"/>
-              </w:rPr>
-              <w:t>_min</w:t>
-            </w:r>
-            <w:proofErr w:type="spellEnd"/>
+            <w:r>
+              <w:rPr>
+                <w:lang w:val="fr-FR" w:eastAsia="fr-GA"/>
+              </w:rPr>
+              <w:t>temp_min</w:t>
+            </w:r>
           </w:p>
         </w:tc>
         <w:tc>
@@ -3050,19 +1805,11 @@
                 <w:lang w:val="fr-FR" w:eastAsia="fr-GA"/>
               </w:rPr>
             </w:pPr>
-            <w:proofErr w:type="spellStart"/>
-            <w:r>
-              <w:rPr>
-                <w:lang w:val="fr-FR" w:eastAsia="fr-GA"/>
-              </w:rPr>
-              <w:t>Obl</w:t>
-            </w:r>
-            <w:proofErr w:type="spellEnd"/>
-            <w:r>
-              <w:rPr>
-                <w:lang w:val="fr-FR" w:eastAsia="fr-GA"/>
-              </w:rPr>
-              <w:t>.</w:t>
+            <w:r>
+              <w:rPr>
+                <w:lang w:val="fr-FR" w:eastAsia="fr-GA"/>
+              </w:rPr>
+              <w:t>Obl.</w:t>
             </w:r>
           </w:p>
         </w:tc>
@@ -3082,22 +1829,12 @@
                 <w:lang w:val="fr-FR" w:eastAsia="fr-GA"/>
               </w:rPr>
             </w:pPr>
-            <w:proofErr w:type="spellStart"/>
-            <w:proofErr w:type="gramStart"/>
-            <w:r>
-              <w:rPr>
-                <w:lang w:val="fr-FR" w:eastAsia="fr-GA"/>
-              </w:rPr>
-              <w:t>temp</w:t>
-            </w:r>
-            <w:proofErr w:type="gramEnd"/>
-            <w:r>
-              <w:rPr>
-                <w:lang w:val="fr-FR" w:eastAsia="fr-GA"/>
-              </w:rPr>
-              <w:t>_max</w:t>
-            </w:r>
-            <w:proofErr w:type="spellEnd"/>
+            <w:r>
+              <w:rPr>
+                <w:lang w:val="fr-FR" w:eastAsia="fr-GA"/>
+              </w:rPr>
+              <w:t>temp_max</w:t>
+            </w:r>
           </w:p>
         </w:tc>
         <w:tc>
@@ -3162,19 +1899,11 @@
                 <w:lang w:val="fr-FR" w:eastAsia="fr-GA"/>
               </w:rPr>
             </w:pPr>
-            <w:proofErr w:type="spellStart"/>
-            <w:r>
-              <w:rPr>
-                <w:lang w:val="fr-FR" w:eastAsia="fr-GA"/>
-              </w:rPr>
-              <w:t>Obl</w:t>
-            </w:r>
-            <w:proofErr w:type="spellEnd"/>
-            <w:r>
-              <w:rPr>
-                <w:lang w:val="fr-FR" w:eastAsia="fr-GA"/>
-              </w:rPr>
-              <w:t>.</w:t>
+            <w:r>
+              <w:rPr>
+                <w:lang w:val="fr-FR" w:eastAsia="fr-GA"/>
+              </w:rPr>
+              <w:t>Obl.</w:t>
             </w:r>
           </w:p>
         </w:tc>
@@ -3191,14 +1920,12 @@
                 <w:lang w:val="fr-FR" w:eastAsia="fr-GA"/>
               </w:rPr>
             </w:pPr>
-            <w:proofErr w:type="gramStart"/>
             <w:r>
               <w:rPr>
                 <w:lang w:val="fr-FR" w:eastAsia="fr-GA"/>
               </w:rPr>
               <w:t>pressure</w:t>
             </w:r>
-            <w:proofErr w:type="gramEnd"/>
           </w:p>
         </w:tc>
         <w:tc>
@@ -3263,37 +1990,17 @@
                 <w:lang w:val="fr-FR" w:eastAsia="fr-GA"/>
               </w:rPr>
             </w:pPr>
-            <w:proofErr w:type="spellStart"/>
-            <w:r>
-              <w:rPr>
-                <w:lang w:val="fr-FR" w:eastAsia="fr-GA"/>
-              </w:rPr>
-              <w:t>Obl</w:t>
-            </w:r>
-            <w:proofErr w:type="spellEnd"/>
-            <w:r>
-              <w:rPr>
-                <w:lang w:val="fr-FR" w:eastAsia="fr-GA"/>
-              </w:rPr>
-              <w:t>.</w:t>
-            </w:r>
-            <w:r>
-              <w:rPr>
-                <w:lang w:val="fr-FR" w:eastAsia="fr-GA"/>
-              </w:rPr>
-              <w:t xml:space="preserve">, </w:t>
-            </w:r>
-            <w:r>
-              <w:rPr>
-                <w:lang w:val="fr-FR" w:eastAsia="fr-GA"/>
-              </w:rPr>
-              <w:t xml:space="preserve">unité = </w:t>
-            </w:r>
-            <w:r>
-              <w:rPr>
-                <w:lang w:val="fr-FR" w:eastAsia="fr-GA"/>
-              </w:rPr>
-              <w:t>hPa</w:t>
+            <w:r>
+              <w:rPr>
+                <w:lang w:val="fr-FR" w:eastAsia="fr-GA"/>
+              </w:rPr>
+              <w:t>Obl.</w:t>
+            </w:r>
+            <w:r>
+              <w:rPr>
+                <w:lang w:val="fr-FR" w:eastAsia="fr-GA"/>
+              </w:rPr>
+              <w:t>, unité = hPa</w:t>
             </w:r>
           </w:p>
         </w:tc>
@@ -3313,16 +2020,12 @@
                 <w:lang w:val="fr-FR" w:eastAsia="fr-GA"/>
               </w:rPr>
             </w:pPr>
-            <w:proofErr w:type="spellStart"/>
-            <w:proofErr w:type="gramStart"/>
             <w:r>
               <w:rPr>
                 <w:lang w:val="fr-FR" w:eastAsia="fr-GA"/>
               </w:rPr>
               <w:t>humidity</w:t>
             </w:r>
-            <w:proofErr w:type="spellEnd"/>
-            <w:proofErr w:type="gramEnd"/>
           </w:p>
         </w:tc>
         <w:tc>
@@ -3387,19 +2090,11 @@
                 <w:lang w:val="fr-FR" w:eastAsia="fr-GA"/>
               </w:rPr>
             </w:pPr>
-            <w:proofErr w:type="spellStart"/>
-            <w:r>
-              <w:rPr>
-                <w:lang w:val="fr-FR" w:eastAsia="fr-GA"/>
-              </w:rPr>
-              <w:t>Obl</w:t>
-            </w:r>
-            <w:proofErr w:type="spellEnd"/>
-            <w:r>
-              <w:rPr>
-                <w:lang w:val="fr-FR" w:eastAsia="fr-GA"/>
-              </w:rPr>
-              <w:t>.</w:t>
+            <w:r>
+              <w:rPr>
+                <w:lang w:val="fr-FR" w:eastAsia="fr-GA"/>
+              </w:rPr>
+              <w:t>Obl.</w:t>
             </w:r>
           </w:p>
         </w:tc>
@@ -3418,16 +2113,12 @@
                 <w:lang w:val="fr-FR" w:eastAsia="fr-GA"/>
               </w:rPr>
             </w:pPr>
-            <w:proofErr w:type="spellStart"/>
-            <w:proofErr w:type="gramStart"/>
             <w:r>
               <w:rPr>
                 <w:lang w:val="fr-FR" w:eastAsia="fr-GA"/>
               </w:rPr>
               <w:t>visibility</w:t>
             </w:r>
-            <w:proofErr w:type="spellEnd"/>
-            <w:proofErr w:type="gramEnd"/>
           </w:p>
         </w:tc>
         <w:tc>
@@ -3492,25 +2183,11 @@
                 <w:lang w:val="fr-FR" w:eastAsia="fr-GA"/>
               </w:rPr>
             </w:pPr>
-            <w:proofErr w:type="spellStart"/>
-            <w:r>
-              <w:rPr>
-                <w:lang w:val="fr-FR" w:eastAsia="fr-GA"/>
-              </w:rPr>
-              <w:t>Obl</w:t>
-            </w:r>
-            <w:proofErr w:type="spellEnd"/>
-            <w:r>
-              <w:rPr>
-                <w:lang w:val="fr-FR" w:eastAsia="fr-GA"/>
-              </w:rPr>
-              <w:t>.</w:t>
-            </w:r>
-            <w:r>
-              <w:rPr>
-                <w:lang w:val="fr-FR" w:eastAsia="fr-GA"/>
-              </w:rPr>
-              <w:t xml:space="preserve">, </w:t>
+            <w:r>
+              <w:rPr>
+                <w:lang w:val="fr-FR" w:eastAsia="fr-GA"/>
+              </w:rPr>
+              <w:t xml:space="preserve">Obl., </w:t>
             </w:r>
             <w:r>
               <w:rPr>
@@ -3542,22 +2219,12 @@
                 <w:lang w:val="fr-FR" w:eastAsia="fr-GA"/>
               </w:rPr>
             </w:pPr>
-            <w:proofErr w:type="spellStart"/>
-            <w:proofErr w:type="gramStart"/>
-            <w:r>
-              <w:rPr>
-                <w:lang w:val="fr-FR" w:eastAsia="fr-GA"/>
-              </w:rPr>
-              <w:t>wind</w:t>
-            </w:r>
-            <w:proofErr w:type="gramEnd"/>
-            <w:r>
-              <w:rPr>
-                <w:lang w:val="fr-FR" w:eastAsia="fr-GA"/>
-              </w:rPr>
-              <w:t>_speed</w:t>
-            </w:r>
-            <w:proofErr w:type="spellEnd"/>
+            <w:r>
+              <w:rPr>
+                <w:lang w:val="fr-FR" w:eastAsia="fr-GA"/>
+              </w:rPr>
+              <w:t>wind_speed</w:t>
+            </w:r>
           </w:p>
         </w:tc>
         <w:tc>
@@ -3622,19 +2289,11 @@
                 <w:lang w:val="fr-FR" w:eastAsia="fr-GA"/>
               </w:rPr>
             </w:pPr>
-            <w:proofErr w:type="spellStart"/>
-            <w:r>
-              <w:rPr>
-                <w:lang w:val="fr-FR" w:eastAsia="fr-GA"/>
-              </w:rPr>
-              <w:t>Obl</w:t>
-            </w:r>
-            <w:proofErr w:type="spellEnd"/>
-            <w:r>
-              <w:rPr>
-                <w:lang w:val="fr-FR" w:eastAsia="fr-GA"/>
-              </w:rPr>
-              <w:t>.</w:t>
+            <w:r>
+              <w:rPr>
+                <w:lang w:val="fr-FR" w:eastAsia="fr-GA"/>
+              </w:rPr>
+              <w:t>Obl.</w:t>
             </w:r>
           </w:p>
         </w:tc>
@@ -3651,16 +2310,12 @@
                 <w:lang w:val="fr-FR" w:eastAsia="fr-GA"/>
               </w:rPr>
             </w:pPr>
-            <w:proofErr w:type="spellStart"/>
-            <w:proofErr w:type="gramStart"/>
             <w:r>
               <w:rPr>
                 <w:lang w:val="fr-FR" w:eastAsia="fr-GA"/>
               </w:rPr>
               <w:t>clouds</w:t>
             </w:r>
-            <w:proofErr w:type="spellEnd"/>
-            <w:proofErr w:type="gramEnd"/>
           </w:p>
         </w:tc>
         <w:tc>
@@ -3725,19 +2380,11 @@
                 <w:lang w:val="fr-FR" w:eastAsia="fr-GA"/>
               </w:rPr>
             </w:pPr>
-            <w:proofErr w:type="spellStart"/>
-            <w:r>
-              <w:rPr>
-                <w:lang w:val="fr-FR" w:eastAsia="fr-GA"/>
-              </w:rPr>
-              <w:t>Obl</w:t>
-            </w:r>
-            <w:proofErr w:type="spellEnd"/>
-            <w:r>
-              <w:rPr>
-                <w:lang w:val="fr-FR" w:eastAsia="fr-GA"/>
-              </w:rPr>
-              <w:t>.</w:t>
+            <w:r>
+              <w:rPr>
+                <w:lang w:val="fr-FR" w:eastAsia="fr-GA"/>
+              </w:rPr>
+              <w:t>Obl.</w:t>
             </w:r>
           </w:p>
         </w:tc>
@@ -3757,16 +2404,12 @@
                 <w:lang w:val="fr-FR" w:eastAsia="fr-GA"/>
               </w:rPr>
             </w:pPr>
-            <w:proofErr w:type="spellStart"/>
-            <w:proofErr w:type="gramStart"/>
             <w:r>
               <w:rPr>
                 <w:lang w:val="fr-FR" w:eastAsia="fr-GA"/>
               </w:rPr>
               <w:t>rain</w:t>
             </w:r>
-            <w:proofErr w:type="spellEnd"/>
-            <w:proofErr w:type="gramEnd"/>
           </w:p>
         </w:tc>
         <w:tc>
@@ -3864,16 +2507,12 @@
                 <w:lang w:val="fr-FR" w:eastAsia="fr-GA"/>
               </w:rPr>
             </w:pPr>
-            <w:proofErr w:type="spellStart"/>
-            <w:proofErr w:type="gramStart"/>
             <w:r>
               <w:rPr>
                 <w:lang w:val="fr-FR" w:eastAsia="fr-GA"/>
               </w:rPr>
               <w:t>snow</w:t>
             </w:r>
-            <w:proofErr w:type="spellEnd"/>
-            <w:proofErr w:type="gramEnd"/>
           </w:p>
         </w:tc>
         <w:tc>
@@ -3974,22 +2613,12 @@
                 <w:lang w:val="fr-FR" w:eastAsia="fr-GA"/>
               </w:rPr>
             </w:pPr>
-            <w:proofErr w:type="spellStart"/>
-            <w:proofErr w:type="gramStart"/>
-            <w:r>
-              <w:rPr>
-                <w:lang w:val="fr-FR" w:eastAsia="fr-GA"/>
-              </w:rPr>
-              <w:t>observation</w:t>
-            </w:r>
-            <w:proofErr w:type="gramEnd"/>
-            <w:r>
-              <w:rPr>
-                <w:lang w:val="fr-FR" w:eastAsia="fr-GA"/>
-              </w:rPr>
-              <w:t>_time</w:t>
-            </w:r>
-            <w:proofErr w:type="spellEnd"/>
+            <w:r>
+              <w:rPr>
+                <w:lang w:val="fr-FR" w:eastAsia="fr-GA"/>
+              </w:rPr>
+              <w:t>observation_time</w:t>
+            </w:r>
           </w:p>
         </w:tc>
         <w:tc>
@@ -4075,16 +2704,12 @@
                 <w:lang w:val="fr-FR" w:eastAsia="fr-GA"/>
               </w:rPr>
             </w:pPr>
-            <w:proofErr w:type="spellStart"/>
-            <w:proofErr w:type="gramStart"/>
             <w:r>
               <w:rPr>
                 <w:lang w:val="fr-FR" w:eastAsia="fr-GA"/>
               </w:rPr>
               <w:t>sunrise</w:t>
             </w:r>
-            <w:proofErr w:type="spellEnd"/>
-            <w:proofErr w:type="gramEnd"/>
           </w:p>
         </w:tc>
         <w:tc>
@@ -4149,19 +2774,11 @@
                 <w:lang w:val="fr-FR" w:eastAsia="fr-GA"/>
               </w:rPr>
             </w:pPr>
-            <w:proofErr w:type="spellStart"/>
-            <w:r>
-              <w:rPr>
-                <w:lang w:val="fr-FR" w:eastAsia="fr-GA"/>
-              </w:rPr>
-              <w:t>Obl</w:t>
-            </w:r>
-            <w:proofErr w:type="spellEnd"/>
-            <w:r>
-              <w:rPr>
-                <w:lang w:val="fr-FR" w:eastAsia="fr-GA"/>
-              </w:rPr>
-              <w:t>.</w:t>
+            <w:r>
+              <w:rPr>
+                <w:lang w:val="fr-FR" w:eastAsia="fr-GA"/>
+              </w:rPr>
+              <w:t>Obl.</w:t>
             </w:r>
           </w:p>
         </w:tc>
@@ -4181,16 +2798,12 @@
                 <w:lang w:val="fr-FR" w:eastAsia="fr-GA"/>
               </w:rPr>
             </w:pPr>
-            <w:proofErr w:type="spellStart"/>
-            <w:proofErr w:type="gramStart"/>
             <w:r>
               <w:rPr>
                 <w:lang w:val="fr-FR" w:eastAsia="fr-GA"/>
               </w:rPr>
               <w:t>sunset</w:t>
             </w:r>
-            <w:proofErr w:type="spellEnd"/>
-            <w:proofErr w:type="gramEnd"/>
           </w:p>
         </w:tc>
         <w:tc>
@@ -4255,19 +2868,11 @@
                 <w:lang w:val="fr-FR" w:eastAsia="fr-GA"/>
               </w:rPr>
             </w:pPr>
-            <w:proofErr w:type="spellStart"/>
-            <w:r>
-              <w:rPr>
-                <w:lang w:val="fr-FR" w:eastAsia="fr-GA"/>
-              </w:rPr>
-              <w:t>Obl</w:t>
-            </w:r>
-            <w:proofErr w:type="spellEnd"/>
-            <w:r>
-              <w:rPr>
-                <w:lang w:val="fr-FR" w:eastAsia="fr-GA"/>
-              </w:rPr>
-              <w:t>.</w:t>
+            <w:r>
+              <w:rPr>
+                <w:lang w:val="fr-FR" w:eastAsia="fr-GA"/>
+              </w:rPr>
+              <w:t>Obl.</w:t>
             </w:r>
           </w:p>
         </w:tc>
@@ -4284,22 +2889,12 @@
                 <w:lang w:val="fr-FR" w:eastAsia="fr-GA"/>
               </w:rPr>
             </w:pPr>
-            <w:proofErr w:type="spellStart"/>
-            <w:proofErr w:type="gramStart"/>
-            <w:r>
-              <w:rPr>
-                <w:lang w:val="fr-FR" w:eastAsia="fr-GA"/>
-              </w:rPr>
-              <w:t>location</w:t>
-            </w:r>
-            <w:proofErr w:type="gramEnd"/>
-            <w:r>
-              <w:rPr>
-                <w:lang w:val="fr-FR" w:eastAsia="fr-GA"/>
-              </w:rPr>
-              <w:t>_id</w:t>
-            </w:r>
-            <w:proofErr w:type="spellEnd"/>
+            <w:r>
+              <w:rPr>
+                <w:lang w:val="fr-FR" w:eastAsia="fr-GA"/>
+              </w:rPr>
+              <w:t>location_id</w:t>
+            </w:r>
           </w:p>
         </w:tc>
         <w:tc>
@@ -4333,10 +2928,7 @@
               </w:rPr>
             </w:pPr>
             <w:r>
-              <w:rPr>
-                <w:lang w:val="fr-FR" w:eastAsia="fr-GA"/>
-              </w:rPr>
-              <w:t>INTEGER</w:t>
+              <w:t>SERIAL</w:t>
             </w:r>
           </w:p>
         </w:tc>
@@ -4364,25 +2956,11 @@
                 <w:lang w:val="fr-FR" w:eastAsia="fr-GA"/>
               </w:rPr>
             </w:pPr>
-            <w:proofErr w:type="spellStart"/>
-            <w:r>
-              <w:rPr>
-                <w:lang w:val="fr-FR" w:eastAsia="fr-GA"/>
-              </w:rPr>
-              <w:t>Obl</w:t>
-            </w:r>
-            <w:proofErr w:type="spellEnd"/>
-            <w:r>
-              <w:rPr>
-                <w:lang w:val="fr-FR" w:eastAsia="fr-GA"/>
-              </w:rPr>
-              <w:t>.</w:t>
-            </w:r>
-            <w:r>
-              <w:rPr>
-                <w:lang w:val="fr-FR" w:eastAsia="fr-GA"/>
-              </w:rPr>
-              <w:t>, unique</w:t>
+            <w:r>
+              <w:rPr>
+                <w:lang w:val="fr-FR" w:eastAsia="fr-GA"/>
+              </w:rPr>
+              <w:t>Obl., unique</w:t>
             </w:r>
           </w:p>
         </w:tc>
@@ -4402,22 +2980,18 @@
                 <w:lang w:val="fr-FR" w:eastAsia="fr-GA"/>
               </w:rPr>
             </w:pPr>
-            <w:proofErr w:type="spellStart"/>
-            <w:proofErr w:type="gramStart"/>
             <w:r>
               <w:rPr>
                 <w:lang w:val="fr-FR" w:eastAsia="fr-GA"/>
               </w:rPr>
               <w:t>country</w:t>
             </w:r>
-            <w:proofErr w:type="gramEnd"/>
             <w:r>
               <w:rPr>
                 <w:lang w:val="fr-FR" w:eastAsia="fr-GA"/>
               </w:rPr>
               <w:t>_name</w:t>
             </w:r>
-            <w:proofErr w:type="spellEnd"/>
           </w:p>
         </w:tc>
         <w:tc>
@@ -4488,19 +3062,11 @@
                 <w:lang w:val="fr-FR" w:eastAsia="fr-GA"/>
               </w:rPr>
             </w:pPr>
-            <w:proofErr w:type="spellStart"/>
-            <w:r>
-              <w:rPr>
-                <w:lang w:val="fr-FR" w:eastAsia="fr-GA"/>
-              </w:rPr>
-              <w:t>Obl</w:t>
-            </w:r>
-            <w:proofErr w:type="spellEnd"/>
-            <w:r>
-              <w:rPr>
-                <w:lang w:val="fr-FR" w:eastAsia="fr-GA"/>
-              </w:rPr>
-              <w:t>.</w:t>
+            <w:r>
+              <w:rPr>
+                <w:lang w:val="fr-FR" w:eastAsia="fr-GA"/>
+              </w:rPr>
+              <w:t>Obl.</w:t>
             </w:r>
           </w:p>
         </w:tc>
@@ -4517,14 +3083,12 @@
                 <w:lang w:val="fr-FR" w:eastAsia="fr-GA"/>
               </w:rPr>
             </w:pPr>
-            <w:proofErr w:type="gramStart"/>
             <w:r>
               <w:rPr>
                 <w:lang w:val="fr-FR" w:eastAsia="fr-GA"/>
               </w:rPr>
               <w:t>city</w:t>
             </w:r>
-            <w:proofErr w:type="gramEnd"/>
           </w:p>
         </w:tc>
         <w:tc>
@@ -4595,19 +3159,11 @@
                 <w:lang w:val="fr-FR" w:eastAsia="fr-GA"/>
               </w:rPr>
             </w:pPr>
-            <w:proofErr w:type="spellStart"/>
-            <w:r>
-              <w:rPr>
-                <w:lang w:val="fr-FR" w:eastAsia="fr-GA"/>
-              </w:rPr>
-              <w:t>Obl</w:t>
-            </w:r>
-            <w:proofErr w:type="spellEnd"/>
-            <w:r>
-              <w:rPr>
-                <w:lang w:val="fr-FR" w:eastAsia="fr-GA"/>
-              </w:rPr>
-              <w:t>.</w:t>
+            <w:r>
+              <w:rPr>
+                <w:lang w:val="fr-FR" w:eastAsia="fr-GA"/>
+              </w:rPr>
+              <w:t>Obl.</w:t>
             </w:r>
           </w:p>
         </w:tc>
@@ -4627,22 +3183,12 @@
                 <w:lang w:val="fr-FR" w:eastAsia="fr-GA"/>
               </w:rPr>
             </w:pPr>
-            <w:proofErr w:type="spellStart"/>
-            <w:proofErr w:type="gramStart"/>
-            <w:r>
-              <w:rPr>
-                <w:lang w:val="fr-FR" w:eastAsia="fr-GA"/>
-              </w:rPr>
-              <w:t>country</w:t>
-            </w:r>
-            <w:proofErr w:type="gramEnd"/>
-            <w:r>
-              <w:rPr>
-                <w:lang w:val="fr-FR" w:eastAsia="fr-GA"/>
-              </w:rPr>
-              <w:t>_code</w:t>
-            </w:r>
-            <w:proofErr w:type="spellEnd"/>
+            <w:r>
+              <w:rPr>
+                <w:lang w:val="fr-FR" w:eastAsia="fr-GA"/>
+              </w:rPr>
+              <w:t>country_code</w:t>
+            </w:r>
           </w:p>
         </w:tc>
         <w:tc>
@@ -4713,19 +3259,11 @@
                 <w:lang w:val="fr-FR" w:eastAsia="fr-GA"/>
               </w:rPr>
             </w:pPr>
-            <w:proofErr w:type="spellStart"/>
-            <w:r>
-              <w:rPr>
-                <w:lang w:val="fr-FR" w:eastAsia="fr-GA"/>
-              </w:rPr>
-              <w:t>Obl</w:t>
-            </w:r>
-            <w:proofErr w:type="spellEnd"/>
-            <w:r>
-              <w:rPr>
-                <w:lang w:val="fr-FR" w:eastAsia="fr-GA"/>
-              </w:rPr>
-              <w:t>.</w:t>
+            <w:r>
+              <w:rPr>
+                <w:lang w:val="fr-FR" w:eastAsia="fr-GA"/>
+              </w:rPr>
+              <w:t>Obl.</w:t>
             </w:r>
           </w:p>
         </w:tc>
@@ -4742,16 +3280,12 @@
                 <w:lang w:val="fr-FR" w:eastAsia="fr-GA"/>
               </w:rPr>
             </w:pPr>
-            <w:proofErr w:type="spellStart"/>
-            <w:proofErr w:type="gramStart"/>
             <w:r>
               <w:rPr>
                 <w:lang w:val="fr-FR" w:eastAsia="fr-GA"/>
               </w:rPr>
               <w:t>timezone</w:t>
             </w:r>
-            <w:proofErr w:type="spellEnd"/>
-            <w:proofErr w:type="gramEnd"/>
           </w:p>
         </w:tc>
         <w:tc>
@@ -4816,19 +3350,11 @@
                 <w:lang w:val="fr-FR" w:eastAsia="fr-GA"/>
               </w:rPr>
             </w:pPr>
-            <w:proofErr w:type="spellStart"/>
-            <w:r>
-              <w:rPr>
-                <w:lang w:val="fr-FR" w:eastAsia="fr-GA"/>
-              </w:rPr>
-              <w:t>Obl</w:t>
-            </w:r>
-            <w:proofErr w:type="spellEnd"/>
-            <w:r>
-              <w:rPr>
-                <w:lang w:val="fr-FR" w:eastAsia="fr-GA"/>
-              </w:rPr>
-              <w:t>.</w:t>
+            <w:r>
+              <w:rPr>
+                <w:lang w:val="fr-FR" w:eastAsia="fr-GA"/>
+              </w:rPr>
+              <w:t>Obl.</w:t>
             </w:r>
           </w:p>
         </w:tc>
@@ -4848,16 +3374,12 @@
                 <w:lang w:val="fr-FR" w:eastAsia="fr-GA"/>
               </w:rPr>
             </w:pPr>
-            <w:proofErr w:type="spellStart"/>
-            <w:proofErr w:type="gramStart"/>
             <w:r>
               <w:rPr>
                 <w:lang w:val="fr-FR" w:eastAsia="fr-GA"/>
               </w:rPr>
               <w:t>lat</w:t>
             </w:r>
-            <w:proofErr w:type="spellEnd"/>
-            <w:proofErr w:type="gramEnd"/>
           </w:p>
         </w:tc>
         <w:tc>
@@ -4922,19 +3444,11 @@
                 <w:lang w:val="fr-FR" w:eastAsia="fr-GA"/>
               </w:rPr>
             </w:pPr>
-            <w:proofErr w:type="spellStart"/>
-            <w:r>
-              <w:rPr>
-                <w:lang w:val="fr-FR" w:eastAsia="fr-GA"/>
-              </w:rPr>
-              <w:t>Obl</w:t>
-            </w:r>
-            <w:proofErr w:type="spellEnd"/>
-            <w:r>
-              <w:rPr>
-                <w:lang w:val="fr-FR" w:eastAsia="fr-GA"/>
-              </w:rPr>
-              <w:t>.</w:t>
+            <w:r>
+              <w:rPr>
+                <w:lang w:val="fr-FR" w:eastAsia="fr-GA"/>
+              </w:rPr>
+              <w:t>Obl.</w:t>
             </w:r>
           </w:p>
         </w:tc>
@@ -4951,8 +3465,6 @@
                 <w:lang w:val="fr-FR" w:eastAsia="fr-GA"/>
               </w:rPr>
             </w:pPr>
-            <w:proofErr w:type="spellStart"/>
-            <w:proofErr w:type="gramStart"/>
             <w:r>
               <w:rPr>
                 <w:lang w:val="fr-FR" w:eastAsia="fr-GA"/>
@@ -4960,8 +3472,6 @@
               <w:lastRenderedPageBreak/>
               <w:t>lon</w:t>
             </w:r>
-            <w:proofErr w:type="spellEnd"/>
-            <w:proofErr w:type="gramEnd"/>
           </w:p>
         </w:tc>
         <w:tc>
@@ -5026,19 +3536,11 @@
                 <w:lang w:val="fr-FR" w:eastAsia="fr-GA"/>
               </w:rPr>
             </w:pPr>
-            <w:proofErr w:type="spellStart"/>
-            <w:r>
-              <w:rPr>
-                <w:lang w:val="fr-FR" w:eastAsia="fr-GA"/>
-              </w:rPr>
-              <w:t>Obl</w:t>
-            </w:r>
-            <w:proofErr w:type="spellEnd"/>
-            <w:r>
-              <w:rPr>
-                <w:lang w:val="fr-FR" w:eastAsia="fr-GA"/>
-              </w:rPr>
-              <w:t>.</w:t>
+            <w:r>
+              <w:rPr>
+                <w:lang w:val="fr-FR" w:eastAsia="fr-GA"/>
+              </w:rPr>
+              <w:t>Obl.</w:t>
             </w:r>
           </w:p>
         </w:tc>
@@ -5084,7 +3586,6 @@
         </w:rPr>
         <w:t xml:space="preserve"> (</w:t>
       </w:r>
-      <w:proofErr w:type="spellStart"/>
       <w:r>
         <w:rPr>
           <w:b/>
@@ -5101,7 +3602,6 @@
         </w:rPr>
         <w:t>_id</w:t>
       </w:r>
-      <w:proofErr w:type="spellEnd"/>
       <w:r>
         <w:rPr>
           <w:lang w:val="en-US" w:eastAsia="fr-GA"/>
@@ -5112,65 +3612,20 @@
         <w:rPr>
           <w:lang w:val="en-US" w:eastAsia="fr-GA"/>
         </w:rPr>
-        <w:t xml:space="preserve"> temp, </w:t>
-      </w:r>
-      <w:proofErr w:type="spellStart"/>
+        <w:t xml:space="preserve"> temp, feels_like, temp_min, temp_max, pressure, humidity, visibility, wind_speed, clouds, rain, snow, </w:t>
+      </w:r>
       <w:r>
         <w:rPr>
           <w:lang w:val="en-US" w:eastAsia="fr-GA"/>
         </w:rPr>
-        <w:t>feels_like</w:t>
-      </w:r>
-      <w:proofErr w:type="spellEnd"/>
+        <w:t>observation_time</w:t>
+      </w:r>
       <w:r>
         <w:rPr>
           <w:lang w:val="en-US" w:eastAsia="fr-GA"/>
         </w:rPr>
-        <w:t xml:space="preserve">, </w:t>
-      </w:r>
-      <w:proofErr w:type="spellStart"/>
-      <w:r>
-        <w:rPr>
-          <w:lang w:val="en-US" w:eastAsia="fr-GA"/>
-        </w:rPr>
-        <w:t>temp_min</w:t>
-      </w:r>
-      <w:proofErr w:type="spellEnd"/>
-      <w:r>
-        <w:rPr>
-          <w:lang w:val="en-US" w:eastAsia="fr-GA"/>
-        </w:rPr>
-        <w:t xml:space="preserve">, </w:t>
-      </w:r>
-      <w:proofErr w:type="spellStart"/>
-      <w:r>
-        <w:rPr>
-          <w:lang w:val="en-US" w:eastAsia="fr-GA"/>
-        </w:rPr>
-        <w:t>temp_max</w:t>
-      </w:r>
-      <w:proofErr w:type="spellEnd"/>
-      <w:r>
-        <w:rPr>
-          <w:lang w:val="en-US" w:eastAsia="fr-GA"/>
-        </w:rPr>
-        <w:t xml:space="preserve">, pressure, humidity, visibility, </w:t>
-      </w:r>
-      <w:proofErr w:type="spellStart"/>
-      <w:r>
-        <w:rPr>
-          <w:lang w:val="en-US" w:eastAsia="fr-GA"/>
-        </w:rPr>
-        <w:t>wind_speed</w:t>
-      </w:r>
-      <w:proofErr w:type="spellEnd"/>
-      <w:r>
-        <w:rPr>
-          <w:lang w:val="en-US" w:eastAsia="fr-GA"/>
-        </w:rPr>
-        <w:t xml:space="preserve">, clouds, rain, snow, date, sunrise, sunset, </w:t>
-      </w:r>
-      <w:proofErr w:type="spellStart"/>
+        <w:t xml:space="preserve">, sunrise, sunset, </w:t>
+      </w:r>
       <w:r>
         <w:rPr>
           <w:u w:val="single"/>
@@ -5178,7 +3633,6 @@
         </w:rPr>
         <w:t>location_id</w:t>
       </w:r>
-      <w:proofErr w:type="spellEnd"/>
       <w:r>
         <w:rPr>
           <w:lang w:val="en-US" w:eastAsia="fr-GA"/>
@@ -5199,7 +3653,6 @@
         </w:rPr>
         <w:t>Location (</w:t>
       </w:r>
-      <w:proofErr w:type="spellStart"/>
       <w:r>
         <w:rPr>
           <w:b/>
@@ -5208,95 +3661,42 @@
         </w:rPr>
         <w:t>location_id</w:t>
       </w:r>
-      <w:proofErr w:type="spellEnd"/>
       <w:r>
         <w:rPr>
           <w:lang w:val="en-US" w:eastAsia="fr-GA"/>
         </w:rPr>
-        <w:t xml:space="preserve">, </w:t>
-      </w:r>
-      <w:proofErr w:type="spellStart"/>
+        <w:t>, country</w:t>
+      </w:r>
       <w:r>
         <w:rPr>
           <w:lang w:val="en-US" w:eastAsia="fr-GA"/>
         </w:rPr>
-        <w:t>country</w:t>
+        <w:t>_name</w:t>
       </w:r>
       <w:r>
         <w:rPr>
           <w:lang w:val="en-US" w:eastAsia="fr-GA"/>
         </w:rPr>
-        <w:t>_name</w:t>
-      </w:r>
-      <w:proofErr w:type="spellEnd"/>
+        <w:t>, city,</w:t>
+      </w:r>
       <w:r>
         <w:rPr>
           <w:lang w:val="en-US" w:eastAsia="fr-GA"/>
         </w:rPr>
-        <w:t>, city,</w:t>
+        <w:t xml:space="preserve"> country_code,</w:t>
       </w:r>
       <w:r>
         <w:rPr>
           <w:lang w:val="en-US" w:eastAsia="fr-GA"/>
         </w:rPr>
-        <w:t xml:space="preserve"> </w:t>
-      </w:r>
-      <w:proofErr w:type="spellStart"/>
+        <w:t xml:space="preserve"> timezone</w:t>
+      </w:r>
       <w:r>
         <w:rPr>
           <w:lang w:val="en-US" w:eastAsia="fr-GA"/>
         </w:rPr>
-        <w:t>country_code</w:t>
-      </w:r>
-      <w:proofErr w:type="spellEnd"/>
-      <w:r>
-        <w:rPr>
-          <w:lang w:val="en-US" w:eastAsia="fr-GA"/>
-        </w:rPr>
-        <w:t>,</w:t>
-      </w:r>
-      <w:r>
-        <w:rPr>
-          <w:lang w:val="en-US" w:eastAsia="fr-GA"/>
-        </w:rPr>
-        <w:t xml:space="preserve"> </w:t>
-      </w:r>
-      <w:proofErr w:type="spellStart"/>
-      <w:r>
-        <w:rPr>
-          <w:lang w:val="en-US" w:eastAsia="fr-GA"/>
-        </w:rPr>
-        <w:t>timezone</w:t>
-      </w:r>
-      <w:proofErr w:type="spellEnd"/>
-      <w:r>
-        <w:rPr>
-          <w:lang w:val="en-US" w:eastAsia="fr-GA"/>
-        </w:rPr>
-        <w:t xml:space="preserve">, </w:t>
-      </w:r>
-      <w:proofErr w:type="spellStart"/>
-      <w:r>
-        <w:rPr>
-          <w:lang w:val="en-US" w:eastAsia="fr-GA"/>
-        </w:rPr>
-        <w:t>lat</w:t>
-      </w:r>
-      <w:proofErr w:type="spellEnd"/>
-      <w:r>
-        <w:rPr>
-          <w:lang w:val="en-US" w:eastAsia="fr-GA"/>
-        </w:rPr>
-        <w:t xml:space="preserve">, </w:t>
-      </w:r>
-      <w:proofErr w:type="spellStart"/>
-      <w:r>
-        <w:rPr>
-          <w:lang w:val="en-US" w:eastAsia="fr-GA"/>
-        </w:rPr>
-        <w:t>lon</w:t>
-      </w:r>
-      <w:proofErr w:type="spellEnd"/>
+        <w:t>, lat, lon</w:t>
+      </w:r>
       <w:r>
         <w:rPr>
           <w:lang w:val="en-US" w:eastAsia="fr-GA"/>

</xml_diff>

<commit_message>
Refactor OpenWeather API exploration notebook and enhance data handling
- Updated the exploration notebook to improve markdown descriptions and code organization.
- Added environment variable loading for API keys and database connection details.
- Implemented functions for data collection and transformation from JSON to DataFrame.
- Established database schema with tables for locations and weather data.
- Removed unused Untitled notebook.
- Updated SQL schema to reflect new table names and structure.
</commit_message>
<xml_diff>
--- a/docs/Schéma SQL.docx
+++ b/docs/Schéma SQL.docx
@@ -76,6 +76,7 @@
         </w:rPr>
         <w:t xml:space="preserve">Une entreprise dans le secteur du tourisme souhaite automatiser la collecte de données météo pour ses différentes destinations. Ces données sont collectées via l'API publique </w:t>
       </w:r>
+      <w:proofErr w:type="spellStart"/>
       <w:r>
         <w:rPr>
           <w:b/>
@@ -86,6 +87,7 @@
         </w:rPr>
         <w:t>OpenWeather</w:t>
       </w:r>
+      <w:proofErr w:type="spellEnd"/>
       <w:r>
         <w:rPr>
           <w:lang w:val="fr-FR"/>
@@ -161,16 +163,72 @@
           <w14:ligatures w14:val="none"/>
         </w:rPr>
       </w:pPr>
-      <w:r>
-        <w:rPr>
-          <w:rFonts w:ascii="Segoe UI" w:eastAsia="Times New Roman" w:hAnsi="Segoe UI" w:cs="Segoe UI"/>
-          <w:kern w:val="0"/>
-          <w:sz w:val="21"/>
-          <w:szCs w:val="21"/>
-          <w:lang w:eastAsia="fr-GA"/>
-          <w14:ligatures w14:val="none"/>
-        </w:rPr>
-        <w:t>"weather" contient une liste de clé-valeur dont les clés sont id, main, description, et icon;</w:t>
+      <w:commentRangeStart w:id="0"/>
+      <w:r>
+        <w:rPr>
+          <w:rFonts w:ascii="Segoe UI" w:eastAsia="Times New Roman" w:hAnsi="Segoe UI" w:cs="Segoe UI"/>
+          <w:kern w:val="0"/>
+          <w:sz w:val="21"/>
+          <w:szCs w:val="21"/>
+          <w:lang w:eastAsia="fr-GA"/>
+          <w14:ligatures w14:val="none"/>
+        </w:rPr>
+        <w:t>"</w:t>
+      </w:r>
+      <w:proofErr w:type="spellStart"/>
+      <w:r>
+        <w:rPr>
+          <w:rFonts w:ascii="Segoe UI" w:eastAsia="Times New Roman" w:hAnsi="Segoe UI" w:cs="Segoe UI"/>
+          <w:kern w:val="0"/>
+          <w:sz w:val="21"/>
+          <w:szCs w:val="21"/>
+          <w:lang w:eastAsia="fr-GA"/>
+          <w14:ligatures w14:val="none"/>
+        </w:rPr>
+        <w:t>weather</w:t>
+      </w:r>
+      <w:proofErr w:type="spellEnd"/>
+      <w:r>
+        <w:rPr>
+          <w:rFonts w:ascii="Segoe UI" w:eastAsia="Times New Roman" w:hAnsi="Segoe UI" w:cs="Segoe UI"/>
+          <w:kern w:val="0"/>
+          <w:sz w:val="21"/>
+          <w:szCs w:val="21"/>
+          <w:lang w:eastAsia="fr-GA"/>
+          <w14:ligatures w14:val="none"/>
+        </w:rPr>
+        <w:t xml:space="preserve">" contient une liste de clé-valeur dont les clés sont id, main, description, et </w:t>
+      </w:r>
+      <w:proofErr w:type="spellStart"/>
+      <w:r>
+        <w:rPr>
+          <w:rFonts w:ascii="Segoe UI" w:eastAsia="Times New Roman" w:hAnsi="Segoe UI" w:cs="Segoe UI"/>
+          <w:kern w:val="0"/>
+          <w:sz w:val="21"/>
+          <w:szCs w:val="21"/>
+          <w:lang w:eastAsia="fr-GA"/>
+          <w14:ligatures w14:val="none"/>
+        </w:rPr>
+        <w:t>icon</w:t>
+      </w:r>
+      <w:proofErr w:type="spellEnd"/>
+      <w:r>
+        <w:rPr>
+          <w:rFonts w:ascii="Segoe UI" w:eastAsia="Times New Roman" w:hAnsi="Segoe UI" w:cs="Segoe UI"/>
+          <w:kern w:val="0"/>
+          <w:sz w:val="21"/>
+          <w:szCs w:val="21"/>
+          <w:lang w:eastAsia="fr-GA"/>
+          <w14:ligatures w14:val="none"/>
+        </w:rPr>
+        <w:t>;</w:t>
+      </w:r>
+      <w:commentRangeEnd w:id="0"/>
+      <w:r>
+        <w:rPr>
+          <w:rStyle w:val="Marquedecommentaire"/>
+        </w:rPr>
+        <w:commentReference w:id="0"/>
       </w:r>
     </w:p>
     <w:p>
@@ -198,7 +256,151 @@
           <w:lang w:eastAsia="fr-GA"/>
           <w14:ligatures w14:val="none"/>
         </w:rPr>
-        <w:t>"main" contient un dictionnaire avec les clés étant temp, feels_like, temp_min, temp_max, pressure, humidity, sea_level et grnd_level;</w:t>
+        <w:t xml:space="preserve">"main" contient un dictionnaire avec les clés étant temp, </w:t>
+      </w:r>
+      <w:proofErr w:type="spellStart"/>
+      <w:r>
+        <w:rPr>
+          <w:rFonts w:ascii="Segoe UI" w:eastAsia="Times New Roman" w:hAnsi="Segoe UI" w:cs="Segoe UI"/>
+          <w:kern w:val="0"/>
+          <w:sz w:val="21"/>
+          <w:szCs w:val="21"/>
+          <w:lang w:eastAsia="fr-GA"/>
+          <w14:ligatures w14:val="none"/>
+        </w:rPr>
+        <w:t>feels_like</w:t>
+      </w:r>
+      <w:proofErr w:type="spellEnd"/>
+      <w:r>
+        <w:rPr>
+          <w:rFonts w:ascii="Segoe UI" w:eastAsia="Times New Roman" w:hAnsi="Segoe UI" w:cs="Segoe UI"/>
+          <w:kern w:val="0"/>
+          <w:sz w:val="21"/>
+          <w:szCs w:val="21"/>
+          <w:lang w:eastAsia="fr-GA"/>
+          <w14:ligatures w14:val="none"/>
+        </w:rPr>
+        <w:t xml:space="preserve">, </w:t>
+      </w:r>
+      <w:proofErr w:type="spellStart"/>
+      <w:r>
+        <w:rPr>
+          <w:rFonts w:ascii="Segoe UI" w:eastAsia="Times New Roman" w:hAnsi="Segoe UI" w:cs="Segoe UI"/>
+          <w:kern w:val="0"/>
+          <w:sz w:val="21"/>
+          <w:szCs w:val="21"/>
+          <w:lang w:eastAsia="fr-GA"/>
+          <w14:ligatures w14:val="none"/>
+        </w:rPr>
+        <w:t>temp_min</w:t>
+      </w:r>
+      <w:proofErr w:type="spellEnd"/>
+      <w:r>
+        <w:rPr>
+          <w:rFonts w:ascii="Segoe UI" w:eastAsia="Times New Roman" w:hAnsi="Segoe UI" w:cs="Segoe UI"/>
+          <w:kern w:val="0"/>
+          <w:sz w:val="21"/>
+          <w:szCs w:val="21"/>
+          <w:lang w:eastAsia="fr-GA"/>
+          <w14:ligatures w14:val="none"/>
+        </w:rPr>
+        <w:t xml:space="preserve">, </w:t>
+      </w:r>
+      <w:proofErr w:type="spellStart"/>
+      <w:r>
+        <w:rPr>
+          <w:rFonts w:ascii="Segoe UI" w:eastAsia="Times New Roman" w:hAnsi="Segoe UI" w:cs="Segoe UI"/>
+          <w:kern w:val="0"/>
+          <w:sz w:val="21"/>
+          <w:szCs w:val="21"/>
+          <w:lang w:eastAsia="fr-GA"/>
+          <w14:ligatures w14:val="none"/>
+        </w:rPr>
+        <w:t>temp_max</w:t>
+      </w:r>
+      <w:proofErr w:type="spellEnd"/>
+      <w:r>
+        <w:rPr>
+          <w:rFonts w:ascii="Segoe UI" w:eastAsia="Times New Roman" w:hAnsi="Segoe UI" w:cs="Segoe UI"/>
+          <w:kern w:val="0"/>
+          <w:sz w:val="21"/>
+          <w:szCs w:val="21"/>
+          <w:lang w:eastAsia="fr-GA"/>
+          <w14:ligatures w14:val="none"/>
+        </w:rPr>
+        <w:t xml:space="preserve">, pressure, </w:t>
+      </w:r>
+      <w:proofErr w:type="spellStart"/>
+      <w:r>
+        <w:rPr>
+          <w:rFonts w:ascii="Segoe UI" w:eastAsia="Times New Roman" w:hAnsi="Segoe UI" w:cs="Segoe UI"/>
+          <w:kern w:val="0"/>
+          <w:sz w:val="21"/>
+          <w:szCs w:val="21"/>
+          <w:lang w:eastAsia="fr-GA"/>
+          <w14:ligatures w14:val="none"/>
+        </w:rPr>
+        <w:t>humidity</w:t>
+      </w:r>
+      <w:proofErr w:type="spellEnd"/>
+      <w:r>
+        <w:rPr>
+          <w:rFonts w:ascii="Segoe UI" w:eastAsia="Times New Roman" w:hAnsi="Segoe UI" w:cs="Segoe UI"/>
+          <w:kern w:val="0"/>
+          <w:sz w:val="21"/>
+          <w:szCs w:val="21"/>
+          <w:lang w:eastAsia="fr-GA"/>
+          <w14:ligatures w14:val="none"/>
+        </w:rPr>
+        <w:t xml:space="preserve">, </w:t>
+      </w:r>
+      <w:proofErr w:type="spellStart"/>
+      <w:r>
+        <w:rPr>
+          <w:rFonts w:ascii="Segoe UI" w:eastAsia="Times New Roman" w:hAnsi="Segoe UI" w:cs="Segoe UI"/>
+          <w:kern w:val="0"/>
+          <w:sz w:val="21"/>
+          <w:szCs w:val="21"/>
+          <w:lang w:eastAsia="fr-GA"/>
+          <w14:ligatures w14:val="none"/>
+        </w:rPr>
+        <w:t>sea_level</w:t>
+      </w:r>
+      <w:proofErr w:type="spellEnd"/>
+      <w:r>
+        <w:rPr>
+          <w:rFonts w:ascii="Segoe UI" w:eastAsia="Times New Roman" w:hAnsi="Segoe UI" w:cs="Segoe UI"/>
+          <w:kern w:val="0"/>
+          <w:sz w:val="21"/>
+          <w:szCs w:val="21"/>
+          <w:lang w:eastAsia="fr-GA"/>
+          <w14:ligatures w14:val="none"/>
+        </w:rPr>
+        <w:t xml:space="preserve"> et </w:t>
+      </w:r>
+      <w:proofErr w:type="spellStart"/>
+      <w:r>
+        <w:rPr>
+          <w:rFonts w:ascii="Segoe UI" w:eastAsia="Times New Roman" w:hAnsi="Segoe UI" w:cs="Segoe UI"/>
+          <w:kern w:val="0"/>
+          <w:sz w:val="21"/>
+          <w:szCs w:val="21"/>
+          <w:lang w:eastAsia="fr-GA"/>
+          <w14:ligatures w14:val="none"/>
+        </w:rPr>
+        <w:t>grnd_level</w:t>
+      </w:r>
+      <w:proofErr w:type="spellEnd"/>
+      <w:r>
+        <w:rPr>
+          <w:rFonts w:ascii="Segoe UI" w:eastAsia="Times New Roman" w:hAnsi="Segoe UI" w:cs="Segoe UI"/>
+          <w:kern w:val="0"/>
+          <w:sz w:val="21"/>
+          <w:szCs w:val="21"/>
+          <w:lang w:eastAsia="fr-GA"/>
+          <w14:ligatures w14:val="none"/>
+        </w:rPr>
+        <w:t>;</w:t>
       </w:r>
     </w:p>
     <w:p>
@@ -226,7 +428,55 @@
           <w:lang w:eastAsia="fr-GA"/>
           <w14:ligatures w14:val="none"/>
         </w:rPr>
-        <w:t>"wind" a pour valeur un dictionnaire avec speed et deg comme clés;</w:t>
+        <w:t>"</w:t>
+      </w:r>
+      <w:proofErr w:type="spellStart"/>
+      <w:r>
+        <w:rPr>
+          <w:rFonts w:ascii="Segoe UI" w:eastAsia="Times New Roman" w:hAnsi="Segoe UI" w:cs="Segoe UI"/>
+          <w:kern w:val="0"/>
+          <w:sz w:val="21"/>
+          <w:szCs w:val="21"/>
+          <w:lang w:eastAsia="fr-GA"/>
+          <w14:ligatures w14:val="none"/>
+        </w:rPr>
+        <w:t>wind</w:t>
+      </w:r>
+      <w:proofErr w:type="spellEnd"/>
+      <w:r>
+        <w:rPr>
+          <w:rFonts w:ascii="Segoe UI" w:eastAsia="Times New Roman" w:hAnsi="Segoe UI" w:cs="Segoe UI"/>
+          <w:kern w:val="0"/>
+          <w:sz w:val="21"/>
+          <w:szCs w:val="21"/>
+          <w:lang w:eastAsia="fr-GA"/>
+          <w14:ligatures w14:val="none"/>
+        </w:rPr>
+        <w:t xml:space="preserve">" a pour valeur un dictionnaire avec speed et </w:t>
+      </w:r>
+      <w:proofErr w:type="spellStart"/>
+      <w:r>
+        <w:rPr>
+          <w:rFonts w:ascii="Segoe UI" w:eastAsia="Times New Roman" w:hAnsi="Segoe UI" w:cs="Segoe UI"/>
+          <w:kern w:val="0"/>
+          <w:sz w:val="21"/>
+          <w:szCs w:val="21"/>
+          <w:lang w:eastAsia="fr-GA"/>
+          <w14:ligatures w14:val="none"/>
+        </w:rPr>
+        <w:t>deg</w:t>
+      </w:r>
+      <w:proofErr w:type="spellEnd"/>
+      <w:r>
+        <w:rPr>
+          <w:rFonts w:ascii="Segoe UI" w:eastAsia="Times New Roman" w:hAnsi="Segoe UI" w:cs="Segoe UI"/>
+          <w:kern w:val="0"/>
+          <w:sz w:val="21"/>
+          <w:szCs w:val="21"/>
+          <w:lang w:eastAsia="fr-GA"/>
+          <w14:ligatures w14:val="none"/>
+        </w:rPr>
+        <w:t xml:space="preserve"> comme clés;</w:t>
       </w:r>
     </w:p>
     <w:p>
@@ -254,7 +504,31 @@
           <w:lang w:eastAsia="fr-GA"/>
           <w14:ligatures w14:val="none"/>
         </w:rPr>
-        <w:t>"clouds", sa valeur est aussi un dictionnaire, mais ici, elle a seulement la clé all;</w:t>
+        <w:t>"</w:t>
+      </w:r>
+      <w:proofErr w:type="spellStart"/>
+      <w:r>
+        <w:rPr>
+          <w:rFonts w:ascii="Segoe UI" w:eastAsia="Times New Roman" w:hAnsi="Segoe UI" w:cs="Segoe UI"/>
+          <w:kern w:val="0"/>
+          <w:sz w:val="21"/>
+          <w:szCs w:val="21"/>
+          <w:lang w:eastAsia="fr-GA"/>
+          <w14:ligatures w14:val="none"/>
+        </w:rPr>
+        <w:t>clouds</w:t>
+      </w:r>
+      <w:proofErr w:type="spellEnd"/>
+      <w:r>
+        <w:rPr>
+          <w:rFonts w:ascii="Segoe UI" w:eastAsia="Times New Roman" w:hAnsi="Segoe UI" w:cs="Segoe UI"/>
+          <w:kern w:val="0"/>
+          <w:sz w:val="21"/>
+          <w:szCs w:val="21"/>
+          <w:lang w:eastAsia="fr-GA"/>
+          <w14:ligatures w14:val="none"/>
+        </w:rPr>
+        <w:t>", sa valeur est aussi un dictionnaire, mais ici, elle a seulement la clé all;</w:t>
       </w:r>
     </w:p>
     <w:p>
@@ -282,7 +556,79 @@
           <w:lang w:eastAsia="fr-GA"/>
           <w14:ligatures w14:val="none"/>
         </w:rPr>
-        <w:t>"sys" contient un dictionnaire avec les clés type, id, country, sunrise, et sunset.</w:t>
+        <w:t>"</w:t>
+      </w:r>
+      <w:proofErr w:type="spellStart"/>
+      <w:r>
+        <w:rPr>
+          <w:rFonts w:ascii="Segoe UI" w:eastAsia="Times New Roman" w:hAnsi="Segoe UI" w:cs="Segoe UI"/>
+          <w:kern w:val="0"/>
+          <w:sz w:val="21"/>
+          <w:szCs w:val="21"/>
+          <w:lang w:eastAsia="fr-GA"/>
+          <w14:ligatures w14:val="none"/>
+        </w:rPr>
+        <w:t>sys</w:t>
+      </w:r>
+      <w:proofErr w:type="spellEnd"/>
+      <w:r>
+        <w:rPr>
+          <w:rFonts w:ascii="Segoe UI" w:eastAsia="Times New Roman" w:hAnsi="Segoe UI" w:cs="Segoe UI"/>
+          <w:kern w:val="0"/>
+          <w:sz w:val="21"/>
+          <w:szCs w:val="21"/>
+          <w:lang w:eastAsia="fr-GA"/>
+          <w14:ligatures w14:val="none"/>
+        </w:rPr>
+        <w:t xml:space="preserve">" contient un dictionnaire avec les clés type, id, country, </w:t>
+      </w:r>
+      <w:proofErr w:type="spellStart"/>
+      <w:r>
+        <w:rPr>
+          <w:rFonts w:ascii="Segoe UI" w:eastAsia="Times New Roman" w:hAnsi="Segoe UI" w:cs="Segoe UI"/>
+          <w:kern w:val="0"/>
+          <w:sz w:val="21"/>
+          <w:szCs w:val="21"/>
+          <w:lang w:eastAsia="fr-GA"/>
+          <w14:ligatures w14:val="none"/>
+        </w:rPr>
+        <w:t>sunrise</w:t>
+      </w:r>
+      <w:proofErr w:type="spellEnd"/>
+      <w:r>
+        <w:rPr>
+          <w:rFonts w:ascii="Segoe UI" w:eastAsia="Times New Roman" w:hAnsi="Segoe UI" w:cs="Segoe UI"/>
+          <w:kern w:val="0"/>
+          <w:sz w:val="21"/>
+          <w:szCs w:val="21"/>
+          <w:lang w:eastAsia="fr-GA"/>
+          <w14:ligatures w14:val="none"/>
+        </w:rPr>
+        <w:t xml:space="preserve">, et </w:t>
+      </w:r>
+      <w:proofErr w:type="spellStart"/>
+      <w:r>
+        <w:rPr>
+          <w:rFonts w:ascii="Segoe UI" w:eastAsia="Times New Roman" w:hAnsi="Segoe UI" w:cs="Segoe UI"/>
+          <w:kern w:val="0"/>
+          <w:sz w:val="21"/>
+          <w:szCs w:val="21"/>
+          <w:lang w:eastAsia="fr-GA"/>
+          <w14:ligatures w14:val="none"/>
+        </w:rPr>
+        <w:t>sunset</w:t>
+      </w:r>
+      <w:proofErr w:type="spellEnd"/>
+      <w:r>
+        <w:rPr>
+          <w:rFonts w:ascii="Segoe UI" w:eastAsia="Times New Roman" w:hAnsi="Segoe UI" w:cs="Segoe UI"/>
+          <w:kern w:val="0"/>
+          <w:sz w:val="21"/>
+          <w:szCs w:val="21"/>
+          <w:lang w:eastAsia="fr-GA"/>
+          <w14:ligatures w14:val="none"/>
+        </w:rPr>
+        <w:t>.</w:t>
       </w:r>
     </w:p>
     <w:p>
@@ -328,7 +674,535 @@
           <w:lang w:eastAsia="fr-GA"/>
           <w14:ligatures w14:val="none"/>
         </w:rPr>
-        <w:t xml:space="preserve"> de tourisme ? Voici les clés qui seront gardées : weather (main, description), main (temp, temp_min, temp_max, pressure, humidity), visibility, wind (speed), clouds, dt, sys (country, sunrise, sunset), timezone, name (à ne pas utiliser tel quel selon les villes). Voici les clés qui seront jetées : coord, weather (id, icon), base, main (sea_level, grnd_level), wind (deg), sys (type, id), id, cod (on vérifiera le code renvoyé, mais on ne garde pas en mémoire).</w:t>
+        <w:t xml:space="preserve"> de tourisme ? Voici les clés qui seront gardées : </w:t>
+      </w:r>
+      <w:proofErr w:type="spellStart"/>
+      <w:r>
+        <w:rPr>
+          <w:rFonts w:ascii="Segoe UI" w:eastAsia="Times New Roman" w:hAnsi="Segoe UI" w:cs="Segoe UI"/>
+          <w:kern w:val="0"/>
+          <w:sz w:val="21"/>
+          <w:szCs w:val="21"/>
+          <w:lang w:eastAsia="fr-GA"/>
+          <w14:ligatures w14:val="none"/>
+        </w:rPr>
+        <w:t>weather</w:t>
+      </w:r>
+      <w:proofErr w:type="spellEnd"/>
+      <w:r>
+        <w:rPr>
+          <w:rFonts w:ascii="Segoe UI" w:eastAsia="Times New Roman" w:hAnsi="Segoe UI" w:cs="Segoe UI"/>
+          <w:kern w:val="0"/>
+          <w:sz w:val="21"/>
+          <w:szCs w:val="21"/>
+          <w:lang w:eastAsia="fr-GA"/>
+          <w14:ligatures w14:val="none"/>
+        </w:rPr>
+        <w:t xml:space="preserve"> (main, description), main (temp, </w:t>
+      </w:r>
+      <w:proofErr w:type="spellStart"/>
+      <w:r>
+        <w:rPr>
+          <w:rFonts w:ascii="Segoe UI" w:eastAsia="Times New Roman" w:hAnsi="Segoe UI" w:cs="Segoe UI"/>
+          <w:kern w:val="0"/>
+          <w:sz w:val="21"/>
+          <w:szCs w:val="21"/>
+          <w:lang w:eastAsia="fr-GA"/>
+          <w14:ligatures w14:val="none"/>
+        </w:rPr>
+        <w:t>temp_min</w:t>
+      </w:r>
+      <w:proofErr w:type="spellEnd"/>
+      <w:r>
+        <w:rPr>
+          <w:rFonts w:ascii="Segoe UI" w:eastAsia="Times New Roman" w:hAnsi="Segoe UI" w:cs="Segoe UI"/>
+          <w:kern w:val="0"/>
+          <w:sz w:val="21"/>
+          <w:szCs w:val="21"/>
+          <w:lang w:eastAsia="fr-GA"/>
+          <w14:ligatures w14:val="none"/>
+        </w:rPr>
+        <w:t xml:space="preserve">, </w:t>
+      </w:r>
+      <w:proofErr w:type="spellStart"/>
+      <w:r>
+        <w:rPr>
+          <w:rFonts w:ascii="Segoe UI" w:eastAsia="Times New Roman" w:hAnsi="Segoe UI" w:cs="Segoe UI"/>
+          <w:kern w:val="0"/>
+          <w:sz w:val="21"/>
+          <w:szCs w:val="21"/>
+          <w:lang w:eastAsia="fr-GA"/>
+          <w14:ligatures w14:val="none"/>
+        </w:rPr>
+        <w:t>temp_max</w:t>
+      </w:r>
+      <w:proofErr w:type="spellEnd"/>
+      <w:r>
+        <w:rPr>
+          <w:rFonts w:ascii="Segoe UI" w:eastAsia="Times New Roman" w:hAnsi="Segoe UI" w:cs="Segoe UI"/>
+          <w:kern w:val="0"/>
+          <w:sz w:val="21"/>
+          <w:szCs w:val="21"/>
+          <w:lang w:eastAsia="fr-GA"/>
+          <w14:ligatures w14:val="none"/>
+        </w:rPr>
+        <w:t xml:space="preserve">, pressure, </w:t>
+      </w:r>
+      <w:proofErr w:type="spellStart"/>
+      <w:r>
+        <w:rPr>
+          <w:rFonts w:ascii="Segoe UI" w:eastAsia="Times New Roman" w:hAnsi="Segoe UI" w:cs="Segoe UI"/>
+          <w:kern w:val="0"/>
+          <w:sz w:val="21"/>
+          <w:szCs w:val="21"/>
+          <w:lang w:eastAsia="fr-GA"/>
+          <w14:ligatures w14:val="none"/>
+        </w:rPr>
+        <w:t>humidity</w:t>
+      </w:r>
+      <w:proofErr w:type="spellEnd"/>
+      <w:r>
+        <w:rPr>
+          <w:rFonts w:ascii="Segoe UI" w:eastAsia="Times New Roman" w:hAnsi="Segoe UI" w:cs="Segoe UI"/>
+          <w:kern w:val="0"/>
+          <w:sz w:val="21"/>
+          <w:szCs w:val="21"/>
+          <w:lang w:eastAsia="fr-GA"/>
+          <w14:ligatures w14:val="none"/>
+        </w:rPr>
+        <w:t xml:space="preserve">), </w:t>
+      </w:r>
+      <w:proofErr w:type="spellStart"/>
+      <w:r>
+        <w:rPr>
+          <w:rFonts w:ascii="Segoe UI" w:eastAsia="Times New Roman" w:hAnsi="Segoe UI" w:cs="Segoe UI"/>
+          <w:kern w:val="0"/>
+          <w:sz w:val="21"/>
+          <w:szCs w:val="21"/>
+          <w:lang w:eastAsia="fr-GA"/>
+          <w14:ligatures w14:val="none"/>
+        </w:rPr>
+        <w:t>visibility</w:t>
+      </w:r>
+      <w:proofErr w:type="spellEnd"/>
+      <w:r>
+        <w:rPr>
+          <w:rFonts w:ascii="Segoe UI" w:eastAsia="Times New Roman" w:hAnsi="Segoe UI" w:cs="Segoe UI"/>
+          <w:kern w:val="0"/>
+          <w:sz w:val="21"/>
+          <w:szCs w:val="21"/>
+          <w:lang w:eastAsia="fr-GA"/>
+          <w14:ligatures w14:val="none"/>
+        </w:rPr>
+        <w:t xml:space="preserve">, </w:t>
+      </w:r>
+      <w:proofErr w:type="spellStart"/>
+      <w:r>
+        <w:rPr>
+          <w:rFonts w:ascii="Segoe UI" w:eastAsia="Times New Roman" w:hAnsi="Segoe UI" w:cs="Segoe UI"/>
+          <w:kern w:val="0"/>
+          <w:sz w:val="21"/>
+          <w:szCs w:val="21"/>
+          <w:lang w:eastAsia="fr-GA"/>
+          <w14:ligatures w14:val="none"/>
+        </w:rPr>
+        <w:t>wind</w:t>
+      </w:r>
+      <w:proofErr w:type="spellEnd"/>
+      <w:r>
+        <w:rPr>
+          <w:rFonts w:ascii="Segoe UI" w:eastAsia="Times New Roman" w:hAnsi="Segoe UI" w:cs="Segoe UI"/>
+          <w:kern w:val="0"/>
+          <w:sz w:val="21"/>
+          <w:szCs w:val="21"/>
+          <w:lang w:eastAsia="fr-GA"/>
+          <w14:ligatures w14:val="none"/>
+        </w:rPr>
+        <w:t xml:space="preserve"> (speed), </w:t>
+      </w:r>
+      <w:proofErr w:type="spellStart"/>
+      <w:r>
+        <w:rPr>
+          <w:rFonts w:ascii="Segoe UI" w:eastAsia="Times New Roman" w:hAnsi="Segoe UI" w:cs="Segoe UI"/>
+          <w:kern w:val="0"/>
+          <w:sz w:val="21"/>
+          <w:szCs w:val="21"/>
+          <w:lang w:eastAsia="fr-GA"/>
+          <w14:ligatures w14:val="none"/>
+        </w:rPr>
+        <w:t>clouds</w:t>
+      </w:r>
+      <w:proofErr w:type="spellEnd"/>
+      <w:r>
+        <w:rPr>
+          <w:rFonts w:ascii="Segoe UI" w:eastAsia="Times New Roman" w:hAnsi="Segoe UI" w:cs="Segoe UI"/>
+          <w:kern w:val="0"/>
+          <w:sz w:val="21"/>
+          <w:szCs w:val="21"/>
+          <w:lang w:eastAsia="fr-GA"/>
+          <w14:ligatures w14:val="none"/>
+        </w:rPr>
+        <w:t xml:space="preserve">, </w:t>
+      </w:r>
+      <w:proofErr w:type="spellStart"/>
+      <w:r>
+        <w:rPr>
+          <w:rFonts w:ascii="Segoe UI" w:eastAsia="Times New Roman" w:hAnsi="Segoe UI" w:cs="Segoe UI"/>
+          <w:kern w:val="0"/>
+          <w:sz w:val="21"/>
+          <w:szCs w:val="21"/>
+          <w:lang w:eastAsia="fr-GA"/>
+          <w14:ligatures w14:val="none"/>
+        </w:rPr>
+        <w:t>dt</w:t>
+      </w:r>
+      <w:proofErr w:type="spellEnd"/>
+      <w:r>
+        <w:rPr>
+          <w:rFonts w:ascii="Segoe UI" w:eastAsia="Times New Roman" w:hAnsi="Segoe UI" w:cs="Segoe UI"/>
+          <w:kern w:val="0"/>
+          <w:sz w:val="21"/>
+          <w:szCs w:val="21"/>
+          <w:lang w:eastAsia="fr-GA"/>
+          <w14:ligatures w14:val="none"/>
+        </w:rPr>
+        <w:t xml:space="preserve">, </w:t>
+      </w:r>
+      <w:proofErr w:type="spellStart"/>
+      <w:r>
+        <w:rPr>
+          <w:rFonts w:ascii="Segoe UI" w:eastAsia="Times New Roman" w:hAnsi="Segoe UI" w:cs="Segoe UI"/>
+          <w:kern w:val="0"/>
+          <w:sz w:val="21"/>
+          <w:szCs w:val="21"/>
+          <w:lang w:eastAsia="fr-GA"/>
+          <w14:ligatures w14:val="none"/>
+        </w:rPr>
+        <w:t>sys</w:t>
+      </w:r>
+      <w:proofErr w:type="spellEnd"/>
+      <w:r>
+        <w:rPr>
+          <w:rFonts w:ascii="Segoe UI" w:eastAsia="Times New Roman" w:hAnsi="Segoe UI" w:cs="Segoe UI"/>
+          <w:kern w:val="0"/>
+          <w:sz w:val="21"/>
+          <w:szCs w:val="21"/>
+          <w:lang w:eastAsia="fr-GA"/>
+          <w14:ligatures w14:val="none"/>
+        </w:rPr>
+        <w:t xml:space="preserve"> (country, </w:t>
+      </w:r>
+      <w:proofErr w:type="spellStart"/>
+      <w:r>
+        <w:rPr>
+          <w:rFonts w:ascii="Segoe UI" w:eastAsia="Times New Roman" w:hAnsi="Segoe UI" w:cs="Segoe UI"/>
+          <w:kern w:val="0"/>
+          <w:sz w:val="21"/>
+          <w:szCs w:val="21"/>
+          <w:lang w:eastAsia="fr-GA"/>
+          <w14:ligatures w14:val="none"/>
+        </w:rPr>
+        <w:t>sunrise</w:t>
+      </w:r>
+      <w:proofErr w:type="spellEnd"/>
+      <w:r>
+        <w:rPr>
+          <w:rFonts w:ascii="Segoe UI" w:eastAsia="Times New Roman" w:hAnsi="Segoe UI" w:cs="Segoe UI"/>
+          <w:kern w:val="0"/>
+          <w:sz w:val="21"/>
+          <w:szCs w:val="21"/>
+          <w:lang w:eastAsia="fr-GA"/>
+          <w14:ligatures w14:val="none"/>
+        </w:rPr>
+        <w:t xml:space="preserve">, </w:t>
+      </w:r>
+      <w:proofErr w:type="spellStart"/>
+      <w:r>
+        <w:rPr>
+          <w:rFonts w:ascii="Segoe UI" w:eastAsia="Times New Roman" w:hAnsi="Segoe UI" w:cs="Segoe UI"/>
+          <w:kern w:val="0"/>
+          <w:sz w:val="21"/>
+          <w:szCs w:val="21"/>
+          <w:lang w:eastAsia="fr-GA"/>
+          <w14:ligatures w14:val="none"/>
+        </w:rPr>
+        <w:t>sunset</w:t>
+      </w:r>
+      <w:proofErr w:type="spellEnd"/>
+      <w:r>
+        <w:rPr>
+          <w:rFonts w:ascii="Segoe UI" w:eastAsia="Times New Roman" w:hAnsi="Segoe UI" w:cs="Segoe UI"/>
+          <w:kern w:val="0"/>
+          <w:sz w:val="21"/>
+          <w:szCs w:val="21"/>
+          <w:lang w:eastAsia="fr-GA"/>
+          <w14:ligatures w14:val="none"/>
+        </w:rPr>
+        <w:t xml:space="preserve">), </w:t>
+      </w:r>
+      <w:proofErr w:type="spellStart"/>
+      <w:r>
+        <w:rPr>
+          <w:rFonts w:ascii="Segoe UI" w:eastAsia="Times New Roman" w:hAnsi="Segoe UI" w:cs="Segoe UI"/>
+          <w:kern w:val="0"/>
+          <w:sz w:val="21"/>
+          <w:szCs w:val="21"/>
+          <w:lang w:eastAsia="fr-GA"/>
+          <w14:ligatures w14:val="none"/>
+        </w:rPr>
+        <w:t>timezone</w:t>
+      </w:r>
+      <w:proofErr w:type="spellEnd"/>
+      <w:r>
+        <w:rPr>
+          <w:rFonts w:ascii="Segoe UI" w:eastAsia="Times New Roman" w:hAnsi="Segoe UI" w:cs="Segoe UI"/>
+          <w:kern w:val="0"/>
+          <w:sz w:val="21"/>
+          <w:szCs w:val="21"/>
+          <w:lang w:eastAsia="fr-GA"/>
+          <w14:ligatures w14:val="none"/>
+        </w:rPr>
+        <w:t xml:space="preserve">, </w:t>
+      </w:r>
+      <w:proofErr w:type="spellStart"/>
+      <w:r>
+        <w:rPr>
+          <w:rFonts w:ascii="Segoe UI" w:eastAsia="Times New Roman" w:hAnsi="Segoe UI" w:cs="Segoe UI"/>
+          <w:kern w:val="0"/>
+          <w:sz w:val="21"/>
+          <w:szCs w:val="21"/>
+          <w:lang w:eastAsia="fr-GA"/>
+          <w14:ligatures w14:val="none"/>
+        </w:rPr>
+        <w:t>name</w:t>
+      </w:r>
+      <w:proofErr w:type="spellEnd"/>
+      <w:r>
+        <w:rPr>
+          <w:rFonts w:ascii="Segoe UI" w:eastAsia="Times New Roman" w:hAnsi="Segoe UI" w:cs="Segoe UI"/>
+          <w:kern w:val="0"/>
+          <w:sz w:val="21"/>
+          <w:szCs w:val="21"/>
+          <w:lang w:eastAsia="fr-GA"/>
+          <w14:ligatures w14:val="none"/>
+        </w:rPr>
+        <w:t xml:space="preserve"> (à ne pas utiliser tel quel selon les villes). Voici les clés qui seront jetées : </w:t>
+      </w:r>
+      <w:proofErr w:type="spellStart"/>
+      <w:r>
+        <w:rPr>
+          <w:rFonts w:ascii="Segoe UI" w:eastAsia="Times New Roman" w:hAnsi="Segoe UI" w:cs="Segoe UI"/>
+          <w:kern w:val="0"/>
+          <w:sz w:val="21"/>
+          <w:szCs w:val="21"/>
+          <w:lang w:eastAsia="fr-GA"/>
+          <w14:ligatures w14:val="none"/>
+        </w:rPr>
+        <w:t>coord</w:t>
+      </w:r>
+      <w:proofErr w:type="spellEnd"/>
+      <w:r>
+        <w:rPr>
+          <w:rFonts w:ascii="Segoe UI" w:eastAsia="Times New Roman" w:hAnsi="Segoe UI" w:cs="Segoe UI"/>
+          <w:kern w:val="0"/>
+          <w:sz w:val="21"/>
+          <w:szCs w:val="21"/>
+          <w:lang w:eastAsia="fr-GA"/>
+          <w14:ligatures w14:val="none"/>
+        </w:rPr>
+        <w:t xml:space="preserve">, </w:t>
+      </w:r>
+      <w:proofErr w:type="spellStart"/>
+      <w:r>
+        <w:rPr>
+          <w:rFonts w:ascii="Segoe UI" w:eastAsia="Times New Roman" w:hAnsi="Segoe UI" w:cs="Segoe UI"/>
+          <w:kern w:val="0"/>
+          <w:sz w:val="21"/>
+          <w:szCs w:val="21"/>
+          <w:lang w:eastAsia="fr-GA"/>
+          <w14:ligatures w14:val="none"/>
+        </w:rPr>
+        <w:t>weather</w:t>
+      </w:r>
+      <w:proofErr w:type="spellEnd"/>
+      <w:r>
+        <w:rPr>
+          <w:rFonts w:ascii="Segoe UI" w:eastAsia="Times New Roman" w:hAnsi="Segoe UI" w:cs="Segoe UI"/>
+          <w:kern w:val="0"/>
+          <w:sz w:val="21"/>
+          <w:szCs w:val="21"/>
+          <w:lang w:eastAsia="fr-GA"/>
+          <w14:ligatures w14:val="none"/>
+        </w:rPr>
+        <w:t xml:space="preserve"> (id, </w:t>
+      </w:r>
+      <w:proofErr w:type="spellStart"/>
+      <w:r>
+        <w:rPr>
+          <w:rFonts w:ascii="Segoe UI" w:eastAsia="Times New Roman" w:hAnsi="Segoe UI" w:cs="Segoe UI"/>
+          <w:kern w:val="0"/>
+          <w:sz w:val="21"/>
+          <w:szCs w:val="21"/>
+          <w:lang w:eastAsia="fr-GA"/>
+          <w14:ligatures w14:val="none"/>
+        </w:rPr>
+        <w:t>icon</w:t>
+      </w:r>
+      <w:proofErr w:type="spellEnd"/>
+      <w:r>
+        <w:rPr>
+          <w:rFonts w:ascii="Segoe UI" w:eastAsia="Times New Roman" w:hAnsi="Segoe UI" w:cs="Segoe UI"/>
+          <w:kern w:val="0"/>
+          <w:sz w:val="21"/>
+          <w:szCs w:val="21"/>
+          <w:lang w:eastAsia="fr-GA"/>
+          <w14:ligatures w14:val="none"/>
+        </w:rPr>
+        <w:t>), base, main (</w:t>
+      </w:r>
+      <w:proofErr w:type="spellStart"/>
+      <w:r>
+        <w:rPr>
+          <w:rFonts w:ascii="Segoe UI" w:eastAsia="Times New Roman" w:hAnsi="Segoe UI" w:cs="Segoe UI"/>
+          <w:kern w:val="0"/>
+          <w:sz w:val="21"/>
+          <w:szCs w:val="21"/>
+          <w:lang w:eastAsia="fr-GA"/>
+          <w14:ligatures w14:val="none"/>
+        </w:rPr>
+        <w:t>sea_level</w:t>
+      </w:r>
+      <w:proofErr w:type="spellEnd"/>
+      <w:r>
+        <w:rPr>
+          <w:rFonts w:ascii="Segoe UI" w:eastAsia="Times New Roman" w:hAnsi="Segoe UI" w:cs="Segoe UI"/>
+          <w:kern w:val="0"/>
+          <w:sz w:val="21"/>
+          <w:szCs w:val="21"/>
+          <w:lang w:eastAsia="fr-GA"/>
+          <w14:ligatures w14:val="none"/>
+        </w:rPr>
+        <w:t xml:space="preserve">, </w:t>
+      </w:r>
+      <w:proofErr w:type="spellStart"/>
+      <w:r>
+        <w:rPr>
+          <w:rFonts w:ascii="Segoe UI" w:eastAsia="Times New Roman" w:hAnsi="Segoe UI" w:cs="Segoe UI"/>
+          <w:kern w:val="0"/>
+          <w:sz w:val="21"/>
+          <w:szCs w:val="21"/>
+          <w:lang w:eastAsia="fr-GA"/>
+          <w14:ligatures w14:val="none"/>
+        </w:rPr>
+        <w:t>grnd_level</w:t>
+      </w:r>
+      <w:proofErr w:type="spellEnd"/>
+      <w:r>
+        <w:rPr>
+          <w:rFonts w:ascii="Segoe UI" w:eastAsia="Times New Roman" w:hAnsi="Segoe UI" w:cs="Segoe UI"/>
+          <w:kern w:val="0"/>
+          <w:sz w:val="21"/>
+          <w:szCs w:val="21"/>
+          <w:lang w:eastAsia="fr-GA"/>
+          <w14:ligatures w14:val="none"/>
+        </w:rPr>
+        <w:t xml:space="preserve">), </w:t>
+      </w:r>
+      <w:proofErr w:type="spellStart"/>
+      <w:r>
+        <w:rPr>
+          <w:rFonts w:ascii="Segoe UI" w:eastAsia="Times New Roman" w:hAnsi="Segoe UI" w:cs="Segoe UI"/>
+          <w:kern w:val="0"/>
+          <w:sz w:val="21"/>
+          <w:szCs w:val="21"/>
+          <w:lang w:eastAsia="fr-GA"/>
+          <w14:ligatures w14:val="none"/>
+        </w:rPr>
+        <w:t>wind</w:t>
+      </w:r>
+      <w:proofErr w:type="spellEnd"/>
+      <w:r>
+        <w:rPr>
+          <w:rFonts w:ascii="Segoe UI" w:eastAsia="Times New Roman" w:hAnsi="Segoe UI" w:cs="Segoe UI"/>
+          <w:kern w:val="0"/>
+          <w:sz w:val="21"/>
+          <w:szCs w:val="21"/>
+          <w:lang w:eastAsia="fr-GA"/>
+          <w14:ligatures w14:val="none"/>
+        </w:rPr>
+        <w:t xml:space="preserve"> (</w:t>
+      </w:r>
+      <w:proofErr w:type="spellStart"/>
+      <w:r>
+        <w:rPr>
+          <w:rFonts w:ascii="Segoe UI" w:eastAsia="Times New Roman" w:hAnsi="Segoe UI" w:cs="Segoe UI"/>
+          <w:kern w:val="0"/>
+          <w:sz w:val="21"/>
+          <w:szCs w:val="21"/>
+          <w:lang w:eastAsia="fr-GA"/>
+          <w14:ligatures w14:val="none"/>
+        </w:rPr>
+        <w:t>deg</w:t>
+      </w:r>
+      <w:proofErr w:type="spellEnd"/>
+      <w:r>
+        <w:rPr>
+          <w:rFonts w:ascii="Segoe UI" w:eastAsia="Times New Roman" w:hAnsi="Segoe UI" w:cs="Segoe UI"/>
+          <w:kern w:val="0"/>
+          <w:sz w:val="21"/>
+          <w:szCs w:val="21"/>
+          <w:lang w:eastAsia="fr-GA"/>
+          <w14:ligatures w14:val="none"/>
+        </w:rPr>
+        <w:t xml:space="preserve">), </w:t>
+      </w:r>
+      <w:proofErr w:type="spellStart"/>
+      <w:r>
+        <w:rPr>
+          <w:rFonts w:ascii="Segoe UI" w:eastAsia="Times New Roman" w:hAnsi="Segoe UI" w:cs="Segoe UI"/>
+          <w:kern w:val="0"/>
+          <w:sz w:val="21"/>
+          <w:szCs w:val="21"/>
+          <w:lang w:eastAsia="fr-GA"/>
+          <w14:ligatures w14:val="none"/>
+        </w:rPr>
+        <w:t>sys</w:t>
+      </w:r>
+      <w:proofErr w:type="spellEnd"/>
+      <w:r>
+        <w:rPr>
+          <w:rFonts w:ascii="Segoe UI" w:eastAsia="Times New Roman" w:hAnsi="Segoe UI" w:cs="Segoe UI"/>
+          <w:kern w:val="0"/>
+          <w:sz w:val="21"/>
+          <w:szCs w:val="21"/>
+          <w:lang w:eastAsia="fr-GA"/>
+          <w14:ligatures w14:val="none"/>
+        </w:rPr>
+        <w:t xml:space="preserve"> (type, id), id, </w:t>
+      </w:r>
+      <w:proofErr w:type="spellStart"/>
+      <w:r>
+        <w:rPr>
+          <w:rFonts w:ascii="Segoe UI" w:eastAsia="Times New Roman" w:hAnsi="Segoe UI" w:cs="Segoe UI"/>
+          <w:kern w:val="0"/>
+          <w:sz w:val="21"/>
+          <w:szCs w:val="21"/>
+          <w:lang w:eastAsia="fr-GA"/>
+          <w14:ligatures w14:val="none"/>
+        </w:rPr>
+        <w:t>cod</w:t>
+      </w:r>
+      <w:proofErr w:type="spellEnd"/>
+      <w:r>
+        <w:rPr>
+          <w:rFonts w:ascii="Segoe UI" w:eastAsia="Times New Roman" w:hAnsi="Segoe UI" w:cs="Segoe UI"/>
+          <w:kern w:val="0"/>
+          <w:sz w:val="21"/>
+          <w:szCs w:val="21"/>
+          <w:lang w:eastAsia="fr-GA"/>
+          <w14:ligatures w14:val="none"/>
+        </w:rPr>
+        <w:t xml:space="preserve"> (on vérifiera le code renvoyé, mais on ne garde pas en mémoire).</w:t>
       </w:r>
     </w:p>
     <w:p>
@@ -352,7 +1226,31 @@
           <w:lang w:eastAsia="fr-GA"/>
           <w14:ligatures w14:val="none"/>
         </w:rPr>
-        <w:t>En conclusion, le schema SQL sera le suivant :</w:t>
+        <w:t xml:space="preserve">En conclusion, le </w:t>
+      </w:r>
+      <w:proofErr w:type="spellStart"/>
+      <w:r>
+        <w:rPr>
+          <w:rFonts w:ascii="Segoe UI" w:eastAsia="Times New Roman" w:hAnsi="Segoe UI" w:cs="Segoe UI"/>
+          <w:kern w:val="0"/>
+          <w:sz w:val="21"/>
+          <w:szCs w:val="21"/>
+          <w:lang w:eastAsia="fr-GA"/>
+          <w14:ligatures w14:val="none"/>
+        </w:rPr>
+        <w:t>schema</w:t>
+      </w:r>
+      <w:proofErr w:type="spellEnd"/>
+      <w:r>
+        <w:rPr>
+          <w:rFonts w:ascii="Segoe UI" w:eastAsia="Times New Roman" w:hAnsi="Segoe UI" w:cs="Segoe UI"/>
+          <w:kern w:val="0"/>
+          <w:sz w:val="21"/>
+          <w:szCs w:val="21"/>
+          <w:lang w:eastAsia="fr-GA"/>
+          <w14:ligatures w14:val="none"/>
+        </w:rPr>
+        <w:t xml:space="preserve"> SQL sera le suivant :</w:t>
       </w:r>
     </w:p>
     <w:p>
@@ -383,6 +1281,7 @@
         </w:rPr>
         <w:t>L’entité « </w:t>
       </w:r>
+      <w:proofErr w:type="gramStart"/>
       <w:r>
         <w:rPr>
           <w:rFonts w:ascii="Segoe UI" w:eastAsia="Times New Roman" w:hAnsi="Segoe UI" w:cs="Segoe UI"/>
@@ -394,6 +1293,7 @@
         </w:rPr>
         <w:t>W</w:t>
       </w:r>
+      <w:proofErr w:type="spellStart"/>
       <w:r>
         <w:rPr>
           <w:rFonts w:ascii="Segoe UI" w:eastAsia="Times New Roman" w:hAnsi="Segoe UI" w:cs="Segoe UI"/>
@@ -405,6 +1305,7 @@
         </w:rPr>
         <w:t>eather</w:t>
       </w:r>
+      <w:proofErr w:type="spellEnd"/>
       <w:r>
         <w:rPr>
           <w:rFonts w:ascii="Segoe UI" w:eastAsia="Times New Roman" w:hAnsi="Segoe UI" w:cs="Segoe UI"/>
@@ -414,7 +1315,19 @@
           <w:lang w:val="fr-FR" w:eastAsia="fr-GA"/>
           <w14:ligatures w14:val="none"/>
         </w:rPr>
-        <w:t>» qui contiendra les champs :</w:t>
+        <w:t>»</w:t>
+      </w:r>
+      <w:proofErr w:type="gramEnd"/>
+      <w:r>
+        <w:rPr>
+          <w:rFonts w:ascii="Segoe UI" w:eastAsia="Times New Roman" w:hAnsi="Segoe UI" w:cs="Segoe UI"/>
+          <w:kern w:val="0"/>
+          <w:sz w:val="21"/>
+          <w:szCs w:val="21"/>
+          <w:lang w:val="fr-FR" w:eastAsia="fr-GA"/>
+          <w14:ligatures w14:val="none"/>
+        </w:rPr>
+        <w:t xml:space="preserve"> qui contiendra les champs :</w:t>
       </w:r>
     </w:p>
     <w:p>
@@ -434,16 +1347,29 @@
           <w14:ligatures w14:val="none"/>
         </w:rPr>
       </w:pPr>
-      <w:r>
-        <w:rPr>
-          <w:rFonts w:ascii="Segoe UI" w:eastAsia="Times New Roman" w:hAnsi="Segoe UI" w:cs="Segoe UI"/>
-          <w:kern w:val="0"/>
-          <w:sz w:val="21"/>
-          <w:szCs w:val="21"/>
-          <w:lang w:eastAsia="fr-GA"/>
-          <w14:ligatures w14:val="none"/>
-        </w:rPr>
-        <w:t>main,</w:t>
+      <w:proofErr w:type="gramStart"/>
+      <w:r>
+        <w:rPr>
+          <w:rFonts w:ascii="Segoe UI" w:eastAsia="Times New Roman" w:hAnsi="Segoe UI" w:cs="Segoe UI"/>
+          <w:kern w:val="0"/>
+          <w:sz w:val="21"/>
+          <w:szCs w:val="21"/>
+          <w:lang w:eastAsia="fr-GA"/>
+          <w14:ligatures w14:val="none"/>
+        </w:rPr>
+        <w:t>main</w:t>
+      </w:r>
+      <w:proofErr w:type="gramEnd"/>
+      <w:r>
+        <w:rPr>
+          <w:rFonts w:ascii="Segoe UI" w:eastAsia="Times New Roman" w:hAnsi="Segoe UI" w:cs="Segoe UI"/>
+          <w:kern w:val="0"/>
+          <w:sz w:val="21"/>
+          <w:szCs w:val="21"/>
+          <w:lang w:eastAsia="fr-GA"/>
+          <w14:ligatures w14:val="none"/>
+        </w:rPr>
+        <w:t>,</w:t>
       </w:r>
     </w:p>
     <w:p>
@@ -463,16 +1389,29 @@
           <w14:ligatures w14:val="none"/>
         </w:rPr>
       </w:pPr>
-      <w:r>
-        <w:rPr>
-          <w:rFonts w:ascii="Segoe UI" w:eastAsia="Times New Roman" w:hAnsi="Segoe UI" w:cs="Segoe UI"/>
-          <w:kern w:val="0"/>
-          <w:sz w:val="21"/>
-          <w:szCs w:val="21"/>
-          <w:lang w:eastAsia="fr-GA"/>
-          <w14:ligatures w14:val="none"/>
-        </w:rPr>
-        <w:t>description,</w:t>
+      <w:proofErr w:type="gramStart"/>
+      <w:r>
+        <w:rPr>
+          <w:rFonts w:ascii="Segoe UI" w:eastAsia="Times New Roman" w:hAnsi="Segoe UI" w:cs="Segoe UI"/>
+          <w:kern w:val="0"/>
+          <w:sz w:val="21"/>
+          <w:szCs w:val="21"/>
+          <w:lang w:eastAsia="fr-GA"/>
+          <w14:ligatures w14:val="none"/>
+        </w:rPr>
+        <w:t>description</w:t>
+      </w:r>
+      <w:proofErr w:type="gramEnd"/>
+      <w:r>
+        <w:rPr>
+          <w:rFonts w:ascii="Segoe UI" w:eastAsia="Times New Roman" w:hAnsi="Segoe UI" w:cs="Segoe UI"/>
+          <w:kern w:val="0"/>
+          <w:sz w:val="21"/>
+          <w:szCs w:val="21"/>
+          <w:lang w:eastAsia="fr-GA"/>
+          <w14:ligatures w14:val="none"/>
+        </w:rPr>
+        <w:t>,</w:t>
       </w:r>
     </w:p>
     <w:p>
@@ -492,16 +1431,29 @@
           <w14:ligatures w14:val="none"/>
         </w:rPr>
       </w:pPr>
-      <w:r>
-        <w:rPr>
-          <w:rFonts w:ascii="Segoe UI" w:eastAsia="Times New Roman" w:hAnsi="Segoe UI" w:cs="Segoe UI"/>
-          <w:kern w:val="0"/>
-          <w:sz w:val="21"/>
-          <w:szCs w:val="21"/>
-          <w:lang w:eastAsia="fr-GA"/>
-          <w14:ligatures w14:val="none"/>
-        </w:rPr>
-        <w:t xml:space="preserve">temp, </w:t>
+      <w:proofErr w:type="gramStart"/>
+      <w:r>
+        <w:rPr>
+          <w:rFonts w:ascii="Segoe UI" w:eastAsia="Times New Roman" w:hAnsi="Segoe UI" w:cs="Segoe UI"/>
+          <w:kern w:val="0"/>
+          <w:sz w:val="21"/>
+          <w:szCs w:val="21"/>
+          <w:lang w:eastAsia="fr-GA"/>
+          <w14:ligatures w14:val="none"/>
+        </w:rPr>
+        <w:t>temp</w:t>
+      </w:r>
+      <w:proofErr w:type="gramEnd"/>
+      <w:r>
+        <w:rPr>
+          <w:rFonts w:ascii="Segoe UI" w:eastAsia="Times New Roman" w:hAnsi="Segoe UI" w:cs="Segoe UI"/>
+          <w:kern w:val="0"/>
+          <w:sz w:val="21"/>
+          <w:szCs w:val="21"/>
+          <w:lang w:eastAsia="fr-GA"/>
+          <w14:ligatures w14:val="none"/>
+        </w:rPr>
+        <w:t xml:space="preserve">, </w:t>
       </w:r>
     </w:p>
     <w:p>
@@ -521,17 +1473,32 @@
           <w14:ligatures w14:val="none"/>
         </w:rPr>
       </w:pPr>
-      <w:r>
-        <w:rPr>
-          <w:rFonts w:ascii="Segoe UI" w:eastAsia="Times New Roman" w:hAnsi="Segoe UI" w:cs="Segoe UI"/>
-          <w:kern w:val="0"/>
-          <w:sz w:val="21"/>
-          <w:szCs w:val="21"/>
-          <w:lang w:eastAsia="fr-GA"/>
-          <w14:ligatures w14:val="none"/>
-        </w:rPr>
-        <w:t>feels_like</w:t>
-      </w:r>
+      <w:proofErr w:type="spellStart"/>
+      <w:proofErr w:type="gramStart"/>
+      <w:r>
+        <w:rPr>
+          <w:rFonts w:ascii="Segoe UI" w:eastAsia="Times New Roman" w:hAnsi="Segoe UI" w:cs="Segoe UI"/>
+          <w:kern w:val="0"/>
+          <w:sz w:val="21"/>
+          <w:szCs w:val="21"/>
+          <w:lang w:eastAsia="fr-GA"/>
+          <w14:ligatures w14:val="none"/>
+        </w:rPr>
+        <w:t>feels</w:t>
+      </w:r>
+      <w:proofErr w:type="gramEnd"/>
+      <w:r>
+        <w:rPr>
+          <w:rFonts w:ascii="Segoe UI" w:eastAsia="Times New Roman" w:hAnsi="Segoe UI" w:cs="Segoe UI"/>
+          <w:kern w:val="0"/>
+          <w:sz w:val="21"/>
+          <w:szCs w:val="21"/>
+          <w:lang w:eastAsia="fr-GA"/>
+          <w14:ligatures w14:val="none"/>
+        </w:rPr>
+        <w:t>_like</w:t>
+      </w:r>
+      <w:proofErr w:type="spellEnd"/>
     </w:p>
     <w:p>
       <w:pPr>
@@ -550,16 +1517,42 @@
           <w14:ligatures w14:val="none"/>
         </w:rPr>
       </w:pPr>
-      <w:r>
-        <w:rPr>
-          <w:rFonts w:ascii="Segoe UI" w:eastAsia="Times New Roman" w:hAnsi="Segoe UI" w:cs="Segoe UI"/>
-          <w:kern w:val="0"/>
-          <w:sz w:val="21"/>
-          <w:szCs w:val="21"/>
-          <w:lang w:eastAsia="fr-GA"/>
-          <w14:ligatures w14:val="none"/>
-        </w:rPr>
-        <w:t>temp_min,</w:t>
+      <w:proofErr w:type="spellStart"/>
+      <w:proofErr w:type="gramStart"/>
+      <w:r>
+        <w:rPr>
+          <w:rFonts w:ascii="Segoe UI" w:eastAsia="Times New Roman" w:hAnsi="Segoe UI" w:cs="Segoe UI"/>
+          <w:kern w:val="0"/>
+          <w:sz w:val="21"/>
+          <w:szCs w:val="21"/>
+          <w:lang w:eastAsia="fr-GA"/>
+          <w14:ligatures w14:val="none"/>
+        </w:rPr>
+        <w:t>temp</w:t>
+      </w:r>
+      <w:proofErr w:type="gramEnd"/>
+      <w:r>
+        <w:rPr>
+          <w:rFonts w:ascii="Segoe UI" w:eastAsia="Times New Roman" w:hAnsi="Segoe UI" w:cs="Segoe UI"/>
+          <w:kern w:val="0"/>
+          <w:sz w:val="21"/>
+          <w:szCs w:val="21"/>
+          <w:lang w:eastAsia="fr-GA"/>
+          <w14:ligatures w14:val="none"/>
+        </w:rPr>
+        <w:t>_min</w:t>
+      </w:r>
+      <w:proofErr w:type="spellEnd"/>
+      <w:r>
+        <w:rPr>
+          <w:rFonts w:ascii="Segoe UI" w:eastAsia="Times New Roman" w:hAnsi="Segoe UI" w:cs="Segoe UI"/>
+          <w:kern w:val="0"/>
+          <w:sz w:val="21"/>
+          <w:szCs w:val="21"/>
+          <w:lang w:eastAsia="fr-GA"/>
+          <w14:ligatures w14:val="none"/>
+        </w:rPr>
+        <w:t>,</w:t>
       </w:r>
     </w:p>
     <w:p>
@@ -579,16 +1572,42 @@
           <w14:ligatures w14:val="none"/>
         </w:rPr>
       </w:pPr>
-      <w:r>
-        <w:rPr>
-          <w:rFonts w:ascii="Segoe UI" w:eastAsia="Times New Roman" w:hAnsi="Segoe UI" w:cs="Segoe UI"/>
-          <w:kern w:val="0"/>
-          <w:sz w:val="21"/>
-          <w:szCs w:val="21"/>
-          <w:lang w:eastAsia="fr-GA"/>
-          <w14:ligatures w14:val="none"/>
-        </w:rPr>
-        <w:t>temp_max,</w:t>
+      <w:proofErr w:type="spellStart"/>
+      <w:proofErr w:type="gramStart"/>
+      <w:r>
+        <w:rPr>
+          <w:rFonts w:ascii="Segoe UI" w:eastAsia="Times New Roman" w:hAnsi="Segoe UI" w:cs="Segoe UI"/>
+          <w:kern w:val="0"/>
+          <w:sz w:val="21"/>
+          <w:szCs w:val="21"/>
+          <w:lang w:eastAsia="fr-GA"/>
+          <w14:ligatures w14:val="none"/>
+        </w:rPr>
+        <w:t>temp</w:t>
+      </w:r>
+      <w:proofErr w:type="gramEnd"/>
+      <w:r>
+        <w:rPr>
+          <w:rFonts w:ascii="Segoe UI" w:eastAsia="Times New Roman" w:hAnsi="Segoe UI" w:cs="Segoe UI"/>
+          <w:kern w:val="0"/>
+          <w:sz w:val="21"/>
+          <w:szCs w:val="21"/>
+          <w:lang w:eastAsia="fr-GA"/>
+          <w14:ligatures w14:val="none"/>
+        </w:rPr>
+        <w:t>_max</w:t>
+      </w:r>
+      <w:proofErr w:type="spellEnd"/>
+      <w:r>
+        <w:rPr>
+          <w:rFonts w:ascii="Segoe UI" w:eastAsia="Times New Roman" w:hAnsi="Segoe UI" w:cs="Segoe UI"/>
+          <w:kern w:val="0"/>
+          <w:sz w:val="21"/>
+          <w:szCs w:val="21"/>
+          <w:lang w:eastAsia="fr-GA"/>
+          <w14:ligatures w14:val="none"/>
+        </w:rPr>
+        <w:t>,</w:t>
       </w:r>
     </w:p>
     <w:p>
@@ -608,16 +1627,29 @@
           <w14:ligatures w14:val="none"/>
         </w:rPr>
       </w:pPr>
-      <w:r>
-        <w:rPr>
-          <w:rFonts w:ascii="Segoe UI" w:eastAsia="Times New Roman" w:hAnsi="Segoe UI" w:cs="Segoe UI"/>
-          <w:kern w:val="0"/>
-          <w:sz w:val="21"/>
-          <w:szCs w:val="21"/>
-          <w:lang w:eastAsia="fr-GA"/>
-          <w14:ligatures w14:val="none"/>
-        </w:rPr>
-        <w:t>pressure,</w:t>
+      <w:proofErr w:type="gramStart"/>
+      <w:r>
+        <w:rPr>
+          <w:rFonts w:ascii="Segoe UI" w:eastAsia="Times New Roman" w:hAnsi="Segoe UI" w:cs="Segoe UI"/>
+          <w:kern w:val="0"/>
+          <w:sz w:val="21"/>
+          <w:szCs w:val="21"/>
+          <w:lang w:eastAsia="fr-GA"/>
+          <w14:ligatures w14:val="none"/>
+        </w:rPr>
+        <w:t>pressure</w:t>
+      </w:r>
+      <w:proofErr w:type="gramEnd"/>
+      <w:r>
+        <w:rPr>
+          <w:rFonts w:ascii="Segoe UI" w:eastAsia="Times New Roman" w:hAnsi="Segoe UI" w:cs="Segoe UI"/>
+          <w:kern w:val="0"/>
+          <w:sz w:val="21"/>
+          <w:szCs w:val="21"/>
+          <w:lang w:eastAsia="fr-GA"/>
+          <w14:ligatures w14:val="none"/>
+        </w:rPr>
+        <w:t>,</w:t>
       </w:r>
     </w:p>
     <w:p>
@@ -637,16 +1669,31 @@
           <w14:ligatures w14:val="none"/>
         </w:rPr>
       </w:pPr>
-      <w:r>
-        <w:rPr>
-          <w:rFonts w:ascii="Segoe UI" w:eastAsia="Times New Roman" w:hAnsi="Segoe UI" w:cs="Segoe UI"/>
-          <w:kern w:val="0"/>
-          <w:sz w:val="21"/>
-          <w:szCs w:val="21"/>
-          <w:lang w:eastAsia="fr-GA"/>
-          <w14:ligatures w14:val="none"/>
-        </w:rPr>
-        <w:t>humidity,</w:t>
+      <w:proofErr w:type="spellStart"/>
+      <w:proofErr w:type="gramStart"/>
+      <w:r>
+        <w:rPr>
+          <w:rFonts w:ascii="Segoe UI" w:eastAsia="Times New Roman" w:hAnsi="Segoe UI" w:cs="Segoe UI"/>
+          <w:kern w:val="0"/>
+          <w:sz w:val="21"/>
+          <w:szCs w:val="21"/>
+          <w:lang w:eastAsia="fr-GA"/>
+          <w14:ligatures w14:val="none"/>
+        </w:rPr>
+        <w:t>humidity</w:t>
+      </w:r>
+      <w:proofErr w:type="spellEnd"/>
+      <w:proofErr w:type="gramEnd"/>
+      <w:r>
+        <w:rPr>
+          <w:rFonts w:ascii="Segoe UI" w:eastAsia="Times New Roman" w:hAnsi="Segoe UI" w:cs="Segoe UI"/>
+          <w:kern w:val="0"/>
+          <w:sz w:val="21"/>
+          <w:szCs w:val="21"/>
+          <w:lang w:eastAsia="fr-GA"/>
+          <w14:ligatures w14:val="none"/>
+        </w:rPr>
+        <w:t>,</w:t>
       </w:r>
     </w:p>
     <w:p>
@@ -666,6 +1713,8 @@
           <w14:ligatures w14:val="none"/>
         </w:rPr>
       </w:pPr>
+      <w:proofErr w:type="spellStart"/>
+      <w:proofErr w:type="gramStart"/>
       <w:r>
         <w:rPr>
           <w:rFonts w:ascii="Segoe UI" w:eastAsia="Times New Roman" w:hAnsi="Segoe UI" w:cs="Segoe UI"/>
@@ -677,6 +1726,8 @@
         </w:rPr>
         <w:t>visibility</w:t>
       </w:r>
+      <w:proofErr w:type="spellEnd"/>
+      <w:proofErr w:type="gramEnd"/>
     </w:p>
     <w:p>
       <w:pPr>
@@ -695,16 +1746,42 @@
           <w14:ligatures w14:val="none"/>
         </w:rPr>
       </w:pPr>
-      <w:r>
-        <w:rPr>
-          <w:rFonts w:ascii="Segoe UI" w:eastAsia="Times New Roman" w:hAnsi="Segoe UI" w:cs="Segoe UI"/>
-          <w:kern w:val="0"/>
-          <w:sz w:val="21"/>
-          <w:szCs w:val="21"/>
-          <w:lang w:eastAsia="fr-GA"/>
-          <w14:ligatures w14:val="none"/>
-        </w:rPr>
-        <w:t>wind_speed,</w:t>
+      <w:proofErr w:type="spellStart"/>
+      <w:proofErr w:type="gramStart"/>
+      <w:r>
+        <w:rPr>
+          <w:rFonts w:ascii="Segoe UI" w:eastAsia="Times New Roman" w:hAnsi="Segoe UI" w:cs="Segoe UI"/>
+          <w:kern w:val="0"/>
+          <w:sz w:val="21"/>
+          <w:szCs w:val="21"/>
+          <w:lang w:eastAsia="fr-GA"/>
+          <w14:ligatures w14:val="none"/>
+        </w:rPr>
+        <w:t>wind</w:t>
+      </w:r>
+      <w:proofErr w:type="gramEnd"/>
+      <w:r>
+        <w:rPr>
+          <w:rFonts w:ascii="Segoe UI" w:eastAsia="Times New Roman" w:hAnsi="Segoe UI" w:cs="Segoe UI"/>
+          <w:kern w:val="0"/>
+          <w:sz w:val="21"/>
+          <w:szCs w:val="21"/>
+          <w:lang w:eastAsia="fr-GA"/>
+          <w14:ligatures w14:val="none"/>
+        </w:rPr>
+        <w:t>_speed</w:t>
+      </w:r>
+      <w:proofErr w:type="spellEnd"/>
+      <w:r>
+        <w:rPr>
+          <w:rFonts w:ascii="Segoe UI" w:eastAsia="Times New Roman" w:hAnsi="Segoe UI" w:cs="Segoe UI"/>
+          <w:kern w:val="0"/>
+          <w:sz w:val="21"/>
+          <w:szCs w:val="21"/>
+          <w:lang w:eastAsia="fr-GA"/>
+          <w14:ligatures w14:val="none"/>
+        </w:rPr>
+        <w:t>,</w:t>
       </w:r>
     </w:p>
     <w:p>
@@ -724,6 +1801,8 @@
           <w14:ligatures w14:val="none"/>
         </w:rPr>
       </w:pPr>
+      <w:proofErr w:type="spellStart"/>
+      <w:proofErr w:type="gramStart"/>
       <w:r>
         <w:rPr>
           <w:rFonts w:ascii="Segoe UI" w:eastAsia="Times New Roman" w:hAnsi="Segoe UI" w:cs="Segoe UI"/>
@@ -735,6 +1814,8 @@
         </w:rPr>
         <w:t>clouds</w:t>
       </w:r>
+      <w:proofErr w:type="spellEnd"/>
+      <w:proofErr w:type="gramEnd"/>
     </w:p>
     <w:p>
       <w:pPr>
@@ -753,13 +1834,23 @@
           <w14:ligatures w14:val="none"/>
         </w:rPr>
       </w:pPr>
+      <w:proofErr w:type="spellStart"/>
+      <w:proofErr w:type="gramStart"/>
       <w:r>
         <w:rPr>
           <w:lang w:val="fr-FR" w:eastAsia="fr-GA"/>
         </w:rPr>
         <w:lastRenderedPageBreak/>
-        <w:t>observation_time</w:t>
-      </w:r>
+        <w:t>observation</w:t>
+      </w:r>
+      <w:proofErr w:type="gramEnd"/>
+      <w:r>
+        <w:rPr>
+          <w:lang w:val="fr-FR" w:eastAsia="fr-GA"/>
+        </w:rPr>
+        <w:t>_time</w:t>
+      </w:r>
+      <w:proofErr w:type="spellEnd"/>
       <w:r>
         <w:rPr>
           <w:rFonts w:ascii="Segoe UI" w:eastAsia="Times New Roman" w:hAnsi="Segoe UI" w:cs="Segoe UI"/>
@@ -789,6 +1880,8 @@
           <w14:ligatures w14:val="none"/>
         </w:rPr>
       </w:pPr>
+      <w:proofErr w:type="spellStart"/>
+      <w:proofErr w:type="gramStart"/>
       <w:r>
         <w:rPr>
           <w:rFonts w:ascii="Segoe UI" w:eastAsia="Times New Roman" w:hAnsi="Segoe UI" w:cs="Segoe UI"/>
@@ -800,6 +1893,8 @@
         </w:rPr>
         <w:t>sunrise</w:t>
       </w:r>
+      <w:proofErr w:type="spellEnd"/>
+      <w:proofErr w:type="gramEnd"/>
     </w:p>
     <w:p>
       <w:pPr>
@@ -818,6 +1913,8 @@
           <w14:ligatures w14:val="none"/>
         </w:rPr>
       </w:pPr>
+      <w:proofErr w:type="spellStart"/>
+      <w:proofErr w:type="gramStart"/>
       <w:r>
         <w:rPr>
           <w:rFonts w:ascii="Segoe UI" w:eastAsia="Times New Roman" w:hAnsi="Segoe UI" w:cs="Segoe UI"/>
@@ -829,6 +1926,8 @@
         </w:rPr>
         <w:t>sunset</w:t>
       </w:r>
+      <w:proofErr w:type="spellEnd"/>
+      <w:proofErr w:type="gramEnd"/>
     </w:p>
     <w:p>
       <w:pPr>
@@ -898,6 +1997,7 @@
           <w14:ligatures w14:val="none"/>
         </w:rPr>
       </w:pPr>
+      <w:proofErr w:type="gramStart"/>
       <w:r>
         <w:rPr>
           <w:rFonts w:ascii="Segoe UI" w:eastAsia="Times New Roman" w:hAnsi="Segoe UI" w:cs="Segoe UI"/>
@@ -909,6 +2009,7 @@
         </w:rPr>
         <w:t>c</w:t>
       </w:r>
+      <w:proofErr w:type="spellStart"/>
       <w:r>
         <w:rPr>
           <w:rFonts w:ascii="Segoe UI" w:eastAsia="Times New Roman" w:hAnsi="Segoe UI" w:cs="Segoe UI"/>
@@ -920,6 +2021,8 @@
         </w:rPr>
         <w:t>ountry</w:t>
       </w:r>
+      <w:proofErr w:type="spellEnd"/>
+      <w:proofErr w:type="gramEnd"/>
       <w:r>
         <w:rPr>
           <w:rFonts w:ascii="Segoe UI" w:eastAsia="Times New Roman" w:hAnsi="Segoe UI" w:cs="Segoe UI"/>
@@ -929,8 +2032,21 @@
           <w:lang w:val="fr-FR" w:eastAsia="fr-GA"/>
           <w14:ligatures w14:val="none"/>
         </w:rPr>
-        <w:t>_name</w:t>
-      </w:r>
+        <w:t>_</w:t>
+      </w:r>
+      <w:proofErr w:type="spellStart"/>
+      <w:r>
+        <w:rPr>
+          <w:rFonts w:ascii="Segoe UI" w:eastAsia="Times New Roman" w:hAnsi="Segoe UI" w:cs="Segoe UI"/>
+          <w:kern w:val="0"/>
+          <w:sz w:val="21"/>
+          <w:szCs w:val="21"/>
+          <w:lang w:val="fr-FR" w:eastAsia="fr-GA"/>
+          <w14:ligatures w14:val="none"/>
+        </w:rPr>
+        <w:t>name</w:t>
+      </w:r>
+      <w:proofErr w:type="spellEnd"/>
     </w:p>
     <w:p>
       <w:pPr>
@@ -949,6 +2065,8 @@
           <w14:ligatures w14:val="none"/>
         </w:rPr>
       </w:pPr>
+      <w:proofErr w:type="spellStart"/>
+      <w:proofErr w:type="gramStart"/>
       <w:r>
         <w:rPr>
           <w:rFonts w:ascii="Segoe UI" w:eastAsia="Times New Roman" w:hAnsi="Segoe UI" w:cs="Segoe UI"/>
@@ -958,8 +2076,21 @@
           <w:lang w:val="fr-FR" w:eastAsia="fr-GA"/>
           <w14:ligatures w14:val="none"/>
         </w:rPr>
-        <w:t>country_code</w:t>
-      </w:r>
+        <w:t>country</w:t>
+      </w:r>
+      <w:proofErr w:type="gramEnd"/>
+      <w:r>
+        <w:rPr>
+          <w:rFonts w:ascii="Segoe UI" w:eastAsia="Times New Roman" w:hAnsi="Segoe UI" w:cs="Segoe UI"/>
+          <w:kern w:val="0"/>
+          <w:sz w:val="21"/>
+          <w:szCs w:val="21"/>
+          <w:lang w:val="fr-FR" w:eastAsia="fr-GA"/>
+          <w14:ligatures w14:val="none"/>
+        </w:rPr>
+        <w:t>_code</w:t>
+      </w:r>
+      <w:proofErr w:type="spellEnd"/>
     </w:p>
     <w:p>
       <w:pPr>
@@ -978,6 +2109,7 @@
           <w14:ligatures w14:val="none"/>
         </w:rPr>
       </w:pPr>
+      <w:proofErr w:type="gramStart"/>
       <w:r>
         <w:rPr>
           <w:rFonts w:ascii="Segoe UI" w:eastAsia="Times New Roman" w:hAnsi="Segoe UI" w:cs="Segoe UI"/>
@@ -989,6 +2121,7 @@
         </w:rPr>
         <w:t>city</w:t>
       </w:r>
+      <w:proofErr w:type="gramEnd"/>
     </w:p>
     <w:p>
       <w:pPr>
@@ -1007,6 +2140,8 @@
           <w14:ligatures w14:val="none"/>
         </w:rPr>
       </w:pPr>
+      <w:proofErr w:type="spellStart"/>
+      <w:proofErr w:type="gramStart"/>
       <w:r>
         <w:rPr>
           <w:rFonts w:ascii="Segoe UI" w:eastAsia="Times New Roman" w:hAnsi="Segoe UI" w:cs="Segoe UI"/>
@@ -1018,6 +2153,8 @@
         </w:rPr>
         <w:t>timezone</w:t>
       </w:r>
+      <w:proofErr w:type="spellEnd"/>
+      <w:proofErr w:type="gramEnd"/>
     </w:p>
     <w:p>
       <w:pPr>
@@ -1036,6 +2173,8 @@
           <w14:ligatures w14:val="none"/>
         </w:rPr>
       </w:pPr>
+      <w:proofErr w:type="spellStart"/>
+      <w:proofErr w:type="gramStart"/>
       <w:r>
         <w:rPr>
           <w:rFonts w:ascii="Segoe UI" w:eastAsia="Times New Roman" w:hAnsi="Segoe UI" w:cs="Segoe UI"/>
@@ -1047,6 +2186,8 @@
         </w:rPr>
         <w:t>lat</w:t>
       </w:r>
+      <w:proofErr w:type="spellEnd"/>
+      <w:proofErr w:type="gramEnd"/>
     </w:p>
     <w:p>
       <w:pPr>
@@ -1065,6 +2206,8 @@
           <w14:ligatures w14:val="none"/>
         </w:rPr>
       </w:pPr>
+      <w:proofErr w:type="spellStart"/>
+      <w:proofErr w:type="gramStart"/>
       <w:r>
         <w:rPr>
           <w:rFonts w:ascii="Segoe UI" w:eastAsia="Times New Roman" w:hAnsi="Segoe UI" w:cs="Segoe UI"/>
@@ -1076,6 +2219,8 @@
         </w:rPr>
         <w:t>lon</w:t>
       </w:r>
+      <w:proofErr w:type="spellEnd"/>
+      <w:proofErr w:type="gramEnd"/>
     </w:p>
     <w:p>
       <w:pPr>
@@ -1259,12 +2404,22 @@
                 <w:lang w:val="fr-FR" w:eastAsia="fr-GA"/>
               </w:rPr>
             </w:pPr>
-            <w:r>
-              <w:rPr>
-                <w:lang w:val="fr-FR" w:eastAsia="fr-GA"/>
-              </w:rPr>
-              <w:t>weather_id</w:t>
-            </w:r>
+            <w:proofErr w:type="spellStart"/>
+            <w:proofErr w:type="gramStart"/>
+            <w:r>
+              <w:rPr>
+                <w:lang w:val="fr-FR" w:eastAsia="fr-GA"/>
+              </w:rPr>
+              <w:t>weather</w:t>
+            </w:r>
+            <w:proofErr w:type="gramEnd"/>
+            <w:r>
+              <w:rPr>
+                <w:lang w:val="fr-FR" w:eastAsia="fr-GA"/>
+              </w:rPr>
+              <w:t>_id</w:t>
+            </w:r>
+            <w:proofErr w:type="spellEnd"/>
           </w:p>
         </w:tc>
         <w:tc>
@@ -1326,11 +2481,19 @@
                 <w:lang w:val="fr-FR" w:eastAsia="fr-GA"/>
               </w:rPr>
             </w:pPr>
-            <w:r>
-              <w:rPr>
-                <w:lang w:val="fr-FR" w:eastAsia="fr-GA"/>
-              </w:rPr>
-              <w:t>Obl., unique</w:t>
+            <w:proofErr w:type="spellStart"/>
+            <w:r>
+              <w:rPr>
+                <w:lang w:val="fr-FR" w:eastAsia="fr-GA"/>
+              </w:rPr>
+              <w:t>Obl</w:t>
+            </w:r>
+            <w:proofErr w:type="spellEnd"/>
+            <w:r>
+              <w:rPr>
+                <w:lang w:val="fr-FR" w:eastAsia="fr-GA"/>
+              </w:rPr>
+              <w:t>., unique</w:t>
             </w:r>
           </w:p>
         </w:tc>
@@ -1347,12 +2510,14 @@
                 <w:lang w:val="fr-FR" w:eastAsia="fr-GA"/>
               </w:rPr>
             </w:pPr>
+            <w:proofErr w:type="gramStart"/>
             <w:r>
               <w:rPr>
                 <w:lang w:val="fr-FR" w:eastAsia="fr-GA"/>
               </w:rPr>
               <w:t>main</w:t>
             </w:r>
+            <w:proofErr w:type="gramEnd"/>
           </w:p>
         </w:tc>
         <w:tc>
@@ -1423,11 +2588,33 @@
                 <w:lang w:val="fr-FR" w:eastAsia="fr-GA"/>
               </w:rPr>
             </w:pPr>
-            <w:r>
-              <w:rPr>
-                <w:lang w:val="fr-FR" w:eastAsia="fr-GA"/>
-              </w:rPr>
-              <w:t>Obl., Rain, Snow, Clouds, etc.</w:t>
+            <w:proofErr w:type="spellStart"/>
+            <w:r>
+              <w:rPr>
+                <w:lang w:val="fr-FR" w:eastAsia="fr-GA"/>
+              </w:rPr>
+              <w:t>Obl</w:t>
+            </w:r>
+            <w:proofErr w:type="spellEnd"/>
+            <w:r>
+              <w:rPr>
+                <w:lang w:val="fr-FR" w:eastAsia="fr-GA"/>
+              </w:rPr>
+              <w:t xml:space="preserve">., Rain, Snow, </w:t>
+            </w:r>
+            <w:proofErr w:type="spellStart"/>
+            <w:r>
+              <w:rPr>
+                <w:lang w:val="fr-FR" w:eastAsia="fr-GA"/>
+              </w:rPr>
+              <w:t>Clouds</w:t>
+            </w:r>
+            <w:proofErr w:type="spellEnd"/>
+            <w:r>
+              <w:rPr>
+                <w:lang w:val="fr-FR" w:eastAsia="fr-GA"/>
+              </w:rPr>
+              <w:t>, etc.</w:t>
             </w:r>
           </w:p>
         </w:tc>
@@ -1447,12 +2634,14 @@
                 <w:lang w:val="fr-FR" w:eastAsia="fr-GA"/>
               </w:rPr>
             </w:pPr>
+            <w:proofErr w:type="gramStart"/>
             <w:r>
               <w:rPr>
                 <w:lang w:val="fr-FR" w:eastAsia="fr-GA"/>
               </w:rPr>
               <w:t>description</w:t>
             </w:r>
+            <w:proofErr w:type="gramEnd"/>
           </w:p>
         </w:tc>
         <w:tc>
@@ -1517,11 +2706,19 @@
                 <w:lang w:val="fr-FR" w:eastAsia="fr-GA"/>
               </w:rPr>
             </w:pPr>
-            <w:r>
-              <w:rPr>
-                <w:lang w:val="fr-FR" w:eastAsia="fr-GA"/>
-              </w:rPr>
-              <w:t>Obl.</w:t>
+            <w:proofErr w:type="spellStart"/>
+            <w:r>
+              <w:rPr>
+                <w:lang w:val="fr-FR" w:eastAsia="fr-GA"/>
+              </w:rPr>
+              <w:t>Obl</w:t>
+            </w:r>
+            <w:proofErr w:type="spellEnd"/>
+            <w:r>
+              <w:rPr>
+                <w:lang w:val="fr-FR" w:eastAsia="fr-GA"/>
+              </w:rPr>
+              <w:t>.</w:t>
             </w:r>
           </w:p>
         </w:tc>
@@ -1538,12 +2735,14 @@
                 <w:lang w:val="fr-FR" w:eastAsia="fr-GA"/>
               </w:rPr>
             </w:pPr>
+            <w:proofErr w:type="gramStart"/>
             <w:r>
               <w:rPr>
                 <w:lang w:val="fr-FR" w:eastAsia="fr-GA"/>
               </w:rPr>
               <w:t>temp</w:t>
             </w:r>
+            <w:proofErr w:type="gramEnd"/>
           </w:p>
         </w:tc>
         <w:tc>
@@ -1608,11 +2807,19 @@
                 <w:lang w:val="fr-FR" w:eastAsia="fr-GA"/>
               </w:rPr>
             </w:pPr>
-            <w:r>
-              <w:rPr>
-                <w:lang w:val="fr-FR" w:eastAsia="fr-GA"/>
-              </w:rPr>
-              <w:t xml:space="preserve">Obl., </w:t>
+            <w:proofErr w:type="spellStart"/>
+            <w:r>
+              <w:rPr>
+                <w:lang w:val="fr-FR" w:eastAsia="fr-GA"/>
+              </w:rPr>
+              <w:t>Obl</w:t>
+            </w:r>
+            <w:proofErr w:type="spellEnd"/>
+            <w:r>
+              <w:rPr>
+                <w:lang w:val="fr-FR" w:eastAsia="fr-GA"/>
+              </w:rPr>
+              <w:t xml:space="preserve">., </w:t>
             </w:r>
             <w:r>
               <w:rPr>
@@ -1644,12 +2851,22 @@
                 <w:lang w:val="fr-FR" w:eastAsia="fr-GA"/>
               </w:rPr>
             </w:pPr>
-            <w:r>
-              <w:rPr>
-                <w:lang w:val="fr-FR" w:eastAsia="fr-GA"/>
-              </w:rPr>
-              <w:t>feels_like</w:t>
-            </w:r>
+            <w:proofErr w:type="spellStart"/>
+            <w:proofErr w:type="gramStart"/>
+            <w:r>
+              <w:rPr>
+                <w:lang w:val="fr-FR" w:eastAsia="fr-GA"/>
+              </w:rPr>
+              <w:t>feels</w:t>
+            </w:r>
+            <w:proofErr w:type="gramEnd"/>
+            <w:r>
+              <w:rPr>
+                <w:lang w:val="fr-FR" w:eastAsia="fr-GA"/>
+              </w:rPr>
+              <w:t>_like</w:t>
+            </w:r>
+            <w:proofErr w:type="spellEnd"/>
           </w:p>
         </w:tc>
         <w:tc>
@@ -1714,11 +2931,19 @@
                 <w:lang w:val="fr-FR" w:eastAsia="fr-GA"/>
               </w:rPr>
             </w:pPr>
-            <w:r>
-              <w:rPr>
-                <w:lang w:val="fr-FR" w:eastAsia="fr-GA"/>
-              </w:rPr>
-              <w:t>Obl.</w:t>
+            <w:proofErr w:type="spellStart"/>
+            <w:r>
+              <w:rPr>
+                <w:lang w:val="fr-FR" w:eastAsia="fr-GA"/>
+              </w:rPr>
+              <w:t>Obl</w:t>
+            </w:r>
+            <w:proofErr w:type="spellEnd"/>
+            <w:r>
+              <w:rPr>
+                <w:lang w:val="fr-FR" w:eastAsia="fr-GA"/>
+              </w:rPr>
+              <w:t>.</w:t>
             </w:r>
           </w:p>
         </w:tc>
@@ -1735,12 +2960,22 @@
                 <w:lang w:val="fr-FR" w:eastAsia="fr-GA"/>
               </w:rPr>
             </w:pPr>
-            <w:r>
-              <w:rPr>
-                <w:lang w:val="fr-FR" w:eastAsia="fr-GA"/>
-              </w:rPr>
-              <w:t>temp_min</w:t>
-            </w:r>
+            <w:proofErr w:type="spellStart"/>
+            <w:proofErr w:type="gramStart"/>
+            <w:r>
+              <w:rPr>
+                <w:lang w:val="fr-FR" w:eastAsia="fr-GA"/>
+              </w:rPr>
+              <w:t>temp</w:t>
+            </w:r>
+            <w:proofErr w:type="gramEnd"/>
+            <w:r>
+              <w:rPr>
+                <w:lang w:val="fr-FR" w:eastAsia="fr-GA"/>
+              </w:rPr>
+              <w:t>_min</w:t>
+            </w:r>
+            <w:proofErr w:type="spellEnd"/>
           </w:p>
         </w:tc>
         <w:tc>
@@ -1805,11 +3040,19 @@
                 <w:lang w:val="fr-FR" w:eastAsia="fr-GA"/>
               </w:rPr>
             </w:pPr>
-            <w:r>
-              <w:rPr>
-                <w:lang w:val="fr-FR" w:eastAsia="fr-GA"/>
-              </w:rPr>
-              <w:t>Obl.</w:t>
+            <w:proofErr w:type="spellStart"/>
+            <w:r>
+              <w:rPr>
+                <w:lang w:val="fr-FR" w:eastAsia="fr-GA"/>
+              </w:rPr>
+              <w:t>Obl</w:t>
+            </w:r>
+            <w:proofErr w:type="spellEnd"/>
+            <w:r>
+              <w:rPr>
+                <w:lang w:val="fr-FR" w:eastAsia="fr-GA"/>
+              </w:rPr>
+              <w:t>.</w:t>
             </w:r>
           </w:p>
         </w:tc>
@@ -1829,12 +3072,22 @@
                 <w:lang w:val="fr-FR" w:eastAsia="fr-GA"/>
               </w:rPr>
             </w:pPr>
-            <w:r>
-              <w:rPr>
-                <w:lang w:val="fr-FR" w:eastAsia="fr-GA"/>
-              </w:rPr>
-              <w:t>temp_max</w:t>
-            </w:r>
+            <w:proofErr w:type="spellStart"/>
+            <w:proofErr w:type="gramStart"/>
+            <w:r>
+              <w:rPr>
+                <w:lang w:val="fr-FR" w:eastAsia="fr-GA"/>
+              </w:rPr>
+              <w:t>temp</w:t>
+            </w:r>
+            <w:proofErr w:type="gramEnd"/>
+            <w:r>
+              <w:rPr>
+                <w:lang w:val="fr-FR" w:eastAsia="fr-GA"/>
+              </w:rPr>
+              <w:t>_max</w:t>
+            </w:r>
+            <w:proofErr w:type="spellEnd"/>
           </w:p>
         </w:tc>
         <w:tc>
@@ -1899,11 +3152,19 @@
                 <w:lang w:val="fr-FR" w:eastAsia="fr-GA"/>
               </w:rPr>
             </w:pPr>
-            <w:r>
-              <w:rPr>
-                <w:lang w:val="fr-FR" w:eastAsia="fr-GA"/>
-              </w:rPr>
-              <w:t>Obl.</w:t>
+            <w:proofErr w:type="spellStart"/>
+            <w:r>
+              <w:rPr>
+                <w:lang w:val="fr-FR" w:eastAsia="fr-GA"/>
+              </w:rPr>
+              <w:t>Obl</w:t>
+            </w:r>
+            <w:proofErr w:type="spellEnd"/>
+            <w:r>
+              <w:rPr>
+                <w:lang w:val="fr-FR" w:eastAsia="fr-GA"/>
+              </w:rPr>
+              <w:t>.</w:t>
             </w:r>
           </w:p>
         </w:tc>
@@ -1920,12 +3181,14 @@
                 <w:lang w:val="fr-FR" w:eastAsia="fr-GA"/>
               </w:rPr>
             </w:pPr>
+            <w:proofErr w:type="gramStart"/>
             <w:r>
               <w:rPr>
                 <w:lang w:val="fr-FR" w:eastAsia="fr-GA"/>
               </w:rPr>
               <w:t>pressure</w:t>
             </w:r>
+            <w:proofErr w:type="gramEnd"/>
           </w:p>
         </w:tc>
         <w:tc>
@@ -1990,11 +3253,19 @@
                 <w:lang w:val="fr-FR" w:eastAsia="fr-GA"/>
               </w:rPr>
             </w:pPr>
-            <w:r>
-              <w:rPr>
-                <w:lang w:val="fr-FR" w:eastAsia="fr-GA"/>
-              </w:rPr>
-              <w:t>Obl.</w:t>
+            <w:proofErr w:type="spellStart"/>
+            <w:r>
+              <w:rPr>
+                <w:lang w:val="fr-FR" w:eastAsia="fr-GA"/>
+              </w:rPr>
+              <w:t>Obl</w:t>
+            </w:r>
+            <w:proofErr w:type="spellEnd"/>
+            <w:r>
+              <w:rPr>
+                <w:lang w:val="fr-FR" w:eastAsia="fr-GA"/>
+              </w:rPr>
+              <w:t>.</w:t>
             </w:r>
             <w:r>
               <w:rPr>
@@ -2020,12 +3291,16 @@
                 <w:lang w:val="fr-FR" w:eastAsia="fr-GA"/>
               </w:rPr>
             </w:pPr>
+            <w:proofErr w:type="spellStart"/>
+            <w:proofErr w:type="gramStart"/>
             <w:r>
               <w:rPr>
                 <w:lang w:val="fr-FR" w:eastAsia="fr-GA"/>
               </w:rPr>
               <w:t>humidity</w:t>
             </w:r>
+            <w:proofErr w:type="spellEnd"/>
+            <w:proofErr w:type="gramEnd"/>
           </w:p>
         </w:tc>
         <w:tc>
@@ -2090,11 +3365,19 @@
                 <w:lang w:val="fr-FR" w:eastAsia="fr-GA"/>
               </w:rPr>
             </w:pPr>
-            <w:r>
-              <w:rPr>
-                <w:lang w:val="fr-FR" w:eastAsia="fr-GA"/>
-              </w:rPr>
-              <w:t>Obl.</w:t>
+            <w:proofErr w:type="spellStart"/>
+            <w:r>
+              <w:rPr>
+                <w:lang w:val="fr-FR" w:eastAsia="fr-GA"/>
+              </w:rPr>
+              <w:t>Obl</w:t>
+            </w:r>
+            <w:proofErr w:type="spellEnd"/>
+            <w:r>
+              <w:rPr>
+                <w:lang w:val="fr-FR" w:eastAsia="fr-GA"/>
+              </w:rPr>
+              <w:t>.</w:t>
             </w:r>
           </w:p>
         </w:tc>
@@ -2113,12 +3396,16 @@
                 <w:lang w:val="fr-FR" w:eastAsia="fr-GA"/>
               </w:rPr>
             </w:pPr>
+            <w:proofErr w:type="spellStart"/>
+            <w:proofErr w:type="gramStart"/>
             <w:r>
               <w:rPr>
                 <w:lang w:val="fr-FR" w:eastAsia="fr-GA"/>
               </w:rPr>
               <w:t>visibility</w:t>
             </w:r>
+            <w:proofErr w:type="spellEnd"/>
+            <w:proofErr w:type="gramEnd"/>
           </w:p>
         </w:tc>
         <w:tc>
@@ -2183,11 +3470,19 @@
                 <w:lang w:val="fr-FR" w:eastAsia="fr-GA"/>
               </w:rPr>
             </w:pPr>
-            <w:r>
-              <w:rPr>
-                <w:lang w:val="fr-FR" w:eastAsia="fr-GA"/>
-              </w:rPr>
-              <w:t xml:space="preserve">Obl., </w:t>
+            <w:proofErr w:type="spellStart"/>
+            <w:r>
+              <w:rPr>
+                <w:lang w:val="fr-FR" w:eastAsia="fr-GA"/>
+              </w:rPr>
+              <w:t>Obl</w:t>
+            </w:r>
+            <w:proofErr w:type="spellEnd"/>
+            <w:r>
+              <w:rPr>
+                <w:lang w:val="fr-FR" w:eastAsia="fr-GA"/>
+              </w:rPr>
+              <w:t xml:space="preserve">., </w:t>
             </w:r>
             <w:r>
               <w:rPr>
@@ -2219,12 +3514,22 @@
                 <w:lang w:val="fr-FR" w:eastAsia="fr-GA"/>
               </w:rPr>
             </w:pPr>
-            <w:r>
-              <w:rPr>
-                <w:lang w:val="fr-FR" w:eastAsia="fr-GA"/>
-              </w:rPr>
-              <w:t>wind_speed</w:t>
-            </w:r>
+            <w:proofErr w:type="spellStart"/>
+            <w:proofErr w:type="gramStart"/>
+            <w:r>
+              <w:rPr>
+                <w:lang w:val="fr-FR" w:eastAsia="fr-GA"/>
+              </w:rPr>
+              <w:t>wind</w:t>
+            </w:r>
+            <w:proofErr w:type="gramEnd"/>
+            <w:r>
+              <w:rPr>
+                <w:lang w:val="fr-FR" w:eastAsia="fr-GA"/>
+              </w:rPr>
+              <w:t>_speed</w:t>
+            </w:r>
+            <w:proofErr w:type="spellEnd"/>
           </w:p>
         </w:tc>
         <w:tc>
@@ -2289,11 +3594,19 @@
                 <w:lang w:val="fr-FR" w:eastAsia="fr-GA"/>
               </w:rPr>
             </w:pPr>
-            <w:r>
-              <w:rPr>
-                <w:lang w:val="fr-FR" w:eastAsia="fr-GA"/>
-              </w:rPr>
-              <w:t>Obl.</w:t>
+            <w:proofErr w:type="spellStart"/>
+            <w:r>
+              <w:rPr>
+                <w:lang w:val="fr-FR" w:eastAsia="fr-GA"/>
+              </w:rPr>
+              <w:t>Obl</w:t>
+            </w:r>
+            <w:proofErr w:type="spellEnd"/>
+            <w:r>
+              <w:rPr>
+                <w:lang w:val="fr-FR" w:eastAsia="fr-GA"/>
+              </w:rPr>
+              <w:t>.</w:t>
             </w:r>
           </w:p>
         </w:tc>
@@ -2310,12 +3623,16 @@
                 <w:lang w:val="fr-FR" w:eastAsia="fr-GA"/>
               </w:rPr>
             </w:pPr>
+            <w:proofErr w:type="spellStart"/>
+            <w:proofErr w:type="gramStart"/>
             <w:r>
               <w:rPr>
                 <w:lang w:val="fr-FR" w:eastAsia="fr-GA"/>
               </w:rPr>
               <w:t>clouds</w:t>
             </w:r>
+            <w:proofErr w:type="spellEnd"/>
+            <w:proofErr w:type="gramEnd"/>
           </w:p>
         </w:tc>
         <w:tc>
@@ -2380,11 +3697,19 @@
                 <w:lang w:val="fr-FR" w:eastAsia="fr-GA"/>
               </w:rPr>
             </w:pPr>
-            <w:r>
-              <w:rPr>
-                <w:lang w:val="fr-FR" w:eastAsia="fr-GA"/>
-              </w:rPr>
-              <w:t>Obl.</w:t>
+            <w:proofErr w:type="spellStart"/>
+            <w:r>
+              <w:rPr>
+                <w:lang w:val="fr-FR" w:eastAsia="fr-GA"/>
+              </w:rPr>
+              <w:t>Obl</w:t>
+            </w:r>
+            <w:proofErr w:type="spellEnd"/>
+            <w:r>
+              <w:rPr>
+                <w:lang w:val="fr-FR" w:eastAsia="fr-GA"/>
+              </w:rPr>
+              <w:t>.</w:t>
             </w:r>
           </w:p>
         </w:tc>
@@ -2404,12 +3729,16 @@
                 <w:lang w:val="fr-FR" w:eastAsia="fr-GA"/>
               </w:rPr>
             </w:pPr>
+            <w:proofErr w:type="spellStart"/>
+            <w:proofErr w:type="gramStart"/>
             <w:r>
               <w:rPr>
                 <w:lang w:val="fr-FR" w:eastAsia="fr-GA"/>
               </w:rPr>
               <w:t>rain</w:t>
             </w:r>
+            <w:proofErr w:type="spellEnd"/>
+            <w:proofErr w:type="gramEnd"/>
           </w:p>
         </w:tc>
         <w:tc>
@@ -2507,12 +3836,16 @@
                 <w:lang w:val="fr-FR" w:eastAsia="fr-GA"/>
               </w:rPr>
             </w:pPr>
+            <w:proofErr w:type="spellStart"/>
+            <w:proofErr w:type="gramStart"/>
             <w:r>
               <w:rPr>
                 <w:lang w:val="fr-FR" w:eastAsia="fr-GA"/>
               </w:rPr>
               <w:t>snow</w:t>
             </w:r>
+            <w:proofErr w:type="spellEnd"/>
+            <w:proofErr w:type="gramEnd"/>
           </w:p>
         </w:tc>
         <w:tc>
@@ -2613,12 +3946,22 @@
                 <w:lang w:val="fr-FR" w:eastAsia="fr-GA"/>
               </w:rPr>
             </w:pPr>
-            <w:r>
-              <w:rPr>
-                <w:lang w:val="fr-FR" w:eastAsia="fr-GA"/>
-              </w:rPr>
-              <w:t>observation_time</w:t>
-            </w:r>
+            <w:proofErr w:type="spellStart"/>
+            <w:proofErr w:type="gramStart"/>
+            <w:r>
+              <w:rPr>
+                <w:lang w:val="fr-FR" w:eastAsia="fr-GA"/>
+              </w:rPr>
+              <w:t>observation</w:t>
+            </w:r>
+            <w:proofErr w:type="gramEnd"/>
+            <w:r>
+              <w:rPr>
+                <w:lang w:val="fr-FR" w:eastAsia="fr-GA"/>
+              </w:rPr>
+              <w:t>_time</w:t>
+            </w:r>
+            <w:proofErr w:type="spellEnd"/>
           </w:p>
         </w:tc>
         <w:tc>
@@ -2704,12 +4047,16 @@
                 <w:lang w:val="fr-FR" w:eastAsia="fr-GA"/>
               </w:rPr>
             </w:pPr>
+            <w:proofErr w:type="spellStart"/>
+            <w:proofErr w:type="gramStart"/>
             <w:r>
               <w:rPr>
                 <w:lang w:val="fr-FR" w:eastAsia="fr-GA"/>
               </w:rPr>
               <w:t>sunrise</w:t>
             </w:r>
+            <w:proofErr w:type="spellEnd"/>
+            <w:proofErr w:type="gramEnd"/>
           </w:p>
         </w:tc>
         <w:tc>
@@ -2774,11 +4121,19 @@
                 <w:lang w:val="fr-FR" w:eastAsia="fr-GA"/>
               </w:rPr>
             </w:pPr>
-            <w:r>
-              <w:rPr>
-                <w:lang w:val="fr-FR" w:eastAsia="fr-GA"/>
-              </w:rPr>
-              <w:t>Obl.</w:t>
+            <w:proofErr w:type="spellStart"/>
+            <w:r>
+              <w:rPr>
+                <w:lang w:val="fr-FR" w:eastAsia="fr-GA"/>
+              </w:rPr>
+              <w:t>Obl</w:t>
+            </w:r>
+            <w:proofErr w:type="spellEnd"/>
+            <w:r>
+              <w:rPr>
+                <w:lang w:val="fr-FR" w:eastAsia="fr-GA"/>
+              </w:rPr>
+              <w:t>.</w:t>
             </w:r>
           </w:p>
         </w:tc>
@@ -2798,12 +4153,16 @@
                 <w:lang w:val="fr-FR" w:eastAsia="fr-GA"/>
               </w:rPr>
             </w:pPr>
+            <w:proofErr w:type="spellStart"/>
+            <w:proofErr w:type="gramStart"/>
             <w:r>
               <w:rPr>
                 <w:lang w:val="fr-FR" w:eastAsia="fr-GA"/>
               </w:rPr>
               <w:t>sunset</w:t>
             </w:r>
+            <w:proofErr w:type="spellEnd"/>
+            <w:proofErr w:type="gramEnd"/>
           </w:p>
         </w:tc>
         <w:tc>
@@ -2868,11 +4227,19 @@
                 <w:lang w:val="fr-FR" w:eastAsia="fr-GA"/>
               </w:rPr>
             </w:pPr>
-            <w:r>
-              <w:rPr>
-                <w:lang w:val="fr-FR" w:eastAsia="fr-GA"/>
-              </w:rPr>
-              <w:t>Obl.</w:t>
+            <w:proofErr w:type="spellStart"/>
+            <w:r>
+              <w:rPr>
+                <w:lang w:val="fr-FR" w:eastAsia="fr-GA"/>
+              </w:rPr>
+              <w:t>Obl</w:t>
+            </w:r>
+            <w:proofErr w:type="spellEnd"/>
+            <w:r>
+              <w:rPr>
+                <w:lang w:val="fr-FR" w:eastAsia="fr-GA"/>
+              </w:rPr>
+              <w:t>.</w:t>
             </w:r>
           </w:p>
         </w:tc>
@@ -2889,12 +4256,22 @@
                 <w:lang w:val="fr-FR" w:eastAsia="fr-GA"/>
               </w:rPr>
             </w:pPr>
-            <w:r>
-              <w:rPr>
-                <w:lang w:val="fr-FR" w:eastAsia="fr-GA"/>
-              </w:rPr>
-              <w:t>location_id</w:t>
-            </w:r>
+            <w:proofErr w:type="spellStart"/>
+            <w:proofErr w:type="gramStart"/>
+            <w:r>
+              <w:rPr>
+                <w:lang w:val="fr-FR" w:eastAsia="fr-GA"/>
+              </w:rPr>
+              <w:t>location</w:t>
+            </w:r>
+            <w:proofErr w:type="gramEnd"/>
+            <w:r>
+              <w:rPr>
+                <w:lang w:val="fr-FR" w:eastAsia="fr-GA"/>
+              </w:rPr>
+              <w:t>_id</w:t>
+            </w:r>
+            <w:proofErr w:type="spellEnd"/>
           </w:p>
         </w:tc>
         <w:tc>
@@ -2956,11 +4333,19 @@
                 <w:lang w:val="fr-FR" w:eastAsia="fr-GA"/>
               </w:rPr>
             </w:pPr>
-            <w:r>
-              <w:rPr>
-                <w:lang w:val="fr-FR" w:eastAsia="fr-GA"/>
-              </w:rPr>
-              <w:t>Obl., unique</w:t>
+            <w:proofErr w:type="spellStart"/>
+            <w:r>
+              <w:rPr>
+                <w:lang w:val="fr-FR" w:eastAsia="fr-GA"/>
+              </w:rPr>
+              <w:t>Obl</w:t>
+            </w:r>
+            <w:proofErr w:type="spellEnd"/>
+            <w:r>
+              <w:rPr>
+                <w:lang w:val="fr-FR" w:eastAsia="fr-GA"/>
+              </w:rPr>
+              <w:t>., unique</w:t>
             </w:r>
           </w:p>
         </w:tc>
@@ -2980,18 +4365,22 @@
                 <w:lang w:val="fr-FR" w:eastAsia="fr-GA"/>
               </w:rPr>
             </w:pPr>
+            <w:proofErr w:type="spellStart"/>
+            <w:proofErr w:type="gramStart"/>
             <w:r>
               <w:rPr>
                 <w:lang w:val="fr-FR" w:eastAsia="fr-GA"/>
               </w:rPr>
               <w:t>country</w:t>
             </w:r>
+            <w:proofErr w:type="gramEnd"/>
             <w:r>
               <w:rPr>
                 <w:lang w:val="fr-FR" w:eastAsia="fr-GA"/>
               </w:rPr>
               <w:t>_name</w:t>
             </w:r>
+            <w:proofErr w:type="spellEnd"/>
           </w:p>
         </w:tc>
         <w:tc>
@@ -3062,11 +4451,19 @@
                 <w:lang w:val="fr-FR" w:eastAsia="fr-GA"/>
               </w:rPr>
             </w:pPr>
-            <w:r>
-              <w:rPr>
-                <w:lang w:val="fr-FR" w:eastAsia="fr-GA"/>
-              </w:rPr>
-              <w:t>Obl.</w:t>
+            <w:proofErr w:type="spellStart"/>
+            <w:r>
+              <w:rPr>
+                <w:lang w:val="fr-FR" w:eastAsia="fr-GA"/>
+              </w:rPr>
+              <w:t>Obl</w:t>
+            </w:r>
+            <w:proofErr w:type="spellEnd"/>
+            <w:r>
+              <w:rPr>
+                <w:lang w:val="fr-FR" w:eastAsia="fr-GA"/>
+              </w:rPr>
+              <w:t>.</w:t>
             </w:r>
           </w:p>
         </w:tc>
@@ -3083,12 +4480,14 @@
                 <w:lang w:val="fr-FR" w:eastAsia="fr-GA"/>
               </w:rPr>
             </w:pPr>
+            <w:proofErr w:type="gramStart"/>
             <w:r>
               <w:rPr>
                 <w:lang w:val="fr-FR" w:eastAsia="fr-GA"/>
               </w:rPr>
               <w:t>city</w:t>
             </w:r>
+            <w:proofErr w:type="gramEnd"/>
           </w:p>
         </w:tc>
         <w:tc>
@@ -3159,11 +4558,19 @@
                 <w:lang w:val="fr-FR" w:eastAsia="fr-GA"/>
               </w:rPr>
             </w:pPr>
-            <w:r>
-              <w:rPr>
-                <w:lang w:val="fr-FR" w:eastAsia="fr-GA"/>
-              </w:rPr>
-              <w:t>Obl.</w:t>
+            <w:proofErr w:type="spellStart"/>
+            <w:r>
+              <w:rPr>
+                <w:lang w:val="fr-FR" w:eastAsia="fr-GA"/>
+              </w:rPr>
+              <w:t>Obl</w:t>
+            </w:r>
+            <w:proofErr w:type="spellEnd"/>
+            <w:r>
+              <w:rPr>
+                <w:lang w:val="fr-FR" w:eastAsia="fr-GA"/>
+              </w:rPr>
+              <w:t>.</w:t>
             </w:r>
           </w:p>
         </w:tc>
@@ -3183,12 +4590,22 @@
                 <w:lang w:val="fr-FR" w:eastAsia="fr-GA"/>
               </w:rPr>
             </w:pPr>
-            <w:r>
-              <w:rPr>
-                <w:lang w:val="fr-FR" w:eastAsia="fr-GA"/>
-              </w:rPr>
-              <w:t>country_code</w:t>
-            </w:r>
+            <w:proofErr w:type="spellStart"/>
+            <w:proofErr w:type="gramStart"/>
+            <w:r>
+              <w:rPr>
+                <w:lang w:val="fr-FR" w:eastAsia="fr-GA"/>
+              </w:rPr>
+              <w:t>country</w:t>
+            </w:r>
+            <w:proofErr w:type="gramEnd"/>
+            <w:r>
+              <w:rPr>
+                <w:lang w:val="fr-FR" w:eastAsia="fr-GA"/>
+              </w:rPr>
+              <w:t>_code</w:t>
+            </w:r>
+            <w:proofErr w:type="spellEnd"/>
           </w:p>
         </w:tc>
         <w:tc>
@@ -3259,11 +4676,19 @@
                 <w:lang w:val="fr-FR" w:eastAsia="fr-GA"/>
               </w:rPr>
             </w:pPr>
-            <w:r>
-              <w:rPr>
-                <w:lang w:val="fr-FR" w:eastAsia="fr-GA"/>
-              </w:rPr>
-              <w:t>Obl.</w:t>
+            <w:proofErr w:type="spellStart"/>
+            <w:r>
+              <w:rPr>
+                <w:lang w:val="fr-FR" w:eastAsia="fr-GA"/>
+              </w:rPr>
+              <w:t>Obl</w:t>
+            </w:r>
+            <w:proofErr w:type="spellEnd"/>
+            <w:r>
+              <w:rPr>
+                <w:lang w:val="fr-FR" w:eastAsia="fr-GA"/>
+              </w:rPr>
+              <w:t>.</w:t>
             </w:r>
           </w:p>
         </w:tc>
@@ -3280,12 +4705,16 @@
                 <w:lang w:val="fr-FR" w:eastAsia="fr-GA"/>
               </w:rPr>
             </w:pPr>
+            <w:proofErr w:type="spellStart"/>
+            <w:proofErr w:type="gramStart"/>
             <w:r>
               <w:rPr>
                 <w:lang w:val="fr-FR" w:eastAsia="fr-GA"/>
               </w:rPr>
               <w:t>timezone</w:t>
             </w:r>
+            <w:proofErr w:type="spellEnd"/>
+            <w:proofErr w:type="gramEnd"/>
           </w:p>
         </w:tc>
         <w:tc>
@@ -3350,11 +4779,19 @@
                 <w:lang w:val="fr-FR" w:eastAsia="fr-GA"/>
               </w:rPr>
             </w:pPr>
-            <w:r>
-              <w:rPr>
-                <w:lang w:val="fr-FR" w:eastAsia="fr-GA"/>
-              </w:rPr>
-              <w:t>Obl.</w:t>
+            <w:proofErr w:type="spellStart"/>
+            <w:r>
+              <w:rPr>
+                <w:lang w:val="fr-FR" w:eastAsia="fr-GA"/>
+              </w:rPr>
+              <w:t>Obl</w:t>
+            </w:r>
+            <w:proofErr w:type="spellEnd"/>
+            <w:r>
+              <w:rPr>
+                <w:lang w:val="fr-FR" w:eastAsia="fr-GA"/>
+              </w:rPr>
+              <w:t>.</w:t>
             </w:r>
           </w:p>
         </w:tc>
@@ -3374,12 +4811,16 @@
                 <w:lang w:val="fr-FR" w:eastAsia="fr-GA"/>
               </w:rPr>
             </w:pPr>
+            <w:proofErr w:type="spellStart"/>
+            <w:proofErr w:type="gramStart"/>
             <w:r>
               <w:rPr>
                 <w:lang w:val="fr-FR" w:eastAsia="fr-GA"/>
               </w:rPr>
               <w:t>lat</w:t>
             </w:r>
+            <w:proofErr w:type="spellEnd"/>
+            <w:proofErr w:type="gramEnd"/>
           </w:p>
         </w:tc>
         <w:tc>
@@ -3444,11 +4885,19 @@
                 <w:lang w:val="fr-FR" w:eastAsia="fr-GA"/>
               </w:rPr>
             </w:pPr>
-            <w:r>
-              <w:rPr>
-                <w:lang w:val="fr-FR" w:eastAsia="fr-GA"/>
-              </w:rPr>
-              <w:t>Obl.</w:t>
+            <w:proofErr w:type="spellStart"/>
+            <w:r>
+              <w:rPr>
+                <w:lang w:val="fr-FR" w:eastAsia="fr-GA"/>
+              </w:rPr>
+              <w:t>Obl</w:t>
+            </w:r>
+            <w:proofErr w:type="spellEnd"/>
+            <w:r>
+              <w:rPr>
+                <w:lang w:val="fr-FR" w:eastAsia="fr-GA"/>
+              </w:rPr>
+              <w:t>.</w:t>
             </w:r>
           </w:p>
         </w:tc>
@@ -3465,6 +4914,8 @@
                 <w:lang w:val="fr-FR" w:eastAsia="fr-GA"/>
               </w:rPr>
             </w:pPr>
+            <w:proofErr w:type="spellStart"/>
+            <w:proofErr w:type="gramStart"/>
             <w:r>
               <w:rPr>
                 <w:lang w:val="fr-FR" w:eastAsia="fr-GA"/>
@@ -3472,6 +4923,8 @@
               <w:lastRenderedPageBreak/>
               <w:t>lon</w:t>
             </w:r>
+            <w:proofErr w:type="spellEnd"/>
+            <w:proofErr w:type="gramEnd"/>
           </w:p>
         </w:tc>
         <w:tc>
@@ -3536,11 +4989,19 @@
                 <w:lang w:val="fr-FR" w:eastAsia="fr-GA"/>
               </w:rPr>
             </w:pPr>
-            <w:r>
-              <w:rPr>
-                <w:lang w:val="fr-FR" w:eastAsia="fr-GA"/>
-              </w:rPr>
-              <w:t>Obl.</w:t>
+            <w:proofErr w:type="spellStart"/>
+            <w:r>
+              <w:rPr>
+                <w:lang w:val="fr-FR" w:eastAsia="fr-GA"/>
+              </w:rPr>
+              <w:t>Obl</w:t>
+            </w:r>
+            <w:proofErr w:type="spellEnd"/>
+            <w:r>
+              <w:rPr>
+                <w:lang w:val="fr-FR" w:eastAsia="fr-GA"/>
+              </w:rPr>
+              <w:t>.</w:t>
             </w:r>
           </w:p>
         </w:tc>
@@ -3586,6 +5047,7 @@
         </w:rPr>
         <w:t xml:space="preserve"> (</w:t>
       </w:r>
+      <w:proofErr w:type="spellStart"/>
       <w:r>
         <w:rPr>
           <w:b/>
@@ -3602,6 +5064,7 @@
         </w:rPr>
         <w:t>_id</w:t>
       </w:r>
+      <w:proofErr w:type="spellEnd"/>
       <w:r>
         <w:rPr>
           <w:lang w:val="en-US" w:eastAsia="fr-GA"/>
@@ -3612,20 +5075,79 @@
         <w:rPr>
           <w:lang w:val="en-US" w:eastAsia="fr-GA"/>
         </w:rPr>
-        <w:t xml:space="preserve"> temp, feels_like, temp_min, temp_max, pressure, humidity, visibility, wind_speed, clouds, rain, snow, </w:t>
-      </w:r>
+        <w:t xml:space="preserve"> temp, </w:t>
+      </w:r>
+      <w:proofErr w:type="spellStart"/>
       <w:r>
         <w:rPr>
           <w:lang w:val="en-US" w:eastAsia="fr-GA"/>
         </w:rPr>
+        <w:t>feels_like</w:t>
+      </w:r>
+      <w:proofErr w:type="spellEnd"/>
+      <w:r>
+        <w:rPr>
+          <w:lang w:val="en-US" w:eastAsia="fr-GA"/>
+        </w:rPr>
+        <w:t xml:space="preserve">, </w:t>
+      </w:r>
+      <w:proofErr w:type="spellStart"/>
+      <w:r>
+        <w:rPr>
+          <w:lang w:val="en-US" w:eastAsia="fr-GA"/>
+        </w:rPr>
+        <w:t>temp_min</w:t>
+      </w:r>
+      <w:proofErr w:type="spellEnd"/>
+      <w:r>
+        <w:rPr>
+          <w:lang w:val="en-US" w:eastAsia="fr-GA"/>
+        </w:rPr>
+        <w:t xml:space="preserve">, </w:t>
+      </w:r>
+      <w:proofErr w:type="spellStart"/>
+      <w:r>
+        <w:rPr>
+          <w:lang w:val="en-US" w:eastAsia="fr-GA"/>
+        </w:rPr>
+        <w:t>temp_max</w:t>
+      </w:r>
+      <w:proofErr w:type="spellEnd"/>
+      <w:r>
+        <w:rPr>
+          <w:lang w:val="en-US" w:eastAsia="fr-GA"/>
+        </w:rPr>
+        <w:t xml:space="preserve">, pressure, humidity, visibility, </w:t>
+      </w:r>
+      <w:proofErr w:type="spellStart"/>
+      <w:r>
+        <w:rPr>
+          <w:lang w:val="en-US" w:eastAsia="fr-GA"/>
+        </w:rPr>
+        <w:t>wind_speed</w:t>
+      </w:r>
+      <w:proofErr w:type="spellEnd"/>
+      <w:r>
+        <w:rPr>
+          <w:lang w:val="en-US" w:eastAsia="fr-GA"/>
+        </w:rPr>
+        <w:t xml:space="preserve">, clouds, rain, snow, </w:t>
+      </w:r>
+      <w:proofErr w:type="spellStart"/>
+      <w:r>
+        <w:rPr>
+          <w:lang w:val="en-US" w:eastAsia="fr-GA"/>
+        </w:rPr>
         <w:t>observation_time</w:t>
       </w:r>
+      <w:proofErr w:type="spellEnd"/>
       <w:r>
         <w:rPr>
           <w:lang w:val="en-US" w:eastAsia="fr-GA"/>
         </w:rPr>
         <w:t xml:space="preserve">, sunrise, sunset, </w:t>
       </w:r>
+      <w:proofErr w:type="spellStart"/>
       <w:r>
         <w:rPr>
           <w:u w:val="single"/>
@@ -3633,6 +5155,7 @@
         </w:rPr>
         <w:t>location_id</w:t>
       </w:r>
+      <w:proofErr w:type="spellEnd"/>
       <w:r>
         <w:rPr>
           <w:lang w:val="en-US" w:eastAsia="fr-GA"/>
@@ -3653,6 +5176,7 @@
         </w:rPr>
         <w:t>Location (</w:t>
       </w:r>
+      <w:proofErr w:type="spellStart"/>
       <w:r>
         <w:rPr>
           <w:b/>
@@ -3661,18 +5185,27 @@
         </w:rPr>
         <w:t>location_id</w:t>
       </w:r>
+      <w:proofErr w:type="spellEnd"/>
       <w:r>
         <w:rPr>
           <w:lang w:val="en-US" w:eastAsia="fr-GA"/>
         </w:rPr>
-        <w:t>, country</w:t>
-      </w:r>
+        <w:t xml:space="preserve">, </w:t>
+      </w:r>
+      <w:proofErr w:type="spellStart"/>
       <w:r>
         <w:rPr>
           <w:lang w:val="en-US" w:eastAsia="fr-GA"/>
         </w:rPr>
+        <w:t>country</w:t>
+      </w:r>
+      <w:r>
+        <w:rPr>
+          <w:lang w:val="en-US" w:eastAsia="fr-GA"/>
+        </w:rPr>
         <w:t>_name</w:t>
       </w:r>
+      <w:proofErr w:type="spellEnd"/>
       <w:r>
         <w:rPr>
           <w:lang w:val="en-US" w:eastAsia="fr-GA"/>
@@ -3683,20 +5216,64 @@
         <w:rPr>
           <w:lang w:val="en-US" w:eastAsia="fr-GA"/>
         </w:rPr>
-        <w:t xml:space="preserve"> country_code,</w:t>
-      </w:r>
+        <w:t xml:space="preserve"> </w:t>
+      </w:r>
+      <w:proofErr w:type="spellStart"/>
       <w:r>
         <w:rPr>
           <w:lang w:val="en-US" w:eastAsia="fr-GA"/>
         </w:rPr>
-        <w:t xml:space="preserve"> timezone</w:t>
-      </w:r>
+        <w:t>country_code</w:t>
+      </w:r>
+      <w:proofErr w:type="spellEnd"/>
       <w:r>
         <w:rPr>
           <w:lang w:val="en-US" w:eastAsia="fr-GA"/>
         </w:rPr>
-        <w:t>, lat, lon</w:t>
-      </w:r>
+        <w:t>,</w:t>
+      </w:r>
+      <w:r>
+        <w:rPr>
+          <w:lang w:val="en-US" w:eastAsia="fr-GA"/>
+        </w:rPr>
+        <w:t xml:space="preserve"> </w:t>
+      </w:r>
+      <w:proofErr w:type="spellStart"/>
+      <w:r>
+        <w:rPr>
+          <w:lang w:val="en-US" w:eastAsia="fr-GA"/>
+        </w:rPr>
+        <w:t>timezone</w:t>
+      </w:r>
+      <w:proofErr w:type="spellEnd"/>
+      <w:r>
+        <w:rPr>
+          <w:lang w:val="en-US" w:eastAsia="fr-GA"/>
+        </w:rPr>
+        <w:t xml:space="preserve">, </w:t>
+      </w:r>
+      <w:proofErr w:type="spellStart"/>
+      <w:r>
+        <w:rPr>
+          <w:lang w:val="en-US" w:eastAsia="fr-GA"/>
+        </w:rPr>
+        <w:t>lat</w:t>
+      </w:r>
+      <w:proofErr w:type="spellEnd"/>
+      <w:r>
+        <w:rPr>
+          <w:lang w:val="en-US" w:eastAsia="fr-GA"/>
+        </w:rPr>
+        <w:t xml:space="preserve">, </w:t>
+      </w:r>
+      <w:proofErr w:type="spellStart"/>
+      <w:r>
+        <w:rPr>
+          <w:lang w:val="en-US" w:eastAsia="fr-GA"/>
+        </w:rPr>
+        <w:t>lon</w:t>
+      </w:r>
+      <w:proofErr w:type="spellEnd"/>
       <w:r>
         <w:rPr>
           <w:lang w:val="en-US" w:eastAsia="fr-GA"/>
@@ -3712,6 +5289,51 @@
     </w:sectPr>
   </w:body>
 </w:document>
+</file>
+
+<file path=word/comments.xml><?xml version="1.0" encoding="utf-8"?>
+<w:comments xmlns:wpc="http://schemas.microsoft.com/office/word/2010/wordprocessingCanvas" xmlns:cx="http://schemas.microsoft.com/office/drawing/2014/chartex" xmlns:cx1="http://schemas.microsoft.com/office/drawing/2015/9/8/chartex" xmlns:cx2="http://schemas.microsoft.com/office/drawing/2015/10/21/chartex" xmlns:cx3="http://schemas.microsoft.com/office/drawing/2016/5/9/chartex" xmlns:cx4="http://schemas.microsoft.com/office/drawing/2016/5/10/chartex" xmlns:cx5="http://schemas.microsoft.com/office/drawing/2016/5/11/chartex" xmlns:cx6="http://schemas.microsoft.com/office/drawing/2016/5/12/chartex" xmlns:cx7="http://schemas.microsoft.com/office/drawing/2016/5/13/chartex" xmlns:cx8="http://schemas.microsoft.com/office/drawing/2016/5/14/chartex" xmlns:mc="http://schemas.openxmlformats.org/markup-compatibility/2006" xmlns:aink="http://schemas.microsoft.com/office/drawing/2016/ink" xmlns:am3d="http://schemas.microsoft.com/office/drawing/2017/model3d" xmlns:o="urn:schemas-microsoft-com:office:office" xmlns:oel="http://schemas.microsoft.com/office/2019/extlst" xmlns:r="http://schemas.openxmlformats.org/officeDocument/2006/relationships" xmlns:m="http://schemas.openxmlformats.org/officeDocument/2006/math" xmlns:v="urn:schemas-microsoft-com:vml" xmlns:wp14="http://schemas.microsoft.com/office/word/2010/wordprocessingDrawing" xmlns:wp="http://schemas.openxmlformats.org/drawingml/2006/wordprocessingDrawing" xmlns:w10="urn:schemas-microsoft-com:office:word" xmlns:w="http://schemas.openxmlformats.org/wordprocessingml/2006/main" xmlns:w14="http://schemas.microsoft.com/office/word/2010/wordml" xmlns:w15="http://schemas.microsoft.com/office/word/2012/wordml" xmlns:w16cex="http://schemas.microsoft.com/office/word/2018/wordml/cex" xmlns:w16cid="http://schemas.microsoft.com/office/word/2016/wordml/cid" xmlns:w16="http://schemas.microsoft.com/office/word/2018/wordml" xmlns:w16sdtdh="http://schemas.microsoft.com/office/word/2020/wordml/sdtdatahash" xmlns:w16se="http://schemas.microsoft.com/office/word/2015/wordml/symex" xmlns:wpg="http://schemas.microsoft.com/office/word/2010/wordprocessingGroup" xmlns:wpi="http://schemas.microsoft.com/office/word/2010/wordprocessingInk" xmlns:wne="http://schemas.microsoft.com/office/word/2006/wordml" xmlns:wps="http://schemas.microsoft.com/office/word/2010/wordprocessingShape" mc:Ignorable="w14 w15 w16se w16cid w16 w16cex w16sdtdh wp14">
+  <w:comment w:id="0" w:author="Karen Fifi NKILI OBELE" w:date="2026-06-18T14:41:00Z" w:initials="KFNO">
+    <w:p>
+      <w:pPr>
+        <w:pStyle w:val="Commentaire"/>
+        <w:rPr>
+          <w:lang w:val="fr-FR"/>
+        </w:rPr>
+      </w:pPr>
+      <w:r>
+        <w:rPr>
+          <w:rStyle w:val="Marquedecommentaire"/>
+        </w:rPr>
+        <w:annotationRef/>
+      </w:r>
+      <w:r>
+        <w:rPr>
+          <w:lang w:val="fr-FR"/>
+        </w:rPr>
+        <w:t>Il s’agit d’une liste de dictionnaire. Il faudra se renseigner sur la possibilité qu’il y ait d’autres temps, secondaire, en dehors du principal.</w:t>
+      </w:r>
+    </w:p>
+  </w:comment>
+</w:comments>
+</file>
+
+<file path=word/commentsExtended.xml><?xml version="1.0" encoding="utf-8"?>
+<w15:commentsEx xmlns:wpc="http://schemas.microsoft.com/office/word/2010/wordprocessingCanvas" xmlns:cx="http://schemas.microsoft.com/office/drawing/2014/chartex" xmlns:cx1="http://schemas.microsoft.com/office/drawing/2015/9/8/chartex" xmlns:cx2="http://schemas.microsoft.com/office/drawing/2015/10/21/chartex" xmlns:cx3="http://schemas.microsoft.com/office/drawing/2016/5/9/chartex" xmlns:cx4="http://schemas.microsoft.com/office/drawing/2016/5/10/chartex" xmlns:cx5="http://schemas.microsoft.com/office/drawing/2016/5/11/chartex" xmlns:cx6="http://schemas.microsoft.com/office/drawing/2016/5/12/chartex" xmlns:cx7="http://schemas.microsoft.com/office/drawing/2016/5/13/chartex" xmlns:cx8="http://schemas.microsoft.com/office/drawing/2016/5/14/chartex" xmlns:mc="http://schemas.openxmlformats.org/markup-compatibility/2006" xmlns:aink="http://schemas.microsoft.com/office/drawing/2016/ink" xmlns:am3d="http://schemas.microsoft.com/office/drawing/2017/model3d" xmlns:o="urn:schemas-microsoft-com:office:office" xmlns:oel="http://schemas.microsoft.com/office/2019/extlst" xmlns:r="http://schemas.openxmlformats.org/officeDocument/2006/relationships" xmlns:m="http://schemas.openxmlformats.org/officeDocument/2006/math" xmlns:v="urn:schemas-microsoft-com:vml" xmlns:wp14="http://schemas.microsoft.com/office/word/2010/wordprocessingDrawing" xmlns:wp="http://schemas.openxmlformats.org/drawingml/2006/wordprocessingDrawing" xmlns:w10="urn:schemas-microsoft-com:office:word" xmlns:w="http://schemas.openxmlformats.org/wordprocessingml/2006/main" xmlns:w14="http://schemas.microsoft.com/office/word/2010/wordml" xmlns:w15="http://schemas.microsoft.com/office/word/2012/wordml" xmlns:w16cex="http://schemas.microsoft.com/office/word/2018/wordml/cex" xmlns:w16cid="http://schemas.microsoft.com/office/word/2016/wordml/cid" xmlns:w16="http://schemas.microsoft.com/office/word/2018/wordml" xmlns:w16sdtdh="http://schemas.microsoft.com/office/word/2020/wordml/sdtdatahash" xmlns:w16se="http://schemas.microsoft.com/office/word/2015/wordml/symex" xmlns:wpg="http://schemas.microsoft.com/office/word/2010/wordprocessingGroup" xmlns:wpi="http://schemas.microsoft.com/office/word/2010/wordprocessingInk" xmlns:wne="http://schemas.microsoft.com/office/word/2006/wordml" xmlns:wps="http://schemas.microsoft.com/office/word/2010/wordprocessingShape" mc:Ignorable="w14 w15 w16se w16cid w16 w16cex w16sdtdh wp14">
+  <w15:commentEx w15:paraId="4B7A83DA" w15:done="0"/>
+</w15:commentsEx>
+</file>
+
+<file path=word/commentsExtensible.xml><?xml version="1.0" encoding="utf-8"?>
+<w16cex:commentsExtensible xmlns:wpc="http://schemas.microsoft.com/office/word/2010/wordprocessingCanvas" xmlns:cx="http://schemas.microsoft.com/office/drawing/2014/chartex" xmlns:cx1="http://schemas.microsoft.com/office/drawing/2015/9/8/chartex" xmlns:cx2="http://schemas.microsoft.com/office/drawing/2015/10/21/chartex" xmlns:cx3="http://schemas.microsoft.com/office/drawing/2016/5/9/chartex" xmlns:cx4="http://schemas.microsoft.com/office/drawing/2016/5/10/chartex" xmlns:cx5="http://schemas.microsoft.com/office/drawing/2016/5/11/chartex" xmlns:cx6="http://schemas.microsoft.com/office/drawing/2016/5/12/chartex" xmlns:cx7="http://schemas.microsoft.com/office/drawing/2016/5/13/chartex" xmlns:cx8="http://schemas.microsoft.com/office/drawing/2016/5/14/chartex" xmlns:cr="http://schemas.microsoft.com/office/comments/2020/reactions" xmlns:mc="http://schemas.openxmlformats.org/markup-compatibility/2006" xmlns:aink="http://schemas.microsoft.com/office/drawing/2016/ink" xmlns:am3d="http://schemas.microsoft.com/office/drawing/2017/model3d" xmlns:o="urn:schemas-microsoft-com:office:office" xmlns:oel="http://schemas.microsoft.com/office/2019/extlst" xmlns:r="http://schemas.openxmlformats.org/officeDocument/2006/relationships" xmlns:m="http://schemas.openxmlformats.org/officeDocument/2006/math" xmlns:v="urn:schemas-microsoft-com:vml" xmlns:wp14="http://schemas.microsoft.com/office/word/2010/wordprocessingDrawing" xmlns:wp="http://schemas.openxmlformats.org/drawingml/2006/wordprocessingDrawing" xmlns:w10="urn:schemas-microsoft-com:office:word" xmlns:w="http://schemas.openxmlformats.org/wordprocessingml/2006/main" xmlns:w14="http://schemas.microsoft.com/office/word/2010/wordml" xmlns:w15="http://schemas.microsoft.com/office/word/2012/wordml" xmlns:w16cex="http://schemas.microsoft.com/office/word/2018/wordml/cex" xmlns:w16cid="http://schemas.microsoft.com/office/word/2016/wordml/cid" xmlns:w16="http://schemas.microsoft.com/office/word/2018/wordml" xmlns:w16sdtdh="http://schemas.microsoft.com/office/word/2020/wordml/sdtdatahash" xmlns:w16se="http://schemas.microsoft.com/office/word/2015/wordml/symex" xmlns:wpg="http://schemas.microsoft.com/office/word/2010/wordprocessingGroup" xmlns:wpi="http://schemas.microsoft.com/office/word/2010/wordprocessingInk" xmlns:wne="http://schemas.microsoft.com/office/word/2006/wordml" xmlns:wps="http://schemas.microsoft.com/office/word/2010/wordprocessingShape" mc:Ignorable="w14 w15 w16se w16cid w16 w16cex w16sdtdh cr wp14">
+  <w16cex:commentExtensible w16cex:durableId="2DDE8201" w16cex:dateUtc="2026-06-18T13:41:00Z"/>
+</w16cex:commentsExtensible>
+</file>
+
+<file path=word/commentsIds.xml><?xml version="1.0" encoding="utf-8"?>
+<w16cid:commentsIds xmlns:wpc="http://schemas.microsoft.com/office/word/2010/wordprocessingCanvas" xmlns:cx="http://schemas.microsoft.com/office/drawing/2014/chartex" xmlns:cx1="http://schemas.microsoft.com/office/drawing/2015/9/8/chartex" xmlns:cx2="http://schemas.microsoft.com/office/drawing/2015/10/21/chartex" xmlns:cx3="http://schemas.microsoft.com/office/drawing/2016/5/9/chartex" xmlns:cx4="http://schemas.microsoft.com/office/drawing/2016/5/10/chartex" xmlns:cx5="http://schemas.microsoft.com/office/drawing/2016/5/11/chartex" xmlns:cx6="http://schemas.microsoft.com/office/drawing/2016/5/12/chartex" xmlns:cx7="http://schemas.microsoft.com/office/drawing/2016/5/13/chartex" xmlns:cx8="http://schemas.microsoft.com/office/drawing/2016/5/14/chartex" xmlns:mc="http://schemas.openxmlformats.org/markup-compatibility/2006" xmlns:aink="http://schemas.microsoft.com/office/drawing/2016/ink" xmlns:am3d="http://schemas.microsoft.com/office/drawing/2017/model3d" xmlns:o="urn:schemas-microsoft-com:office:office" xmlns:oel="http://schemas.microsoft.com/office/2019/extlst" xmlns:r="http://schemas.openxmlformats.org/officeDocument/2006/relationships" xmlns:m="http://schemas.openxmlformats.org/officeDocument/2006/math" xmlns:v="urn:schemas-microsoft-com:vml" xmlns:wp14="http://schemas.microsoft.com/office/word/2010/wordprocessingDrawing" xmlns:wp="http://schemas.openxmlformats.org/drawingml/2006/wordprocessingDrawing" xmlns:w10="urn:schemas-microsoft-com:office:word" xmlns:w="http://schemas.openxmlformats.org/wordprocessingml/2006/main" xmlns:w14="http://schemas.microsoft.com/office/word/2010/wordml" xmlns:w15="http://schemas.microsoft.com/office/word/2012/wordml" xmlns:w16cex="http://schemas.microsoft.com/office/word/2018/wordml/cex" xmlns:w16cid="http://schemas.microsoft.com/office/word/2016/wordml/cid" xmlns:w16="http://schemas.microsoft.com/office/word/2018/wordml" xmlns:w16sdtdh="http://schemas.microsoft.com/office/word/2020/wordml/sdtdatahash" xmlns:w16se="http://schemas.microsoft.com/office/word/2015/wordml/symex" xmlns:wpg="http://schemas.microsoft.com/office/word/2010/wordprocessingGroup" xmlns:wpi="http://schemas.microsoft.com/office/word/2010/wordprocessingInk" xmlns:wne="http://schemas.microsoft.com/office/word/2006/wordml" xmlns:wps="http://schemas.microsoft.com/office/word/2010/wordprocessingShape" mc:Ignorable="w14 w15 w16se w16cid w16 w16cex w16sdtdh wp14">
+  <w16cid:commentId w16cid:paraId="4B7A83DA" w16cid:durableId="2DDE8201"/>
+</w16cid:commentsIds>
 </file>
 
 <file path=word/numbering.xml><?xml version="1.0" encoding="utf-8"?>
@@ -4288,6 +5910,14 @@
     <w:abstractNumId w:val="1"/>
   </w:num>
 </w:numbering>
+</file>
+
+<file path=word/people.xml><?xml version="1.0" encoding="utf-8"?>
+<w15:people xmlns:wpc="http://schemas.microsoft.com/office/word/2010/wordprocessingCanvas" xmlns:cx="http://schemas.microsoft.com/office/drawing/2014/chartex" xmlns:cx1="http://schemas.microsoft.com/office/drawing/2015/9/8/chartex" xmlns:cx2="http://schemas.microsoft.com/office/drawing/2015/10/21/chartex" xmlns:cx3="http://schemas.microsoft.com/office/drawing/2016/5/9/chartex" xmlns:cx4="http://schemas.microsoft.com/office/drawing/2016/5/10/chartex" xmlns:cx5="http://schemas.microsoft.com/office/drawing/2016/5/11/chartex" xmlns:cx6="http://schemas.microsoft.com/office/drawing/2016/5/12/chartex" xmlns:cx7="http://schemas.microsoft.com/office/drawing/2016/5/13/chartex" xmlns:cx8="http://schemas.microsoft.com/office/drawing/2016/5/14/chartex" xmlns:mc="http://schemas.openxmlformats.org/markup-compatibility/2006" xmlns:aink="http://schemas.microsoft.com/office/drawing/2016/ink" xmlns:am3d="http://schemas.microsoft.com/office/drawing/2017/model3d" xmlns:o="urn:schemas-microsoft-com:office:office" xmlns:oel="http://schemas.microsoft.com/office/2019/extlst" xmlns:r="http://schemas.openxmlformats.org/officeDocument/2006/relationships" xmlns:m="http://schemas.openxmlformats.org/officeDocument/2006/math" xmlns:v="urn:schemas-microsoft-com:vml" xmlns:wp14="http://schemas.microsoft.com/office/word/2010/wordprocessingDrawing" xmlns:wp="http://schemas.openxmlformats.org/drawingml/2006/wordprocessingDrawing" xmlns:w10="urn:schemas-microsoft-com:office:word" xmlns:w="http://schemas.openxmlformats.org/wordprocessingml/2006/main" xmlns:w14="http://schemas.microsoft.com/office/word/2010/wordml" xmlns:w15="http://schemas.microsoft.com/office/word/2012/wordml" xmlns:w16cex="http://schemas.microsoft.com/office/word/2018/wordml/cex" xmlns:w16cid="http://schemas.microsoft.com/office/word/2016/wordml/cid" xmlns:w16="http://schemas.microsoft.com/office/word/2018/wordml" xmlns:w16sdtdh="http://schemas.microsoft.com/office/word/2020/wordml/sdtdatahash" xmlns:w16se="http://schemas.microsoft.com/office/word/2015/wordml/symex" xmlns:wpg="http://schemas.microsoft.com/office/word/2010/wordprocessingGroup" xmlns:wpi="http://schemas.microsoft.com/office/word/2010/wordprocessingInk" xmlns:wne="http://schemas.microsoft.com/office/word/2006/wordml" xmlns:wps="http://schemas.microsoft.com/office/word/2010/wordprocessingShape" mc:Ignorable="w14 w15 w16se w16cid w16 w16cex w16sdtdh wp14">
+  <w15:person w15:author="Karen Fifi NKILI OBELE">
+    <w15:presenceInfo w15:providerId="Windows Live" w15:userId="ea17cefee68a5256"/>
+  </w15:person>
+</w15:people>
 </file>
 
 <file path=word/styles.xml><?xml version="1.0" encoding="utf-8"?>
@@ -4975,6 +6605,74 @@
       </w:tcPr>
     </w:tblStylePr>
   </w:style>
+  <w:style w:type="character" w:styleId="Marquedecommentaire">
+    <w:name w:val="annotation reference"/>
+    <w:basedOn w:val="Policepardfaut"/>
+    <w:uiPriority w:val="99"/>
+    <w:semiHidden/>
+    <w:unhideWhenUsed/>
+    <w:rsid w:val="000216FB"/>
+    <w:rPr>
+      <w:sz w:val="16"/>
+      <w:szCs w:val="16"/>
+    </w:rPr>
+  </w:style>
+  <w:style w:type="paragraph" w:styleId="Commentaire">
+    <w:name w:val="annotation text"/>
+    <w:basedOn w:val="Normal"/>
+    <w:link w:val="CommentaireCar"/>
+    <w:uiPriority w:val="99"/>
+    <w:semiHidden/>
+    <w:unhideWhenUsed/>
+    <w:rsid w:val="000216FB"/>
+    <w:pPr>
+      <w:spacing w:line="240" w:lineRule="auto"/>
+    </w:pPr>
+    <w:rPr>
+      <w:sz w:val="20"/>
+      <w:szCs w:val="20"/>
+    </w:rPr>
+  </w:style>
+  <w:style w:type="character" w:customStyle="1" w:styleId="CommentaireCar">
+    <w:name w:val="Commentaire Car"/>
+    <w:basedOn w:val="Policepardfaut"/>
+    <w:link w:val="Commentaire"/>
+    <w:uiPriority w:val="99"/>
+    <w:semiHidden/>
+    <w:rsid w:val="000216FB"/>
+    <w:rPr>
+      <w:sz w:val="20"/>
+      <w:szCs w:val="20"/>
+    </w:rPr>
+  </w:style>
+  <w:style w:type="paragraph" w:styleId="Objetducommentaire">
+    <w:name w:val="annotation subject"/>
+    <w:basedOn w:val="Commentaire"/>
+    <w:next w:val="Commentaire"/>
+    <w:link w:val="ObjetducommentaireCar"/>
+    <w:uiPriority w:val="99"/>
+    <w:semiHidden/>
+    <w:unhideWhenUsed/>
+    <w:rsid w:val="000216FB"/>
+    <w:rPr>
+      <w:b/>
+      <w:bCs/>
+    </w:rPr>
+  </w:style>
+  <w:style w:type="character" w:customStyle="1" w:styleId="ObjetducommentaireCar">
+    <w:name w:val="Objet du commentaire Car"/>
+    <w:basedOn w:val="CommentaireCar"/>
+    <w:link w:val="Objetducommentaire"/>
+    <w:uiPriority w:val="99"/>
+    <w:semiHidden/>
+    <w:rsid w:val="000216FB"/>
+    <w:rPr>
+      <w:b/>
+      <w:bCs/>
+      <w:sz w:val="20"/>
+      <w:szCs w:val="20"/>
+    </w:rPr>
+  </w:style>
 </w:styles>
 </file>
 

</xml_diff>